<commit_message>
fix: rebuild master template preserving original formatting
- Header: only replace product name text, keep logo/border/centering intact
- Table: add cantSplit to prevent row splitting across pages
- Table: add tblHeader to repeat header row on new pages
- Conditionals: separate {%p if/endif %} paragraphs in correct order

Co-Authored-By: Claude Opus 4.6 (1M context) <noreply@anthropic.com>
</commit_message>
<xml_diff>
--- a/mbr/templates/cert_master_template.docx
+++ b/mbr/templates/cert_master_template.docx
@@ -5,7 +5,6 @@
     <w:p>
       <w:r>
         <w:rPr>
-          <w:rFonts w:ascii="Bookman Old Style" w:hAnsi="Bookman Old Style"/>
           <w:sz w:val="2"/>
         </w:rPr>
         <w:t xml:space="preserve">{%p if avon_code %}</w:t>
@@ -32,7 +31,6 @@
     <w:p>
       <w:r>
         <w:rPr>
-          <w:rFonts w:ascii="Bookman Old Style" w:hAnsi="Bookman Old Style"/>
           <w:sz w:val="2"/>
         </w:rPr>
         <w:t xml:space="preserve">{%p endif %}</w:t>
@@ -240,11 +238,16 @@
       </w:r>
     </w:p>
     <w:p>
-      <w:r>
+      <w:pPr>
         <w:rPr>
           <w:sz w:val="2"/>
         </w:rPr>
-        <w:t>{%p if order_number %}</w:t>
+      </w:pPr>
+      <w:r>
+        <w:rPr>
+          <w:sz w:val="2"/>
+        </w:rPr>
+        <w:t xml:space="preserve">{%p if order_number %}</w:t>
       </w:r>
     </w:p>
     <w:p>
@@ -276,19 +279,29 @@
       </w:r>
     </w:p>
     <w:p>
-      <w:r>
+      <w:pPr>
         <w:rPr>
           <w:sz w:val="2"/>
         </w:rPr>
-        <w:t>{%p endif %}</w:t>
+      </w:pPr>
+      <w:r>
+        <w:rPr>
+          <w:sz w:val="2"/>
+        </w:rPr>
+        <w:t xml:space="preserve">{%p endif %}</w:t>
       </w:r>
     </w:p>
     <w:p>
-      <w:r>
+      <w:pPr>
         <w:rPr>
           <w:sz w:val="2"/>
         </w:rPr>
-        <w:t>{%p if certificate_number %}</w:t>
+      </w:pPr>
+      <w:r>
+        <w:rPr>
+          <w:sz w:val="2"/>
+        </w:rPr>
+        <w:t xml:space="preserve">{%p if certificate_number %}</w:t>
       </w:r>
     </w:p>
     <w:p>
@@ -326,11 +339,16 @@
       </w:r>
     </w:p>
     <w:p>
-      <w:r>
+      <w:pPr>
         <w:rPr>
           <w:sz w:val="2"/>
         </w:rPr>
-        <w:t>{%p endif %}</w:t>
+      </w:pPr>
+      <w:r>
+        <w:rPr>
+          <w:sz w:val="2"/>
+        </w:rPr>
+        <w:t xml:space="preserve">{%p endif %}</w:t>
       </w:r>
     </w:p>
     <w:p>
@@ -362,6 +380,7 @@
       <w:tr>
         <w:trPr>
           <w:trHeight w:val="480"/>
+          <w:tblHeader/>
         </w:trPr>
         <w:tc>
           <w:tcPr>
@@ -848,6 +867,7 @@
       <w:tr>
         <w:trPr>
           <w:trHeight w:val="480"/>
+          <w:cantSplit/>
         </w:trPr>
         <w:tc>
           <w:tcPr>

</xml_diff>

<commit_message>
feat: use user-edited master .docx template with tblHeader + cantSplit
Master template edited manually in Word Online (preserves exact formatting).
Programmatically added: tblHeader (repeat header row), cantSplit (no row split).

Co-Authored-By: Claude Opus 4.6 (1M context) <noreply@anthropic.com>
</commit_message>
<xml_diff>
--- a/mbr/templates/cert_master_template.docx
+++ b/mbr/templates/cert_master_template.docx
@@ -2,15 +2,16 @@
 <file path=word/document.xml><?xml version="1.0" encoding="utf-8"?>
 <w:document xmlns:wpc="http://schemas.microsoft.com/office/word/2010/wordprocessingCanvas" xmlns:cx="http://schemas.microsoft.com/office/drawing/2014/chartex" xmlns:cx1="http://schemas.microsoft.com/office/drawing/2015/9/8/chartex" xmlns:cx2="http://schemas.microsoft.com/office/drawing/2015/10/21/chartex" xmlns:cx3="http://schemas.microsoft.com/office/drawing/2016/5/9/chartex" xmlns:cx4="http://schemas.microsoft.com/office/drawing/2016/5/10/chartex" xmlns:cx5="http://schemas.microsoft.com/office/drawing/2016/5/11/chartex" xmlns:cx6="http://schemas.microsoft.com/office/drawing/2016/5/12/chartex" xmlns:cx7="http://schemas.microsoft.com/office/drawing/2016/5/13/chartex" xmlns:cx8="http://schemas.microsoft.com/office/drawing/2016/5/14/chartex" xmlns:mc="http://schemas.openxmlformats.org/markup-compatibility/2006" xmlns:aink="http://schemas.microsoft.com/office/drawing/2016/ink" xmlns:am3d="http://schemas.microsoft.com/office/drawing/2017/model3d" xmlns:o="urn:schemas-microsoft-com:office:office" xmlns:oel="http://schemas.microsoft.com/office/2019/extlst" xmlns:r="http://schemas.openxmlformats.org/officeDocument/2006/relationships" xmlns:m="http://schemas.openxmlformats.org/officeDocument/2006/math" xmlns:v="urn:schemas-microsoft-com:vml" xmlns:wp14="http://schemas.microsoft.com/office/word/2010/wordprocessingDrawing" xmlns:wp="http://schemas.openxmlformats.org/drawingml/2006/wordprocessingDrawing" xmlns:w10="urn:schemas-microsoft-com:office:word" xmlns:w="http://schemas.openxmlformats.org/wordprocessingml/2006/main" xmlns:w14="http://schemas.microsoft.com/office/word/2010/wordml" xmlns:w15="http://schemas.microsoft.com/office/word/2012/wordml" xmlns:w16cex="http://schemas.microsoft.com/office/word/2018/wordml/cex" xmlns:w16cid="http://schemas.microsoft.com/office/word/2016/wordml/cid" xmlns:w16="http://schemas.microsoft.com/office/word/2018/wordml" xmlns:w16du="http://schemas.microsoft.com/office/word/2023/wordml/word16du" xmlns:w16sdtdh="http://schemas.microsoft.com/office/word/2020/wordml/sdtdatahash" xmlns:w16sdtfl="http://schemas.microsoft.com/office/word/2024/wordml/sdtformatlock" xmlns:w16se="http://schemas.microsoft.com/office/word/2015/wordml/symex" xmlns:wpg="http://schemas.microsoft.com/office/word/2010/wordprocessingGroup" xmlns:wpi="http://schemas.microsoft.com/office/word/2010/wordprocessingInk" xmlns:wne="http://schemas.microsoft.com/office/word/2006/wordml" xmlns:wps="http://schemas.microsoft.com/office/word/2010/wordprocessingShape" mc:Ignorable="w14 w15 w16se w16cid w16 w16cex w16sdtdh w16sdtfl w16du wp14">
   <w:body>
-    <w:p>
-      <w:r>
-        <w:rPr>
+    <w:p xmlns:wp14="http://schemas.microsoft.com/office/word/2010/wordml" wp14:textId="77777777">
+      <w:r>
+        <w:rPr>
+          <w:rFonts w:ascii="Bookman Old Style" w:hAnsi="Bookman Old Style"/>
           <w:sz w:val="2"/>
         </w:rPr>
         <w:t xml:space="preserve">{%p if avon_code %}</w:t>
       </w:r>
     </w:p>
-    <w:p>
+    <w:p xmlns:wp14="http://schemas.microsoft.com/office/word/2010/wordml" wp14:textId="77777777">
       <w:r>
         <w:rPr>
           <w:rFonts w:ascii="Bookman Old Style" w:hAnsi="Bookman Old Style"/>
@@ -19,7 +20,7 @@
         <w:t xml:space="preserve">Kod AVON/AVON code: {{avon_code}}</w:t>
       </w:r>
     </w:p>
-    <w:p>
+    <w:p xmlns:wp14="http://schemas.microsoft.com/office/word/2010/wordml" wp14:textId="77777777">
       <w:r>
         <w:rPr>
           <w:rFonts w:ascii="Bookman Old Style" w:hAnsi="Bookman Old Style"/>
@@ -28,9 +29,10 @@
         <w:t xml:space="preserve">Nazwa AVON/AVON name: {{avon_name}}</w:t>
       </w:r>
     </w:p>
-    <w:p>
-      <w:r>
-        <w:rPr>
+    <w:p xmlns:wp14="http://schemas.microsoft.com/office/word/2010/wordml" wp14:textId="77777777">
+      <w:r>
+        <w:rPr>
+          <w:rFonts w:ascii="Bookman Old Style" w:hAnsi="Bookman Old Style"/>
           <w:sz w:val="2"/>
         </w:rPr>
         <w:t xml:space="preserve">{%p endif %}</w:t>
@@ -139,7 +141,19 @@
           <w:sz w:val="22"/>
         </w:rPr>
         <w:t>Partia/Batch:</w:t>
+      </w:r>
+      <w:r>
+        <w:rPr>
+          <w:rFonts w:ascii="Bookman Old Style" w:hAnsi="Bookman Old Style"/>
+          <w:sz w:val="22"/>
+        </w:rPr>
         <w:tab/>
+      </w:r>
+      <w:r>
+        <w:rPr>
+          <w:rFonts w:ascii="Bookman Old Style" w:hAnsi="Bookman Old Style"/>
+          <w:sz w:val="22"/>
+        </w:rPr>
         <w:t>{{nr_partii}}</w:t>
       </w:r>
       <w:r>
@@ -175,7 +189,19 @@
           <w:sz w:val="22"/>
         </w:rPr>
         <w:t>Data produkcji/Production date:</w:t>
+      </w:r>
+      <w:r>
+        <w:rPr>
+          <w:rFonts w:ascii="Bookman Old Style" w:hAnsi="Bookman Old Style"/>
+          <w:sz w:val="22"/>
+        </w:rPr>
         <w:tab/>
+      </w:r>
+      <w:r>
+        <w:rPr>
+          <w:rFonts w:ascii="Bookman Old Style" w:hAnsi="Bookman Old Style"/>
+          <w:sz w:val="22"/>
+        </w:rPr>
         <w:t>{{dt_produkcji}}</w:t>
       </w:r>
       <w:r>
@@ -215,7 +241,19 @@
           <w:sz w:val="22"/>
         </w:rPr>
         <w:t>Data ważności/Expiry date:</w:t>
+      </w:r>
+      <w:r>
+        <w:rPr>
+          <w:rFonts w:ascii="Bookman Old Style" w:hAnsi="Bookman Old Style"/>
+          <w:sz w:val="22"/>
+        </w:rPr>
         <w:tab/>
+      </w:r>
+      <w:r>
+        <w:rPr>
+          <w:rFonts w:ascii="Bookman Old Style" w:hAnsi="Bookman Old Style"/>
+          <w:sz w:val="22"/>
+        </w:rPr>
         <w:t>{{dt_waznosci}}</w:t>
       </w:r>
       <w:r>
@@ -237,17 +275,12 @@
         </w:rPr>
       </w:r>
     </w:p>
-    <w:p>
-      <w:pPr>
+    <w:p xmlns:wp14="http://schemas.microsoft.com/office/word/2010/wordml" wp14:textId="77777777">
+      <w:r>
         <w:rPr>
           <w:sz w:val="2"/>
         </w:rPr>
-      </w:pPr>
-      <w:r>
-        <w:rPr>
-          <w:sz w:val="2"/>
-        </w:rPr>
-        <w:t xml:space="preserve">{%p if order_number %}</w:t>
+        <w:t>{%p if order_number %}</w:t>
       </w:r>
     </w:p>
     <w:p>
@@ -268,7 +301,19 @@
           <w:sz w:val="22"/>
         </w:rPr>
         <w:t>Numer zamówienia/Order No.:</w:t>
+      </w:r>
+      <w:r>
+        <w:rPr>
+          <w:rFonts w:ascii="Bookman Old Style" w:hAnsi="Bookman Old Style"/>
+          <w:sz w:val="22"/>
+        </w:rPr>
         <w:tab/>
+      </w:r>
+      <w:r>
+        <w:rPr>
+          <w:rFonts w:ascii="Bookman Old Style" w:hAnsi="Bookman Old Style"/>
+          <w:sz w:val="22"/>
+        </w:rPr>
         <w:t>{{order_number}}</w:t>
       </w:r>
       <w:r>
@@ -278,30 +323,20 @@
         </w:rPr>
       </w:r>
     </w:p>
-    <w:p>
-      <w:pPr>
+    <w:p xmlns:wp14="http://schemas.microsoft.com/office/word/2010/wordml" wp14:textId="77777777">
+      <w:r>
         <w:rPr>
           <w:sz w:val="2"/>
         </w:rPr>
-      </w:pPr>
+        <w:t>{%p endif %}</w:t>
+      </w:r>
+    </w:p>
+    <w:p xmlns:wp14="http://schemas.microsoft.com/office/word/2010/wordml" wp14:textId="77777777">
       <w:r>
         <w:rPr>
           <w:sz w:val="2"/>
         </w:rPr>
-        <w:t xml:space="preserve">{%p endif %}</w:t>
-      </w:r>
-    </w:p>
-    <w:p>
-      <w:pPr>
-        <w:rPr>
-          <w:sz w:val="2"/>
-        </w:rPr>
-      </w:pPr>
-      <w:r>
-        <w:rPr>
-          <w:sz w:val="2"/>
-        </w:rPr>
-        <w:t xml:space="preserve">{%p if certificate_number %}</w:t>
+        <w:t>{%p if certificate_number %}</w:t>
       </w:r>
     </w:p>
     <w:p>
@@ -322,7 +357,19 @@
           <w:sz w:val="22"/>
         </w:rPr>
         <w:t>Numer certyfikatu/Certificate No.:</w:t>
+      </w:r>
+      <w:r>
+        <w:rPr>
+          <w:rFonts w:ascii="Bookman Old Style" w:hAnsi="Bookman Old Style"/>
+          <w:sz w:val="22"/>
+        </w:rPr>
         <w:tab/>
+      </w:r>
+      <w:r>
+        <w:rPr>
+          <w:rFonts w:ascii="Bookman Old Style" w:hAnsi="Bookman Old Style"/>
+          <w:sz w:val="22"/>
+        </w:rPr>
         <w:t>{{certificate_number}} {{rspo_text}}</w:t>
       </w:r>
       <w:r>
@@ -338,17 +385,12 @@
         </w:rPr>
       </w:r>
     </w:p>
-    <w:p>
-      <w:pPr>
+    <w:p xmlns:wp14="http://schemas.microsoft.com/office/word/2010/wordml" wp14:textId="77777777">
+      <w:r>
         <w:rPr>
           <w:sz w:val="2"/>
         </w:rPr>
-      </w:pPr>
-      <w:r>
-        <w:rPr>
-          <w:sz w:val="2"/>
-        </w:rPr>
-        <w:t xml:space="preserve">{%p endif %}</w:t>
+        <w:t>{%p endif %}</w:t>
       </w:r>
     </w:p>
     <w:p>
@@ -362,7 +404,7 @@
     </w:p>
     <w:tbl>
       <w:tblPr>
-        <w:tblW w:w="9679" w:type="dxa"/>
+        <w:tblW w:w="9677" w:type="dxa"/>
         <w:tblInd w:w="60" w:type="dxa"/>
         <w:tblLayout w:type="fixed"/>
         <w:tblCellMar>
@@ -375,7 +417,7 @@
         <w:gridCol w:w="4471"/>
         <w:gridCol w:w="2127"/>
         <w:gridCol w:w="1984"/>
-        <w:gridCol w:w="1097"/>
+        <w:gridCol w:w="1095"/>
       </w:tblGrid>
       <w:tr>
         <w:trPr>
@@ -386,9 +428,9 @@
           <w:tcPr>
             <w:tcW w:w="4471" w:type="dxa"/>
             <w:tcBorders>
-              <w:top w:val="single" w:sz="4" w:space="0" w:color="000000"/>
-              <w:left w:val="single" w:sz="4" w:space="0" w:color="000000"/>
-              <w:bottom w:val="single" w:sz="4" w:space="0" w:color="000000"/>
+              <w:top w:val="single" w:color="000000" w:themeColor="text1" w:sz="4" w:space="0"/>
+              <w:left w:val="single" w:color="000000" w:themeColor="text1" w:sz="4" w:space="0"/>
+              <w:bottom w:val="single" w:color="000000" w:themeColor="text1" w:sz="4" w:space="0"/>
             </w:tcBorders>
             <w:tcMar>
               <w:top w:w="0" w:type="dxa"/>
@@ -402,9 +444,11 @@
             <w:pPr>
               <w:pStyle w:val="Standard"/>
               <w:snapToGrid w:val="0"/>
-              <w:rPr>
-                <w:rFonts w:ascii="Bookman Old Style" w:hAnsi="Bookman Old Style"/>
-                <w:b/>
+              <w:jc w:val="center"/>
+              <w:rPr>
+                <w:rFonts w:ascii="Bookman Old Style" w:hAnsi="Bookman Old Style"/>
+                <w:b w:val="1"/>
+                <w:bCs w:val="1"/>
                 <w:sz w:val="22"/>
                 <w:szCs w:val="22"/>
                 <w:lang w:val="en-GB"/>
@@ -413,21 +457,46 @@
             <w:r>
               <w:rPr>
                 <w:rFonts w:ascii="Bookman Old Style" w:hAnsi="Bookman Old Style"/>
-                <w:b/>
-                <w:sz w:val="22"/>
-                <w:szCs w:val="22"/>
-                <w:lang w:val="en-GB"/>
-              </w:rPr>
-              <w:t>Parametr oznaczony</w:t>
+                <w:b w:val="1"/>
+                <w:bCs w:val="1"/>
+                <w:sz w:val="22"/>
+                <w:szCs w:val="22"/>
+                <w:lang w:val="en-GB"/>
+              </w:rPr>
+              <w:t>Parametr</w:t>
+            </w:r>
+            <w:r>
+              <w:rPr>
+                <w:rFonts w:ascii="Bookman Old Style" w:hAnsi="Bookman Old Style"/>
+                <w:b w:val="1"/>
+                <w:bCs w:val="1"/>
+                <w:sz w:val="22"/>
+                <w:szCs w:val="22"/>
+                <w:lang w:val="en-GB"/>
+              </w:rPr>
+              <w:t xml:space="preserve"> </w:t>
+            </w:r>
+            <w:r>
+              <w:rPr>
+                <w:rFonts w:ascii="Bookman Old Style" w:hAnsi="Bookman Old Style"/>
+                <w:b w:val="1"/>
+                <w:bCs w:val="1"/>
+                <w:sz w:val="22"/>
+                <w:szCs w:val="22"/>
+                <w:lang w:val="en-GB"/>
+              </w:rPr>
+              <w:t>oznaczony</w:t>
             </w:r>
           </w:p>
           <w:p>
             <w:pPr>
               <w:pStyle w:val="Standard"/>
               <w:snapToGrid w:val="0"/>
-              <w:rPr>
-                <w:rFonts w:ascii="Bookman Old Style" w:hAnsi="Bookman Old Style"/>
-                <w:b/>
+              <w:jc w:val="center"/>
+              <w:rPr>
+                <w:rFonts w:ascii="Bookman Old Style" w:hAnsi="Bookman Old Style"/>
+                <w:b w:val="1"/>
+                <w:bCs w:val="1"/>
                 <w:sz w:val="22"/>
                 <w:szCs w:val="22"/>
                 <w:lang w:val="en-GB"/>
@@ -436,7 +505,8 @@
             <w:r>
               <w:rPr>
                 <w:rFonts w:ascii="Bookman Old Style" w:hAnsi="Bookman Old Style"/>
-                <w:b/>
+                <w:b w:val="1"/>
+                <w:bCs w:val="1"/>
                 <w:sz w:val="22"/>
                 <w:szCs w:val="22"/>
                 <w:lang w:val="en-GB"/>
@@ -446,7 +516,8 @@
             <w:r>
               <w:rPr>
                 <w:rFonts w:ascii="Bookman Old Style" w:hAnsi="Bookman Old Style"/>
-                <w:b/>
+                <w:b w:val="1"/>
+                <w:bCs w:val="1"/>
                 <w:sz w:val="22"/>
                 <w:szCs w:val="22"/>
                 <w:lang w:val="en-GB"/>
@@ -459,9 +530,9 @@
           <w:tcPr>
             <w:tcW w:w="2127" w:type="dxa"/>
             <w:tcBorders>
-              <w:top w:val="single" w:sz="4" w:space="0" w:color="000000"/>
-              <w:left w:val="single" w:sz="4" w:space="0" w:color="000000"/>
-              <w:bottom w:val="single" w:sz="4" w:space="0" w:color="000000"/>
+              <w:top w:val="single" w:color="000000" w:themeColor="text1" w:sz="4" w:space="0"/>
+              <w:left w:val="single" w:color="000000" w:themeColor="text1" w:sz="4" w:space="0"/>
+              <w:bottom w:val="single" w:color="000000" w:themeColor="text1" w:sz="4" w:space="0"/>
             </w:tcBorders>
             <w:tcMar>
               <w:top w:w="0" w:type="dxa"/>
@@ -479,7 +550,8 @@
               <w:jc w:val="center"/>
               <w:rPr>
                 <w:rFonts w:ascii="Bookman Old Style" w:hAnsi="Bookman Old Style"/>
-                <w:b/>
+                <w:b w:val="1"/>
+                <w:bCs w:val="1"/>
                 <w:sz w:val="22"/>
                 <w:szCs w:val="22"/>
                 <w:lang w:val="en-GB"/>
@@ -488,7 +560,8 @@
             <w:r>
               <w:rPr>
                 <w:rFonts w:ascii="Bookman Old Style" w:hAnsi="Bookman Old Style"/>
-                <w:b/>
+                <w:b w:val="1"/>
+                <w:bCs w:val="1"/>
                 <w:sz w:val="22"/>
                 <w:szCs w:val="22"/>
                 <w:lang w:val="en-GB"/>
@@ -504,7 +577,8 @@
               <w:jc w:val="center"/>
               <w:rPr>
                 <w:rFonts w:ascii="Bookman Old Style" w:hAnsi="Bookman Old Style"/>
-                <w:b/>
+                <w:b w:val="1"/>
+                <w:bCs w:val="1"/>
                 <w:sz w:val="22"/>
                 <w:szCs w:val="22"/>
                 <w:lang w:val="en-GB"/>
@@ -513,7 +587,8 @@
             <w:r>
               <w:rPr>
                 <w:rFonts w:ascii="Bookman Old Style" w:hAnsi="Bookman Old Style"/>
-                <w:b/>
+                <w:b w:val="1"/>
+                <w:bCs w:val="1"/>
                 <w:sz w:val="22"/>
                 <w:szCs w:val="22"/>
                 <w:lang w:val="en-GB"/>
@@ -523,7 +598,8 @@
             <w:r>
               <w:rPr>
                 <w:rFonts w:ascii="Bookman Old Style" w:hAnsi="Bookman Old Style"/>
-                <w:b/>
+                <w:b w:val="1"/>
+                <w:bCs w:val="1"/>
                 <w:sz w:val="22"/>
                 <w:szCs w:val="22"/>
                 <w:lang w:val="en-GB"/>
@@ -536,9 +612,9 @@
           <w:tcPr>
             <w:tcW w:w="1984" w:type="dxa"/>
             <w:tcBorders>
-              <w:top w:val="single" w:sz="4" w:space="0" w:color="000000"/>
-              <w:left w:val="single" w:sz="4" w:space="0" w:color="000000"/>
-              <w:bottom w:val="single" w:sz="4" w:space="0" w:color="000000"/>
+              <w:top w:val="single" w:color="000000" w:themeColor="text1" w:sz="4" w:space="0"/>
+              <w:left w:val="single" w:color="000000" w:themeColor="text1" w:sz="4" w:space="0"/>
+              <w:bottom w:val="single" w:color="000000" w:themeColor="text1" w:sz="4" w:space="0"/>
             </w:tcBorders>
             <w:tcMar>
               <w:top w:w="0" w:type="dxa"/>
@@ -555,7 +631,8 @@
               <w:jc w:val="center"/>
               <w:rPr>
                 <w:rFonts w:ascii="Bookman Old Style" w:hAnsi="Bookman Old Style"/>
-                <w:b/>
+                <w:b w:val="1"/>
+                <w:bCs w:val="1"/>
                 <w:sz w:val="22"/>
                 <w:szCs w:val="22"/>
                 <w:lang w:val="en-GB"/>
@@ -564,17 +641,41 @@
             <w:r>
               <w:rPr>
                 <w:rFonts w:ascii="Bookman Old Style" w:hAnsi="Bookman Old Style"/>
-                <w:b/>
-                <w:sz w:val="22"/>
-                <w:szCs w:val="22"/>
-                <w:lang w:val="en-GB"/>
-              </w:rPr>
-              <w:t>Metoda bada</w:t>
-            </w:r>
-            <w:r>
-              <w:rPr>
-                <w:rFonts w:ascii="Bookman Old Style" w:hAnsi="Bookman Old Style"/>
-                <w:b/>
+                <w:b w:val="1"/>
+                <w:bCs w:val="1"/>
+                <w:sz w:val="22"/>
+                <w:szCs w:val="22"/>
+                <w:lang w:val="en-GB"/>
+              </w:rPr>
+              <w:t>Metoda</w:t>
+            </w:r>
+            <w:r>
+              <w:rPr>
+                <w:rFonts w:ascii="Bookman Old Style" w:hAnsi="Bookman Old Style"/>
+                <w:b w:val="1"/>
+                <w:bCs w:val="1"/>
+                <w:sz w:val="22"/>
+                <w:szCs w:val="22"/>
+                <w:lang w:val="en-GB"/>
+              </w:rPr>
+              <w:t xml:space="preserve"> </w:t>
+            </w:r>
+            <w:r>
+              <w:rPr>
+                <w:rFonts w:ascii="Bookman Old Style" w:hAnsi="Bookman Old Style"/>
+                <w:b w:val="1"/>
+                <w:bCs w:val="1"/>
+                <w:sz w:val="22"/>
+                <w:szCs w:val="22"/>
+                <w:lang w:val="en-GB"/>
+              </w:rPr>
+              <w:t>bada</w:t>
+            </w:r>
+            <w:r>
+              <w:rPr>
+                <w:rFonts w:ascii="Bookman Old Style" w:hAnsi="Bookman Old Style"/>
+                <w:b w:val="1"/>
+                <w:bCs w:val="1"/>
                 <w:sz w:val="22"/>
                 <w:szCs w:val="22"/>
                 <w:lang w:val="en-GB"/>
@@ -589,7 +690,8 @@
               <w:jc w:val="center"/>
               <w:rPr>
                 <w:rFonts w:ascii="Bookman Old Style" w:hAnsi="Bookman Old Style"/>
-                <w:b/>
+                <w:b w:val="1"/>
+                <w:bCs w:val="1"/>
                 <w:sz w:val="22"/>
                 <w:szCs w:val="22"/>
                 <w:lang w:val="en-GB"/>
@@ -598,7 +700,8 @@
             <w:r>
               <w:rPr>
                 <w:rFonts w:ascii="Bookman Old Style" w:hAnsi="Bookman Old Style"/>
-                <w:b/>
+                <w:b w:val="1"/>
+                <w:bCs w:val="1"/>
                 <w:sz w:val="22"/>
                 <w:szCs w:val="22"/>
                 <w:lang w:val="en-GB"/>
@@ -608,7 +711,8 @@
             <w:r>
               <w:rPr>
                 <w:rFonts w:ascii="Bookman Old Style" w:hAnsi="Bookman Old Style"/>
-                <w:b/>
+                <w:b w:val="1"/>
+                <w:bCs w:val="1"/>
                 <w:sz w:val="22"/>
                 <w:szCs w:val="22"/>
                 <w:lang w:val="en-GB"/>
@@ -619,12 +723,12 @@
         </w:tc>
         <w:tc>
           <w:tcPr>
-            <w:tcW w:w="1097" w:type="dxa"/>
+            <w:tcW w:w="1095" w:type="dxa"/>
             <w:tcBorders>
-              <w:top w:val="single" w:sz="4" w:space="0" w:color="000000"/>
-              <w:left w:val="single" w:sz="4" w:space="0" w:color="000000"/>
-              <w:bottom w:val="single" w:sz="4" w:space="0" w:color="000000"/>
-              <w:right w:val="single" w:sz="4" w:space="0" w:color="000000"/>
+              <w:top w:val="single" w:color="000000" w:themeColor="text1" w:sz="4" w:space="0"/>
+              <w:left w:val="single" w:color="000000" w:themeColor="text1" w:sz="4" w:space="0"/>
+              <w:bottom w:val="single" w:color="000000" w:themeColor="text1" w:sz="4" w:space="0"/>
+              <w:right w:val="single" w:color="000000" w:themeColor="text1" w:sz="4" w:space="0"/>
             </w:tcBorders>
             <w:tcMar>
               <w:top w:w="0" w:type="dxa"/>
@@ -641,7 +745,8 @@
               <w:jc w:val="center"/>
               <w:rPr>
                 <w:rFonts w:ascii="Bookman Old Style" w:hAnsi="Bookman Old Style"/>
-                <w:b/>
+                <w:b w:val="1"/>
+                <w:bCs w:val="1"/>
                 <w:sz w:val="22"/>
                 <w:szCs w:val="22"/>
                 <w:lang w:val="en-GB"/>
@@ -650,7 +755,8 @@
             <w:r>
               <w:rPr>
                 <w:rFonts w:ascii="Bookman Old Style" w:hAnsi="Bookman Old Style"/>
-                <w:b/>
+                <w:b w:val="1"/>
+                <w:bCs w:val="1"/>
                 <w:sz w:val="22"/>
                 <w:szCs w:val="22"/>
                 <w:lang w:val="en-GB"/>
@@ -665,7 +771,8 @@
               <w:jc w:val="center"/>
               <w:rPr>
                 <w:rFonts w:ascii="Bookman Old Style" w:hAnsi="Bookman Old Style"/>
-                <w:b/>
+                <w:b w:val="1"/>
+                <w:bCs w:val="1"/>
                 <w:sz w:val="22"/>
                 <w:szCs w:val="22"/>
                 <w:lang w:val="en-GB"/>
@@ -674,7 +781,8 @@
             <w:r>
               <w:rPr>
                 <w:rFonts w:ascii="Bookman Old Style" w:hAnsi="Bookman Old Style"/>
-                <w:b/>
+                <w:b w:val="1"/>
+                <w:bCs w:val="1"/>
                 <w:sz w:val="22"/>
                 <w:szCs w:val="22"/>
                 <w:lang w:val="en-GB"/>
@@ -692,56 +800,9 @@
           <w:tcPr>
             <w:tcW w:w="4471" w:type="dxa"/>
             <w:tcBorders>
-              <w:top w:val="single" w:sz="4" w:space="0" w:color="000000"/>
-              <w:left w:val="single" w:sz="4" w:space="0" w:color="000000"/>
-              <w:bottom w:val="single" w:sz="4" w:space="0" w:color="000000"/>
-            </w:tcBorders>
-            <w:tcMar>
-              <w:top w:w="0" w:type="dxa"/>
-              <w:left w:w="70" w:type="dxa"/>
-              <w:bottom w:w="0" w:type="dxa"/>
-              <w:right w:w="70" w:type="dxa"/>
-            </w:tcMar>
-            <w:vAlign w:val="center"/>
-          </w:tcPr>
-          <w:p>
-            <w:pPr>
-              <w:pStyle w:val="Standard"/>
-              <w:snapToGrid w:val="0"/>
-              <w:rPr>
-                <w:rFonts w:ascii="Bookman Old Style" w:hAnsi="Bookman Old Style"/>
-                <w:sz w:val="22"/>
-                <w:szCs w:val="22"/>
-                <w:lang w:val="en-GB"/>
-              </w:rPr>
-            </w:pPr>
-            <w:r>
-              <w:rPr>
-                <w:sz w:val="2"/>
-              </w:rPr>
-              <w:t>{%tr for row in rows %}</w:t>
-            </w:r>
-          </w:p>
-          <w:p>
-            <w:pPr>
-              <w:pStyle w:val="Standard"/>
-              <w:snapToGrid w:val="0"/>
-              <w:rPr>
-                <w:rFonts w:ascii="Bookman Old Style" w:hAnsi="Bookman Old Style"/>
-                <w:sz w:val="22"/>
-                <w:szCs w:val="22"/>
-                <w:lang w:val="en-GB"/>
-              </w:rPr>
-            </w:pPr>
-          </w:p>
-        </w:tc>
-        <w:tc>
-          <w:tcPr>
-            <w:tcW w:w="2127" w:type="dxa"/>
-            <w:tcBorders>
-              <w:top w:val="single" w:sz="4" w:space="0" w:color="000000"/>
-              <w:left w:val="single" w:sz="4" w:space="0" w:color="000000"/>
-              <w:bottom w:val="single" w:sz="4" w:space="0" w:color="000000"/>
+              <w:top w:val="single" w:color="000000" w:themeColor="text1" w:sz="4" w:space="0"/>
+              <w:left w:val="single" w:color="000000" w:themeColor="text1" w:sz="4" w:space="0"/>
+              <w:bottom w:val="single" w:color="000000" w:themeColor="text1" w:sz="4" w:space="0"/>
             </w:tcBorders>
             <w:tcMar>
               <w:top w:w="0" w:type="dxa"/>
@@ -763,6 +824,55 @@
                 <w:lang w:val="en-GB"/>
               </w:rPr>
             </w:pPr>
+            <w:r>
+              <w:rPr>
+                <w:sz w:val="2"/>
+                <w:szCs w:val="2"/>
+              </w:rPr>
+              <w:t>{%</w:t>
+            </w:r>
+            <w:r>
+              <w:rPr>
+                <w:sz w:val="2"/>
+                <w:szCs w:val="2"/>
+              </w:rPr>
+              <w:t>tr</w:t>
+            </w:r>
+            <w:r>
+              <w:rPr>
+                <w:sz w:val="2"/>
+                <w:szCs w:val="2"/>
+              </w:rPr>
+              <w:t xml:space="preserve"> for </w:t>
+            </w:r>
+            <w:r>
+              <w:rPr>
+                <w:sz w:val="2"/>
+                <w:szCs w:val="2"/>
+              </w:rPr>
+              <w:t>row</w:t>
+            </w:r>
+            <w:r>
+              <w:rPr>
+                <w:sz w:val="2"/>
+                <w:szCs w:val="2"/>
+              </w:rPr>
+              <w:t xml:space="preserve"> in </w:t>
+            </w:r>
+            <w:r>
+              <w:rPr>
+                <w:sz w:val="2"/>
+                <w:szCs w:val="2"/>
+              </w:rPr>
+              <w:t>rows</w:t>
+            </w:r>
+            <w:r>
+              <w:rPr>
+                <w:sz w:val="2"/>
+                <w:szCs w:val="2"/>
+              </w:rPr>
+              <w:t xml:space="preserve"> %}</w:t>
+            </w:r>
           </w:p>
           <w:p>
             <w:pPr>
@@ -780,11 +890,11 @@
         </w:tc>
         <w:tc>
           <w:tcPr>
-            <w:tcW w:w="1984" w:type="dxa"/>
+            <w:tcW w:w="2127" w:type="dxa"/>
             <w:tcBorders>
-              <w:top w:val="single" w:sz="4" w:space="0" w:color="000000"/>
-              <w:left w:val="single" w:sz="4" w:space="0" w:color="000000"/>
-              <w:bottom w:val="single" w:sz="4" w:space="0" w:color="000000"/>
+              <w:top w:val="single" w:color="000000" w:themeColor="text1" w:sz="4" w:space="0"/>
+              <w:left w:val="single" w:color="000000" w:themeColor="text1" w:sz="4" w:space="0"/>
+              <w:bottom w:val="single" w:color="000000" w:themeColor="text1" w:sz="4" w:space="0"/>
             </w:tcBorders>
             <w:tcMar>
               <w:top w:w="0" w:type="dxa"/>
@@ -802,6 +912,8 @@
               <w:rPr>
                 <w:rFonts w:ascii="Bookman Old Style" w:hAnsi="Bookman Old Style"/>
                 <w:sz w:val="22"/>
+                <w:szCs w:val="22"/>
+                <w:lang w:val="en-GB"/>
               </w:rPr>
             </w:pPr>
           </w:p>
@@ -821,12 +933,11 @@
         </w:tc>
         <w:tc>
           <w:tcPr>
-            <w:tcW w:w="1097" w:type="dxa"/>
+            <w:tcW w:w="1984" w:type="dxa"/>
             <w:tcBorders>
-              <w:top w:val="single" w:sz="4" w:space="0" w:color="000000"/>
-              <w:left w:val="single" w:sz="4" w:space="0" w:color="000000"/>
-              <w:bottom w:val="single" w:sz="4" w:space="0" w:color="000000"/>
-              <w:right w:val="single" w:sz="4" w:space="0" w:color="000000"/>
+              <w:top w:val="single" w:color="000000" w:themeColor="text1" w:sz="4" w:space="0"/>
+              <w:left w:val="single" w:color="000000" w:themeColor="text1" w:sz="4" w:space="0"/>
+              <w:bottom w:val="single" w:color="000000" w:themeColor="text1" w:sz="4" w:space="0"/>
             </w:tcBorders>
             <w:tcMar>
               <w:top w:w="0" w:type="dxa"/>
@@ -845,7 +956,6 @@
                 <w:rFonts w:ascii="Bookman Old Style" w:hAnsi="Bookman Old Style"/>
                 <w:sz w:val="22"/>
                 <w:szCs w:val="22"/>
-                <w:lang w:val="en-GB"/>
               </w:rPr>
             </w:pPr>
           </w:p>
@@ -863,77 +973,14 @@
             </w:pPr>
           </w:p>
         </w:tc>
-      </w:tr>
-      <w:tr>
-        <w:trPr>
-          <w:trHeight w:val="480"/>
-          <w:cantSplit/>
-        </w:trPr>
         <w:tc>
           <w:tcPr>
-            <w:tcW w:w="4471" w:type="dxa"/>
+            <w:tcW w:w="1095" w:type="dxa"/>
             <w:tcBorders>
-              <w:top w:val="single" w:sz="4" w:space="0" w:color="000000"/>
-              <w:left w:val="single" w:sz="4" w:space="0" w:color="000000"/>
-              <w:bottom w:val="single" w:sz="4" w:space="0" w:color="000000"/>
-            </w:tcBorders>
-            <w:tcMar>
-              <w:top w:w="0" w:type="dxa"/>
-              <w:left w:w="70" w:type="dxa"/>
-              <w:bottom w:w="0" w:type="dxa"/>
-              <w:right w:w="70" w:type="dxa"/>
-            </w:tcMar>
-            <w:vAlign w:val="center"/>
-          </w:tcPr>
-          <w:p>
-            <w:pPr>
-              <w:pStyle w:val="Standard"/>
-              <w:snapToGrid w:val="0"/>
-              <w:rPr>
-                <w:rFonts w:ascii="Bookman Old Style" w:hAnsi="Bookman Old Style"/>
-                <w:sz w:val="22"/>
-                <w:szCs w:val="22"/>
-                <w:lang w:val="en-GB"/>
-              </w:rPr>
-            </w:pPr>
-            <w:r>
-              <w:rPr>
-                <w:rFonts w:ascii="Bookman Old Style" w:hAnsi="Bookman Old Style"/>
-                <w:sz w:val="22"/>
-              </w:rPr>
-              <w:t xml:space="preserve">{{row.name_pl}}</w:t>
-            </w:r>
-            <w:r>
-              <w:br/>
-            </w:r>
-            <w:r>
-              <w:rPr>
-                <w:rFonts w:ascii="Bookman Old Style" w:hAnsi="Bookman Old Style"/>
-                <w:sz w:val="22"/>
-              </w:rPr>
-              <w:t xml:space="preserve">/{{row.name_en}}</w:t>
-            </w:r>
-          </w:p>
-          <w:p>
-            <w:pPr>
-              <w:pStyle w:val="Standard"/>
-              <w:snapToGrid w:val="0"/>
-              <w:rPr>
-                <w:rFonts w:ascii="Bookman Old Style" w:hAnsi="Bookman Old Style"/>
-                <w:sz w:val="22"/>
-                <w:szCs w:val="22"/>
-                <w:lang w:val="en-GB"/>
-              </w:rPr>
-            </w:pPr>
-          </w:p>
-        </w:tc>
-        <w:tc>
-          <w:tcPr>
-            <w:tcW w:w="2127" w:type="dxa"/>
-            <w:tcBorders>
-              <w:top w:val="single" w:sz="4" w:space="0" w:color="000000"/>
-              <w:left w:val="single" w:sz="4" w:space="0" w:color="000000"/>
-              <w:bottom w:val="single" w:sz="4" w:space="0" w:color="000000"/>
+              <w:top w:val="single" w:color="000000" w:themeColor="text1" w:sz="4" w:space="0"/>
+              <w:left w:val="single" w:color="000000" w:themeColor="text1" w:sz="4" w:space="0"/>
+              <w:bottom w:val="single" w:color="000000" w:themeColor="text1" w:sz="4" w:space="0"/>
+              <w:right w:val="single" w:color="000000" w:themeColor="text1" w:sz="4" w:space="0"/>
             </w:tcBorders>
             <w:tcMar>
               <w:top w:w="0" w:type="dxa"/>
@@ -955,13 +1002,6 @@
                 <w:lang w:val="en-GB"/>
               </w:rPr>
             </w:pPr>
-            <w:r>
-              <w:rPr>
-                <w:rFonts w:ascii="Bookman Old Style" w:hAnsi="Bookman Old Style"/>
-                <w:sz w:val="22"/>
-              </w:rPr>
-              <w:t xml:space="preserve">{{row.requirement}}</w:t>
-            </w:r>
           </w:p>
           <w:p>
             <w:pPr>
@@ -977,13 +1017,19 @@
             </w:pPr>
           </w:p>
         </w:tc>
+      </w:tr>
+      <w:tr>
+        <w:trPr>
+          <w:trHeight w:val="480"/>
+          <w:cantSplit/>
+        </w:trPr>
         <w:tc>
           <w:tcPr>
-            <w:tcW w:w="1984" w:type="dxa"/>
+            <w:tcW w:w="4471" w:type="dxa"/>
             <w:tcBorders>
-              <w:top w:val="single" w:sz="4" w:space="0" w:color="000000"/>
-              <w:left w:val="single" w:sz="4" w:space="0" w:color="000000"/>
-              <w:bottom w:val="single" w:sz="4" w:space="0" w:color="000000"/>
+              <w:top w:val="single" w:color="000000" w:themeColor="text1" w:sz="4" w:space="0"/>
+              <w:left w:val="single" w:color="000000" w:themeColor="text1" w:sz="4" w:space="0"/>
+              <w:bottom w:val="single" w:color="000000" w:themeColor="text1" w:sz="4" w:space="0"/>
             </w:tcBorders>
             <w:tcMar>
               <w:top w:w="0" w:type="dxa"/>
@@ -1001,14 +1047,60 @@
               <w:rPr>
                 <w:rFonts w:ascii="Bookman Old Style" w:hAnsi="Bookman Old Style"/>
                 <w:sz w:val="22"/>
+                <w:szCs w:val="22"/>
+                <w:lang w:val="en-GB"/>
               </w:rPr>
             </w:pPr>
             <w:r>
               <w:rPr>
                 <w:rFonts w:ascii="Bookman Old Style" w:hAnsi="Bookman Old Style"/>
                 <w:sz w:val="22"/>
-              </w:rPr>
-              <w:t xml:space="preserve">{{row.method}}</w:t>
+                <w:szCs w:val="22"/>
+              </w:rPr>
+              <w:t>{{</w:t>
+            </w:r>
+            <w:r>
+              <w:rPr>
+                <w:rFonts w:ascii="Bookman Old Style" w:hAnsi="Bookman Old Style"/>
+                <w:sz w:val="22"/>
+                <w:szCs w:val="22"/>
+              </w:rPr>
+              <w:t>row.name_pl</w:t>
+            </w:r>
+            <w:r>
+              <w:rPr>
+                <w:rFonts w:ascii="Bookman Old Style" w:hAnsi="Bookman Old Style"/>
+                <w:sz w:val="22"/>
+                <w:szCs w:val="22"/>
+              </w:rPr>
+              <w:t>}}</w:t>
+            </w:r>
+            <w:r>
+              <w:br/>
+            </w:r>
+            <w:r>
+              <w:rPr>
+                <w:rFonts w:ascii="Bookman Old Style" w:hAnsi="Bookman Old Style"/>
+                <w:sz w:val="22"/>
+                <w:szCs w:val="22"/>
+              </w:rPr>
+              <w:t>/{{</w:t>
+            </w:r>
+            <w:r>
+              <w:rPr>
+                <w:rFonts w:ascii="Bookman Old Style" w:hAnsi="Bookman Old Style"/>
+                <w:sz w:val="22"/>
+                <w:szCs w:val="22"/>
+              </w:rPr>
+              <w:t>row.name_en</w:t>
+            </w:r>
+            <w:r>
+              <w:rPr>
+                <w:rFonts w:ascii="Bookman Old Style" w:hAnsi="Bookman Old Style"/>
+                <w:sz w:val="22"/>
+                <w:szCs w:val="22"/>
+              </w:rPr>
+              <w:t>}}</w:t>
             </w:r>
           </w:p>
           <w:p>
@@ -1027,12 +1119,11 @@
         </w:tc>
         <w:tc>
           <w:tcPr>
-            <w:tcW w:w="1097" w:type="dxa"/>
+            <w:tcW w:w="2127" w:type="dxa"/>
             <w:tcBorders>
-              <w:top w:val="single" w:sz="4" w:space="0" w:color="000000"/>
-              <w:left w:val="single" w:sz="4" w:space="0" w:color="000000"/>
-              <w:bottom w:val="single" w:sz="4" w:space="0" w:color="000000"/>
-              <w:right w:val="single" w:sz="4" w:space="0" w:color="000000"/>
+              <w:top w:val="single" w:color="000000" w:themeColor="text1" w:sz="4" w:space="0"/>
+              <w:left w:val="single" w:color="000000" w:themeColor="text1" w:sz="4" w:space="0"/>
+              <w:bottom w:val="single" w:color="000000" w:themeColor="text1" w:sz="4" w:space="0"/>
             </w:tcBorders>
             <w:tcMar>
               <w:top w:w="0" w:type="dxa"/>
@@ -1058,8 +1149,25 @@
               <w:rPr>
                 <w:rFonts w:ascii="Bookman Old Style" w:hAnsi="Bookman Old Style"/>
                 <w:sz w:val="22"/>
-              </w:rPr>
-              <w:t xml:space="preserve">{{row.result}}</w:t>
+                <w:szCs w:val="22"/>
+              </w:rPr>
+              <w:t>{{</w:t>
+            </w:r>
+            <w:r>
+              <w:rPr>
+                <w:rFonts w:ascii="Bookman Old Style" w:hAnsi="Bookman Old Style"/>
+                <w:sz w:val="22"/>
+                <w:szCs w:val="22"/>
+              </w:rPr>
+              <w:t>row.requirement</w:t>
+            </w:r>
+            <w:r>
+              <w:rPr>
+                <w:rFonts w:ascii="Bookman Old Style" w:hAnsi="Bookman Old Style"/>
+                <w:sz w:val="22"/>
+                <w:szCs w:val="22"/>
+              </w:rPr>
+              <w:t>}}</w:t>
             </w:r>
           </w:p>
           <w:p>
@@ -1076,65 +1184,13 @@
             </w:pPr>
           </w:p>
         </w:tc>
-      </w:tr>
-      <w:tr>
-        <w:trPr>
-          <w:trHeight w:val="480"/>
-        </w:trPr>
         <w:tc>
           <w:tcPr>
-            <w:tcW w:w="4471" w:type="dxa"/>
+            <w:tcW w:w="1984" w:type="dxa"/>
             <w:tcBorders>
-              <w:top w:val="single" w:sz="4" w:space="0" w:color="000000"/>
-              <w:left w:val="single" w:sz="4" w:space="0" w:color="000000"/>
-              <w:bottom w:val="single" w:sz="4" w:space="0" w:color="000000"/>
-            </w:tcBorders>
-            <w:tcMar>
-              <w:top w:w="0" w:type="dxa"/>
-              <w:left w:w="70" w:type="dxa"/>
-              <w:bottom w:w="0" w:type="dxa"/>
-              <w:right w:w="70" w:type="dxa"/>
-            </w:tcMar>
-            <w:vAlign w:val="center"/>
-          </w:tcPr>
-          <w:p>
-            <w:pPr>
-              <w:pStyle w:val="Standard"/>
-              <w:snapToGrid w:val="0"/>
-              <w:rPr>
-                <w:rFonts w:ascii="Bookman Old Style" w:hAnsi="Bookman Old Style"/>
-                <w:sz w:val="22"/>
-                <w:szCs w:val="22"/>
-                <w:lang w:val="en-GB"/>
-              </w:rPr>
-            </w:pPr>
-            <w:r>
-              <w:rPr>
-                <w:sz w:val="2"/>
-              </w:rPr>
-              <w:t>{%tr endfor %}</w:t>
-            </w:r>
-          </w:p>
-          <w:p>
-            <w:pPr>
-              <w:pStyle w:val="Standard"/>
-              <w:snapToGrid w:val="0"/>
-              <w:rPr>
-                <w:rFonts w:ascii="Bookman Old Style" w:hAnsi="Bookman Old Style"/>
-                <w:sz w:val="22"/>
-                <w:szCs w:val="22"/>
-                <w:lang w:val="en-GB"/>
-              </w:rPr>
-            </w:pPr>
-          </w:p>
-        </w:tc>
-        <w:tc>
-          <w:tcPr>
-            <w:tcW w:w="2127" w:type="dxa"/>
-            <w:tcBorders>
-              <w:top w:val="single" w:sz="4" w:space="0" w:color="000000"/>
-              <w:left w:val="single" w:sz="4" w:space="0" w:color="000000"/>
-              <w:bottom w:val="single" w:sz="4" w:space="0" w:color="000000"/>
+              <w:top w:val="single" w:color="000000" w:themeColor="text1" w:sz="4" w:space="0"/>
+              <w:left w:val="single" w:color="000000" w:themeColor="text1" w:sz="4" w:space="0"/>
+              <w:bottom w:val="single" w:color="000000" w:themeColor="text1" w:sz="4" w:space="0"/>
             </w:tcBorders>
             <w:tcMar>
               <w:top w:w="0" w:type="dxa"/>
@@ -1153,9 +1209,32 @@
                 <w:rFonts w:ascii="Bookman Old Style" w:hAnsi="Bookman Old Style"/>
                 <w:sz w:val="22"/>
                 <w:szCs w:val="22"/>
-                <w:lang w:val="en-GB"/>
               </w:rPr>
             </w:pPr>
+            <w:r>
+              <w:rPr>
+                <w:rFonts w:ascii="Bookman Old Style" w:hAnsi="Bookman Old Style"/>
+                <w:sz w:val="22"/>
+                <w:szCs w:val="22"/>
+              </w:rPr>
+              <w:t>{{</w:t>
+            </w:r>
+            <w:r>
+              <w:rPr>
+                <w:rFonts w:ascii="Bookman Old Style" w:hAnsi="Bookman Old Style"/>
+                <w:sz w:val="22"/>
+                <w:szCs w:val="22"/>
+              </w:rPr>
+              <w:t>row.method</w:t>
+            </w:r>
+            <w:r>
+              <w:rPr>
+                <w:rFonts w:ascii="Bookman Old Style" w:hAnsi="Bookman Old Style"/>
+                <w:sz w:val="22"/>
+                <w:szCs w:val="22"/>
+              </w:rPr>
+              <w:t>}}</w:t>
+            </w:r>
           </w:p>
           <w:p>
             <w:pPr>
@@ -1173,11 +1252,12 @@
         </w:tc>
         <w:tc>
           <w:tcPr>
-            <w:tcW w:w="1984" w:type="dxa"/>
+            <w:tcW w:w="1095" w:type="dxa"/>
             <w:tcBorders>
-              <w:top w:val="single" w:sz="4" w:space="0" w:color="000000"/>
-              <w:left w:val="single" w:sz="4" w:space="0" w:color="000000"/>
-              <w:bottom w:val="single" w:sz="4" w:space="0" w:color="000000"/>
+              <w:top w:val="single" w:color="000000" w:themeColor="text1" w:sz="4" w:space="0"/>
+              <w:left w:val="single" w:color="000000" w:themeColor="text1" w:sz="4" w:space="0"/>
+              <w:bottom w:val="single" w:color="000000" w:themeColor="text1" w:sz="4" w:space="0"/>
+              <w:right w:val="single" w:color="000000" w:themeColor="text1" w:sz="4" w:space="0"/>
             </w:tcBorders>
             <w:tcMar>
               <w:top w:w="0" w:type="dxa"/>
@@ -1195,8 +1275,34 @@
               <w:rPr>
                 <w:rFonts w:ascii="Bookman Old Style" w:hAnsi="Bookman Old Style"/>
                 <w:sz w:val="22"/>
+                <w:szCs w:val="22"/>
+                <w:lang w:val="en-GB"/>
               </w:rPr>
             </w:pPr>
+            <w:r>
+              <w:rPr>
+                <w:rFonts w:ascii="Bookman Old Style" w:hAnsi="Bookman Old Style"/>
+                <w:sz w:val="22"/>
+                <w:szCs w:val="22"/>
+              </w:rPr>
+              <w:t>{{</w:t>
+            </w:r>
+            <w:r>
+              <w:rPr>
+                <w:rFonts w:ascii="Bookman Old Style" w:hAnsi="Bookman Old Style"/>
+                <w:sz w:val="22"/>
+                <w:szCs w:val="22"/>
+              </w:rPr>
+              <w:t>row.result</w:t>
+            </w:r>
+            <w:r>
+              <w:rPr>
+                <w:rFonts w:ascii="Bookman Old Style" w:hAnsi="Bookman Old Style"/>
+                <w:sz w:val="22"/>
+                <w:szCs w:val="22"/>
+              </w:rPr>
+              <w:t>}}</w:t>
+            </w:r>
           </w:p>
           <w:p>
             <w:pPr>
@@ -1212,14 +1318,18 @@
             </w:pPr>
           </w:p>
         </w:tc>
+      </w:tr>
+      <w:tr>
+        <w:trPr>
+          <w:trHeight w:val="480"/>
+        </w:trPr>
         <w:tc>
           <w:tcPr>
-            <w:tcW w:w="1097" w:type="dxa"/>
+            <w:tcW w:w="4471" w:type="dxa"/>
             <w:tcBorders>
-              <w:top w:val="single" w:sz="4" w:space="0" w:color="000000"/>
-              <w:left w:val="single" w:sz="4" w:space="0" w:color="000000"/>
-              <w:bottom w:val="single" w:sz="4" w:space="0" w:color="000000"/>
-              <w:right w:val="single" w:sz="4" w:space="0" w:color="000000"/>
+              <w:top w:val="single" w:color="000000" w:themeColor="text1" w:sz="4" w:space="0"/>
+              <w:left w:val="single" w:color="000000" w:themeColor="text1" w:sz="4" w:space="0"/>
+              <w:bottom w:val="single" w:color="000000" w:themeColor="text1" w:sz="4" w:space="0"/>
             </w:tcBorders>
             <w:tcMar>
               <w:top w:w="0" w:type="dxa"/>
@@ -1241,6 +1351,170 @@
                 <w:lang w:val="en-GB"/>
               </w:rPr>
             </w:pPr>
+            <w:r>
+              <w:rPr>
+                <w:sz w:val="2"/>
+                <w:szCs w:val="2"/>
+              </w:rPr>
+              <w:t>{%</w:t>
+            </w:r>
+            <w:r>
+              <w:rPr>
+                <w:sz w:val="2"/>
+                <w:szCs w:val="2"/>
+              </w:rPr>
+              <w:t>tr</w:t>
+            </w:r>
+            <w:r>
+              <w:rPr>
+                <w:sz w:val="2"/>
+                <w:szCs w:val="2"/>
+              </w:rPr>
+              <w:t xml:space="preserve"> </w:t>
+            </w:r>
+            <w:r>
+              <w:rPr>
+                <w:sz w:val="2"/>
+                <w:szCs w:val="2"/>
+              </w:rPr>
+              <w:t>endfor</w:t>
+            </w:r>
+            <w:r>
+              <w:rPr>
+                <w:sz w:val="2"/>
+                <w:szCs w:val="2"/>
+              </w:rPr>
+              <w:t xml:space="preserve"> %}</w:t>
+            </w:r>
+          </w:p>
+          <w:p>
+            <w:pPr>
+              <w:pStyle w:val="Standard"/>
+              <w:snapToGrid w:val="0"/>
+              <w:jc w:val="center"/>
+              <w:rPr>
+                <w:rFonts w:ascii="Bookman Old Style" w:hAnsi="Bookman Old Style"/>
+                <w:sz w:val="22"/>
+                <w:szCs w:val="22"/>
+                <w:lang w:val="en-GB"/>
+              </w:rPr>
+            </w:pPr>
+          </w:p>
+        </w:tc>
+        <w:tc>
+          <w:tcPr>
+            <w:tcW w:w="2127" w:type="dxa"/>
+            <w:tcBorders>
+              <w:top w:val="single" w:color="000000" w:themeColor="text1" w:sz="4" w:space="0"/>
+              <w:left w:val="single" w:color="000000" w:themeColor="text1" w:sz="4" w:space="0"/>
+              <w:bottom w:val="single" w:color="000000" w:themeColor="text1" w:sz="4" w:space="0"/>
+            </w:tcBorders>
+            <w:tcMar>
+              <w:top w:w="0" w:type="dxa"/>
+              <w:left w:w="70" w:type="dxa"/>
+              <w:bottom w:w="0" w:type="dxa"/>
+              <w:right w:w="70" w:type="dxa"/>
+            </w:tcMar>
+            <w:vAlign w:val="center"/>
+          </w:tcPr>
+          <w:p>
+            <w:pPr>
+              <w:pStyle w:val="Standard"/>
+              <w:snapToGrid w:val="0"/>
+              <w:jc w:val="center"/>
+              <w:rPr>
+                <w:rFonts w:ascii="Bookman Old Style" w:hAnsi="Bookman Old Style"/>
+                <w:sz w:val="22"/>
+                <w:szCs w:val="22"/>
+                <w:lang w:val="en-GB"/>
+              </w:rPr>
+            </w:pPr>
+          </w:p>
+          <w:p>
+            <w:pPr>
+              <w:pStyle w:val="Standard"/>
+              <w:snapToGrid w:val="0"/>
+              <w:jc w:val="center"/>
+              <w:rPr>
+                <w:rFonts w:ascii="Bookman Old Style" w:hAnsi="Bookman Old Style"/>
+                <w:sz w:val="22"/>
+                <w:szCs w:val="22"/>
+                <w:lang w:val="en-GB"/>
+              </w:rPr>
+            </w:pPr>
+          </w:p>
+        </w:tc>
+        <w:tc>
+          <w:tcPr>
+            <w:tcW w:w="1984" w:type="dxa"/>
+            <w:tcBorders>
+              <w:top w:val="single" w:color="000000" w:themeColor="text1" w:sz="4" w:space="0"/>
+              <w:left w:val="single" w:color="000000" w:themeColor="text1" w:sz="4" w:space="0"/>
+              <w:bottom w:val="single" w:color="000000" w:themeColor="text1" w:sz="4" w:space="0"/>
+            </w:tcBorders>
+            <w:tcMar>
+              <w:top w:w="0" w:type="dxa"/>
+              <w:left w:w="70" w:type="dxa"/>
+              <w:bottom w:w="0" w:type="dxa"/>
+              <w:right w:w="70" w:type="dxa"/>
+            </w:tcMar>
+            <w:vAlign w:val="center"/>
+          </w:tcPr>
+          <w:p>
+            <w:pPr>
+              <w:pStyle w:val="Standard"/>
+              <w:snapToGrid w:val="0"/>
+              <w:jc w:val="center"/>
+              <w:rPr>
+                <w:rFonts w:ascii="Bookman Old Style" w:hAnsi="Bookman Old Style"/>
+                <w:sz w:val="22"/>
+                <w:szCs w:val="22"/>
+              </w:rPr>
+            </w:pPr>
+          </w:p>
+          <w:p>
+            <w:pPr>
+              <w:pStyle w:val="Standard"/>
+              <w:snapToGrid w:val="0"/>
+              <w:jc w:val="center"/>
+              <w:rPr>
+                <w:rFonts w:ascii="Bookman Old Style" w:hAnsi="Bookman Old Style"/>
+                <w:sz w:val="22"/>
+                <w:szCs w:val="22"/>
+                <w:lang w:val="en-GB"/>
+              </w:rPr>
+            </w:pPr>
+          </w:p>
+        </w:tc>
+        <w:tc>
+          <w:tcPr>
+            <w:tcW w:w="1095" w:type="dxa"/>
+            <w:tcBorders>
+              <w:top w:val="single" w:color="000000" w:themeColor="text1" w:sz="4" w:space="0"/>
+              <w:left w:val="single" w:color="000000" w:themeColor="text1" w:sz="4" w:space="0"/>
+              <w:bottom w:val="single" w:color="000000" w:themeColor="text1" w:sz="4" w:space="0"/>
+              <w:right w:val="single" w:color="000000" w:themeColor="text1" w:sz="4" w:space="0"/>
+            </w:tcBorders>
+            <w:tcMar>
+              <w:top w:w="0" w:type="dxa"/>
+              <w:left w:w="70" w:type="dxa"/>
+              <w:bottom w:w="0" w:type="dxa"/>
+              <w:right w:w="70" w:type="dxa"/>
+            </w:tcMar>
+            <w:vAlign w:val="center"/>
+          </w:tcPr>
+          <w:p>
+            <w:pPr>
+              <w:pStyle w:val="Standard"/>
+              <w:snapToGrid w:val="0"/>
+              <w:jc w:val="center"/>
+              <w:rPr>
+                <w:rFonts w:ascii="Bookman Old Style" w:hAnsi="Bookman Old Style"/>
+                <w:sz w:val="22"/>
+                <w:szCs w:val="22"/>
+                <w:lang w:val="en-GB"/>
+              </w:rPr>
+            </w:pPr>
           </w:p>
           <w:p>
             <w:pPr>
@@ -1702,7 +1976,7 @@
     <w:sectPr>
       <w:headerReference w:type="default" r:id="rId8"/>
       <w:footerReference w:type="default" r:id="rId9"/>
-      <w:pgSz w:w="11906" w:h="16838"/>
+      <w:pgSz w:w="11906" w:h="16838" w:orient="portrait"/>
       <w:pgMar w:top="964" w:right="1134" w:bottom="964" w:left="1134" w:header="624" w:footer="680" w:gutter="0"/>
       <w:cols w:space="708"/>
       <w:docGrid w:linePitch="326"/>
@@ -1769,7 +2043,7 @@
         <w:tcPr>
           <w:tcW w:w="4819" w:type="dxa"/>
           <w:tcBorders>
-            <w:top w:val="single" w:sz="4" w:space="0" w:color="0000FF"/>
+            <w:top w:val="single" w:color="0000FF" w:sz="4" w:space="0"/>
           </w:tcBorders>
           <w:tcMar>
             <w:top w:w="0" w:type="dxa"/>
@@ -1819,7 +2093,7 @@
           <w:r>
             <w:t xml:space="preserve">e-mail: </w:t>
           </w:r>
-          <w:hyperlink r:id="rId1" w:history="1">
+          <w:hyperlink w:history="1" r:id="rId1">
             <w:r>
               <w:rPr>
                 <w:rStyle w:val="Internetlink"/>
@@ -1841,7 +2115,7 @@
         <w:tcPr>
           <w:tcW w:w="4820" w:type="dxa"/>
           <w:tcBorders>
-            <w:top w:val="single" w:sz="4" w:space="0" w:color="0000FF"/>
+            <w:top w:val="single" w:color="0000FF" w:sz="4" w:space="0"/>
           </w:tcBorders>
           <w:tcMar>
             <w:top w:w="0" w:type="dxa"/>
@@ -1969,9 +2243,9 @@
         <w:tcPr>
           <w:tcW w:w="1560" w:type="dxa"/>
           <w:tcBorders>
-            <w:top w:val="single" w:sz="4" w:space="0" w:color="0000FF"/>
-            <w:left w:val="single" w:sz="4" w:space="0" w:color="0000FF"/>
-            <w:bottom w:val="single" w:sz="4" w:space="0" w:color="0000FF"/>
+            <w:top w:val="single" w:color="0000FF" w:sz="4" w:space="0"/>
+            <w:left w:val="single" w:color="0000FF" w:sz="4" w:space="0"/>
+            <w:bottom w:val="single" w:color="0000FF" w:sz="4" w:space="0"/>
           </w:tcBorders>
           <w:tcMar>
             <w:top w:w="0" w:type="dxa"/>
@@ -1992,7 +2266,7 @@
               <w:lang w:val="en-GB" w:bidi="hi-IN"/>
             </w:rPr>
             <w:object w:dxaOrig="1440" w:dyaOrig="1440" w14:anchorId="33187B47">
-              <v:shapetype id="_x0000_t75" coordsize="21600,21600" o:spt="75" o:preferrelative="t" path="m@4@5l@4@11@9@11@9@5xe" filled="f" stroked="f">
+              <v:shapetype id="_x0000_t75" coordsize="21600,21600" filled="f" stroked="f" o:spt="75" o:preferrelative="t" path="m@4@5l@4@11@9@11@9@5xe">
                 <v:stroke joinstyle="miter"/>
                 <v:formulas>
                   <v:f eqn="if lineDrawn pixelLineWidth 0"/>
@@ -2008,11 +2282,11 @@
                   <v:f eqn="prod @7 21600 pixelHeight"/>
                   <v:f eqn="sum @10 21600 0"/>
                 </v:formulas>
-                <v:path o:extrusionok="f" gradientshapeok="t" o:connecttype="rect"/>
+                <v:path gradientshapeok="t" o:connecttype="rect" o:extrusionok="f"/>
                 <o:lock v:ext="edit" aspectratio="t"/>
               </v:shapetype>
-              <v:shape id="Obiekt1" o:spid="_x0000_s1025" type="#_x0000_t75" style="position:absolute;left:0;text-align:left;margin-left:15.3pt;margin-top:2pt;width:50.25pt;height:43.1pt;z-index:251660288;visibility:visible;mso-position-horizontal-relative:margin;mso-position-vertical-relative:margin">
-                <v:imagedata r:id="rId1" o:title=""/>
+              <v:shape id="Obiekt1" style="position:absolute;left:0;text-align:left;margin-left:15.3pt;margin-top:2pt;width:50.25pt;height:43.1pt;z-index:251660288;visibility:visible;mso-position-horizontal-relative:margin;mso-position-vertical-relative:margin" o:spid="_x0000_s1025" type="#_x0000_t75">
+                <v:imagedata o:title="" r:id="rId1"/>
                 <w10:wrap type="square" anchorx="margin" anchory="margin"/>
               </v:shape>
               <o:OLEObject Type="Embed" ProgID="PBrush" ShapeID="Obiekt1" DrawAspect="Content" ObjectID="_1834304553" r:id="rId2"/>
@@ -2024,10 +2298,10 @@
         <w:tcPr>
           <w:tcW w:w="8124" w:type="dxa"/>
           <w:tcBorders>
-            <w:top w:val="single" w:sz="4" w:space="0" w:color="0000FF"/>
-            <w:left w:val="single" w:sz="4" w:space="0" w:color="0000FF"/>
-            <w:bottom w:val="single" w:sz="4" w:space="0" w:color="0000FF"/>
-            <w:right w:val="single" w:sz="4" w:space="0" w:color="0000FF"/>
+            <w:top w:val="single" w:color="0000FF" w:sz="4" w:space="0"/>
+            <w:left w:val="single" w:color="0000FF" w:sz="4" w:space="0"/>
+            <w:bottom w:val="single" w:color="0000FF" w:sz="4" w:space="0"/>
+            <w:right w:val="single" w:color="0000FF" w:sz="4" w:space="0"/>
           </w:tcBorders>
           <w:tcMar>
             <w:top w:w="0" w:type="dxa"/>
@@ -2037,6 +2311,16 @@
           </w:tcMar>
           <w:vAlign w:val="center"/>
         </w:tcPr>
+        <w:p>
+          <w:pPr>
+            <w:pStyle w:val="Nagwek4"/>
+            <w:spacing w:line="360" w:lineRule="auto"/>
+            <w:jc w:val="center"/>
+            <w:rPr>
+              <w:lang w:val="en-GB"/>
+            </w:rPr>
+          </w:pPr>
+        </w:p>
         <w:p>
           <w:pPr>
             <w:pStyle w:val="Nagwek4"/>
@@ -2225,11 +2509,11 @@
 </file>
 
 <file path=word/styles.xml><?xml version="1.0" encoding="utf-8"?>
-<w:styles xmlns:mc="http://schemas.openxmlformats.org/markup-compatibility/2006" xmlns:r="http://schemas.openxmlformats.org/officeDocument/2006/relationships" xmlns:w="http://schemas.openxmlformats.org/wordprocessingml/2006/main" xmlns:w14="http://schemas.microsoft.com/office/word/2010/wordml" xmlns:w15="http://schemas.microsoft.com/office/word/2012/wordml" xmlns:w16cex="http://schemas.microsoft.com/office/word/2018/wordml/cex" xmlns:w16cid="http://schemas.microsoft.com/office/word/2016/wordml/cid" xmlns:w16="http://schemas.microsoft.com/office/word/2018/wordml" xmlns:w16du="http://schemas.microsoft.com/office/word/2023/wordml/word16du" xmlns:w16sdtdh="http://schemas.microsoft.com/office/word/2020/wordml/sdtdatahash" xmlns:w16sdtfl="http://schemas.microsoft.com/office/word/2024/wordml/sdtformatlock" xmlns:w16se="http://schemas.microsoft.com/office/word/2015/wordml/symex" mc:Ignorable="w14 w15 w16se w16cid w16 w16cex w16sdtdh w16sdtfl w16du">
+<w:styles xmlns:wp14="http://schemas.microsoft.com/office/word/2010/wordprocessingDrawing" xmlns:mc="http://schemas.openxmlformats.org/markup-compatibility/2006" xmlns:r="http://schemas.openxmlformats.org/officeDocument/2006/relationships" xmlns:w="http://schemas.openxmlformats.org/wordprocessingml/2006/main" xmlns:w14="http://schemas.microsoft.com/office/word/2010/wordml" xmlns:w15="http://schemas.microsoft.com/office/word/2012/wordml" xmlns:w16cex="http://schemas.microsoft.com/office/word/2018/wordml/cex" xmlns:w16cid="http://schemas.microsoft.com/office/word/2016/wordml/cid" xmlns:w16="http://schemas.microsoft.com/office/word/2018/wordml" xmlns:w16du="http://schemas.microsoft.com/office/word/2023/wordml/word16du" xmlns:w16sdtdh="http://schemas.microsoft.com/office/word/2020/wordml/sdtdatahash" xmlns:w16sdtfl="http://schemas.microsoft.com/office/word/2024/wordml/sdtformatlock" xmlns:w16se="http://schemas.microsoft.com/office/word/2015/wordml/symex" mc:Ignorable="w14 w15 w16se w16cid w16 w16cex w16sdtdh w16sdtfl w16du wp14">
   <w:docDefaults>
     <w:rPrDefault>
       <w:rPr>
-        <w:rFonts w:ascii="Times New Roman" w:eastAsia="SimSun" w:hAnsi="Times New Roman" w:cs="Mangal"/>
+        <w:rFonts w:ascii="Times New Roman" w:hAnsi="Times New Roman" w:eastAsia="SimSun" w:cs="Mangal"/>
         <w:kern w:val="3"/>
         <w:sz w:val="24"/>
         <w:szCs w:val="24"/>
@@ -2247,14 +2531,14 @@
   <w:latentStyles w:defLockedState="0" w:defUIPriority="99" w:defSemiHidden="0" w:defUnhideWhenUsed="0" w:defQFormat="0" w:count="376">
     <w:lsdException w:name="Normal" w:uiPriority="0" w:qFormat="1"/>
     <w:lsdException w:name="heading 1" w:uiPriority="9" w:qFormat="1"/>
-    <w:lsdException w:name="heading 2" w:semiHidden="1" w:uiPriority="9" w:unhideWhenUsed="1" w:qFormat="1"/>
-    <w:lsdException w:name="heading 3" w:semiHidden="1" w:uiPriority="9" w:unhideWhenUsed="1" w:qFormat="1"/>
-    <w:lsdException w:name="heading 4" w:semiHidden="1" w:uiPriority="9" w:unhideWhenUsed="1" w:qFormat="1"/>
-    <w:lsdException w:name="heading 5" w:semiHidden="1" w:uiPriority="9" w:unhideWhenUsed="1" w:qFormat="1"/>
-    <w:lsdException w:name="heading 6" w:semiHidden="1" w:uiPriority="9" w:unhideWhenUsed="1" w:qFormat="1"/>
-    <w:lsdException w:name="heading 7" w:semiHidden="1" w:uiPriority="9" w:unhideWhenUsed="1" w:qFormat="1"/>
-    <w:lsdException w:name="heading 8" w:semiHidden="1" w:uiPriority="9" w:unhideWhenUsed="1" w:qFormat="1"/>
-    <w:lsdException w:name="heading 9" w:semiHidden="1" w:uiPriority="9" w:unhideWhenUsed="1" w:qFormat="1"/>
+    <w:lsdException w:name="heading 2" w:uiPriority="9" w:semiHidden="1" w:unhideWhenUsed="1" w:qFormat="1"/>
+    <w:lsdException w:name="heading 3" w:uiPriority="9" w:semiHidden="1" w:unhideWhenUsed="1" w:qFormat="1"/>
+    <w:lsdException w:name="heading 4" w:uiPriority="9" w:semiHidden="1" w:unhideWhenUsed="1" w:qFormat="1"/>
+    <w:lsdException w:name="heading 5" w:uiPriority="9" w:semiHidden="1" w:unhideWhenUsed="1" w:qFormat="1"/>
+    <w:lsdException w:name="heading 6" w:uiPriority="9" w:semiHidden="1" w:unhideWhenUsed="1" w:qFormat="1"/>
+    <w:lsdException w:name="heading 7" w:uiPriority="9" w:semiHidden="1" w:unhideWhenUsed="1" w:qFormat="1"/>
+    <w:lsdException w:name="heading 8" w:uiPriority="9" w:semiHidden="1" w:unhideWhenUsed="1" w:qFormat="1"/>
+    <w:lsdException w:name="heading 9" w:uiPriority="9" w:semiHidden="1" w:unhideWhenUsed="1" w:qFormat="1"/>
     <w:lsdException w:name="index 1" w:semiHidden="1" w:unhideWhenUsed="1"/>
     <w:lsdException w:name="index 2" w:semiHidden="1" w:unhideWhenUsed="1"/>
     <w:lsdException w:name="index 3" w:semiHidden="1" w:unhideWhenUsed="1"/>
@@ -2264,22 +2548,22 @@
     <w:lsdException w:name="index 7" w:semiHidden="1" w:unhideWhenUsed="1"/>
     <w:lsdException w:name="index 8" w:semiHidden="1" w:unhideWhenUsed="1"/>
     <w:lsdException w:name="index 9" w:semiHidden="1" w:unhideWhenUsed="1"/>
-    <w:lsdException w:name="toc 1" w:semiHidden="1" w:uiPriority="39" w:unhideWhenUsed="1"/>
-    <w:lsdException w:name="toc 2" w:semiHidden="1" w:uiPriority="39" w:unhideWhenUsed="1"/>
-    <w:lsdException w:name="toc 3" w:semiHidden="1" w:uiPriority="39" w:unhideWhenUsed="1"/>
-    <w:lsdException w:name="toc 4" w:semiHidden="1" w:uiPriority="39" w:unhideWhenUsed="1"/>
-    <w:lsdException w:name="toc 5" w:semiHidden="1" w:uiPriority="39" w:unhideWhenUsed="1"/>
-    <w:lsdException w:name="toc 6" w:semiHidden="1" w:uiPriority="39" w:unhideWhenUsed="1"/>
-    <w:lsdException w:name="toc 7" w:semiHidden="1" w:uiPriority="39" w:unhideWhenUsed="1"/>
-    <w:lsdException w:name="toc 8" w:semiHidden="1" w:uiPriority="39" w:unhideWhenUsed="1"/>
-    <w:lsdException w:name="toc 9" w:semiHidden="1" w:uiPriority="39" w:unhideWhenUsed="1"/>
+    <w:lsdException w:name="toc 1" w:uiPriority="39" w:semiHidden="1" w:unhideWhenUsed="1"/>
+    <w:lsdException w:name="toc 2" w:uiPriority="39" w:semiHidden="1" w:unhideWhenUsed="1"/>
+    <w:lsdException w:name="toc 3" w:uiPriority="39" w:semiHidden="1" w:unhideWhenUsed="1"/>
+    <w:lsdException w:name="toc 4" w:uiPriority="39" w:semiHidden="1" w:unhideWhenUsed="1"/>
+    <w:lsdException w:name="toc 5" w:uiPriority="39" w:semiHidden="1" w:unhideWhenUsed="1"/>
+    <w:lsdException w:name="toc 6" w:uiPriority="39" w:semiHidden="1" w:unhideWhenUsed="1"/>
+    <w:lsdException w:name="toc 7" w:uiPriority="39" w:semiHidden="1" w:unhideWhenUsed="1"/>
+    <w:lsdException w:name="toc 8" w:uiPriority="39" w:semiHidden="1" w:unhideWhenUsed="1"/>
+    <w:lsdException w:name="toc 9" w:uiPriority="39" w:semiHidden="1" w:unhideWhenUsed="1"/>
     <w:lsdException w:name="Normal Indent" w:semiHidden="1" w:unhideWhenUsed="1"/>
-    <w:lsdException w:name="footnote text" w:semiHidden="1" w:uiPriority="0" w:unhideWhenUsed="1"/>
+    <w:lsdException w:name="footnote text" w:uiPriority="0" w:semiHidden="1" w:unhideWhenUsed="1"/>
     <w:lsdException w:name="annotation text" w:semiHidden="1" w:unhideWhenUsed="1"/>
     <w:lsdException w:name="header" w:semiHidden="1" w:unhideWhenUsed="1"/>
     <w:lsdException w:name="footer" w:semiHidden="1" w:unhideWhenUsed="1"/>
     <w:lsdException w:name="index heading" w:semiHidden="1" w:unhideWhenUsed="1"/>
-    <w:lsdException w:name="caption" w:semiHidden="1" w:uiPriority="35" w:unhideWhenUsed="1" w:qFormat="1"/>
+    <w:lsdException w:name="caption" w:uiPriority="35" w:semiHidden="1" w:unhideWhenUsed="1" w:qFormat="1"/>
     <w:lsdException w:name="table of figures" w:semiHidden="1" w:unhideWhenUsed="1"/>
     <w:lsdException w:name="envelope address" w:semiHidden="1" w:unhideWhenUsed="1"/>
     <w:lsdException w:name="envelope return" w:semiHidden="1" w:unhideWhenUsed="1"/>
@@ -2310,7 +2594,7 @@
     <w:lsdException w:name="Title" w:uiPriority="10" w:qFormat="1"/>
     <w:lsdException w:name="Closing" w:semiHidden="1" w:unhideWhenUsed="1"/>
     <w:lsdException w:name="Signature" w:semiHidden="1" w:unhideWhenUsed="1"/>
-    <w:lsdException w:name="Default Paragraph Font" w:semiHidden="1" w:uiPriority="1" w:unhideWhenUsed="1"/>
+    <w:lsdException w:name="Default Paragraph Font" w:uiPriority="1" w:semiHidden="1" w:unhideWhenUsed="1"/>
     <w:lsdException w:name="Body Text" w:semiHidden="1" w:unhideWhenUsed="1"/>
     <w:lsdException w:name="Body Text Indent" w:semiHidden="1" w:unhideWhenUsed="1"/>
     <w:lsdException w:name="List Continue" w:semiHidden="1" w:unhideWhenUsed="1"/>
@@ -2510,8 +2794,8 @@
     <w:lsdException w:name="Subtle Reference" w:uiPriority="31" w:qFormat="1"/>
     <w:lsdException w:name="Intense Reference" w:uiPriority="32" w:qFormat="1"/>
     <w:lsdException w:name="Book Title" w:uiPriority="33" w:qFormat="1"/>
-    <w:lsdException w:name="Bibliography" w:semiHidden="1" w:uiPriority="37" w:unhideWhenUsed="1"/>
-    <w:lsdException w:name="TOC Heading" w:semiHidden="1" w:uiPriority="39" w:unhideWhenUsed="1" w:qFormat="1"/>
+    <w:lsdException w:name="Bibliography" w:uiPriority="37" w:semiHidden="1" w:unhideWhenUsed="1"/>
+    <w:lsdException w:name="TOC Heading" w:uiPriority="39" w:semiHidden="1" w:unhideWhenUsed="1" w:qFormat="1"/>
     <w:lsdException w:name="Plain Table 1" w:uiPriority="41"/>
     <w:lsdException w:name="Plain Table 2" w:uiPriority="42"/>
     <w:lsdException w:name="Plain Table 3" w:uiPriority="43"/>
@@ -2622,7 +2906,7 @@
     <w:lsdException w:name="Unresolved Mention" w:semiHidden="1" w:unhideWhenUsed="1"/>
     <w:lsdException w:name="Smart Link" w:semiHidden="1" w:unhideWhenUsed="1"/>
   </w:latentStyles>
-  <w:style w:type="paragraph" w:default="1" w:styleId="Normalny">
+  <w:style w:type="paragraph" w:styleId="Normalny" w:default="1">
     <w:name w:val="Normal"/>
     <w:rsid w:val="00C639E6"/>
     <w:pPr>
@@ -2637,7 +2921,7 @@
     <w:pPr>
       <w:keepNext/>
       <w:pBdr>
-        <w:top w:val="double" w:sz="2" w:space="0" w:color="000000"/>
+        <w:top w:val="double" w:color="000000" w:sz="2" w:space="0"/>
       </w:pBdr>
       <w:tabs>
         <w:tab w:val="right" w:pos="9072"/>
@@ -2697,13 +2981,13 @@
       <w:sz w:val="24"/>
     </w:rPr>
   </w:style>
-  <w:style w:type="character" w:default="1" w:styleId="Domylnaczcionkaakapitu">
+  <w:style w:type="character" w:styleId="Domylnaczcionkaakapitu" w:default="1">
     <w:name w:val="Default Paragraph Font"/>
     <w:uiPriority w:val="1"/>
     <w:semiHidden/>
     <w:unhideWhenUsed/>
   </w:style>
-  <w:style w:type="table" w:default="1" w:styleId="Standardowy">
+  <w:style w:type="table" w:styleId="Standardowy" w:default="1">
     <w:name w:val="Normal Table"/>
     <w:uiPriority w:val="99"/>
     <w:semiHidden/>
@@ -2718,13 +3002,13 @@
       </w:tblCellMar>
     </w:tblPr>
   </w:style>
-  <w:style w:type="numbering" w:default="1" w:styleId="Bezlisty">
+  <w:style w:type="numbering" w:styleId="Bezlisty" w:default="1">
     <w:name w:val="No List"/>
     <w:uiPriority w:val="99"/>
     <w:semiHidden/>
     <w:unhideWhenUsed/>
   </w:style>
-  <w:style w:type="paragraph" w:customStyle="1" w:styleId="Standard">
+  <w:style w:type="paragraph" w:styleId="Standard" w:customStyle="1">
     <w:name w:val="Standard"/>
     <w:rsid w:val="00C639E6"/>
     <w:pPr>
@@ -2748,12 +3032,12 @@
       <w:spacing w:before="240" w:after="120"/>
     </w:pPr>
     <w:rPr>
-      <w:rFonts w:ascii="Arial" w:eastAsia="SimSun" w:hAnsi="Arial" w:cs="Mangal"/>
+      <w:rFonts w:ascii="Arial" w:hAnsi="Arial" w:eastAsia="SimSun" w:cs="Mangal"/>
       <w:sz w:val="28"/>
       <w:szCs w:val="28"/>
     </w:rPr>
   </w:style>
-  <w:style w:type="paragraph" w:customStyle="1" w:styleId="Textbody">
+  <w:style w:type="paragraph" w:styleId="Textbody" w:customStyle="1">
     <w:name w:val="Text body"/>
     <w:basedOn w:val="Standard"/>
     <w:rsid w:val="00C639E6"/>
@@ -2785,7 +3069,7 @@
       <w:szCs w:val="24"/>
     </w:rPr>
   </w:style>
-  <w:style w:type="paragraph" w:customStyle="1" w:styleId="Index">
+  <w:style w:type="paragraph" w:styleId="Index" w:customStyle="1">
     <w:name w:val="Index"/>
     <w:basedOn w:val="Standard"/>
     <w:rsid w:val="00C639E6"/>
@@ -2796,7 +3080,7 @@
       <w:rFonts w:cs="Mangal"/>
     </w:rPr>
   </w:style>
-  <w:style w:type="paragraph" w:customStyle="1" w:styleId="Footnote">
+  <w:style w:type="paragraph" w:styleId="Footnote" w:customStyle="1">
     <w:name w:val="Footnote"/>
     <w:basedOn w:val="Standard"/>
     <w:rsid w:val="00C639E6"/>
@@ -2822,7 +3106,7 @@
       <w:szCs w:val="16"/>
     </w:rPr>
   </w:style>
-  <w:style w:type="paragraph" w:customStyle="1" w:styleId="TableContents">
+  <w:style w:type="paragraph" w:styleId="TableContents" w:customStyle="1">
     <w:name w:val="Table Contents"/>
     <w:basedOn w:val="Standard"/>
     <w:rsid w:val="00C639E6"/>
@@ -2830,7 +3114,7 @@
       <w:suppressLineNumbers/>
     </w:pPr>
   </w:style>
-  <w:style w:type="paragraph" w:customStyle="1" w:styleId="TableHeading">
+  <w:style w:type="paragraph" w:styleId="TableHeading" w:customStyle="1">
     <w:name w:val="Table Heading"/>
     <w:basedOn w:val="TableContents"/>
     <w:rsid w:val="00C639E6"/>
@@ -2842,19 +3126,19 @@
       <w:bCs/>
     </w:rPr>
   </w:style>
-  <w:style w:type="character" w:customStyle="1" w:styleId="Absatz-Standardschriftart">
+  <w:style w:type="character" w:styleId="Absatz-Standardschriftart" w:customStyle="1">
     <w:name w:val="Absatz-Standardschriftart"/>
     <w:rsid w:val="00C639E6"/>
   </w:style>
-  <w:style w:type="character" w:customStyle="1" w:styleId="WW-Absatz-Standardschriftart">
+  <w:style w:type="character" w:styleId="WW-Absatz-Standardschriftart" w:customStyle="1">
     <w:name w:val="WW-Absatz-Standardschriftart"/>
     <w:rsid w:val="00C639E6"/>
   </w:style>
-  <w:style w:type="character" w:customStyle="1" w:styleId="WW-Absatz-Standardschriftart1">
+  <w:style w:type="character" w:styleId="WW-Absatz-Standardschriftart1" w:customStyle="1">
     <w:name w:val="WW-Absatz-Standardschriftart1"/>
     <w:rsid w:val="00C639E6"/>
   </w:style>
-  <w:style w:type="character" w:customStyle="1" w:styleId="Internetlink">
+  <w:style w:type="character" w:styleId="Internetlink" w:customStyle="1">
     <w:name w:val="Internet link"/>
     <w:basedOn w:val="Domylnaczcionkaakapitu"/>
     <w:rsid w:val="00C639E6"/>
@@ -2880,7 +3164,7 @@
       <w:lang w:eastAsia="pl-PL" w:bidi="ar-SA"/>
     </w:rPr>
   </w:style>
-  <w:style w:type="character" w:customStyle="1" w:styleId="TekstprzypisudolnegoZnak">
+  <w:style w:type="character" w:styleId="TekstprzypisudolnegoZnak" w:customStyle="1">
     <w:name w:val="Tekst przypisu dolnego Znak"/>
     <w:basedOn w:val="Domylnaczcionkaakapitu"/>
     <w:rsid w:val="00C639E6"/>
@@ -2892,7 +3176,7 @@
       <w:lang w:eastAsia="pl-PL" w:bidi="ar-SA"/>
     </w:rPr>
   </w:style>
-  <w:style w:type="numbering" w:customStyle="1" w:styleId="WW8Num1">
+  <w:style w:type="numbering" w:styleId="WW8Num1" w:customStyle="1">
     <w:name w:val="WW8Num1"/>
     <w:basedOn w:val="Bezlisty"/>
     <w:rsid w:val="00C639E6"/>
@@ -2902,7 +3186,7 @@
       </w:numPr>
     </w:pPr>
   </w:style>
-  <w:style w:type="character" w:customStyle="1" w:styleId="Nagwek8Znak">
+  <w:style w:type="character" w:styleId="Nagwek8Znak" w:customStyle="1">
     <w:name w:val="Nagłówek 8 Znak"/>
     <w:basedOn w:val="Domylnaczcionkaakapitu"/>
     <w:link w:val="Nagwek8"/>
@@ -2913,7 +3197,7 @@
       <w:lang w:bidi="ar-SA"/>
     </w:rPr>
   </w:style>
-  <w:style w:type="paragraph" w:customStyle="1" w:styleId="Normalny1">
+  <w:style w:type="paragraph" w:styleId="Normalny1" w:customStyle="1">
     <w:name w:val="Normalny1"/>
     <w:rsid w:val="008B2B3E"/>
     <w:pPr>

</xml_diff>

<commit_message>
fix: replace old VML logo with new inline logo from updated template
New logo extracted from 'nowy wzor.docx', higher quality (27KB vs 2.5KB).
Inserted as inline image (2.4cm) instead of VML absolute-position shape.

Co-Authored-By: Claude Opus 4.6 (1M context) <noreply@anthropic.com>
</commit_message>
<xml_diff>
--- a/mbr/templates/cert_master_template.docx
+++ b/mbr/templates/cert_master_template.docx
@@ -2256,41 +2256,39 @@
           <w:vAlign w:val="center"/>
         </w:tcPr>
         <w:p>
-          <w:pPr>
-            <w:pStyle w:val="Nagwek8"/>
-            <w:snapToGrid w:val="0"/>
-          </w:pPr>
           <w:r>
-            <w:rPr>
-              <w:sz w:val="20"/>
-              <w:lang w:val="en-GB" w:bidi="hi-IN"/>
-            </w:rPr>
-            <w:object w:dxaOrig="1440" w:dyaOrig="1440" w14:anchorId="33187B47">
-              <v:shapetype id="_x0000_t75" coordsize="21600,21600" filled="f" stroked="f" o:spt="75" o:preferrelative="t" path="m@4@5l@4@11@9@11@9@5xe">
-                <v:stroke joinstyle="miter"/>
-                <v:formulas>
-                  <v:f eqn="if lineDrawn pixelLineWidth 0"/>
-                  <v:f eqn="sum @0 1 0"/>
-                  <v:f eqn="sum 0 0 @1"/>
-                  <v:f eqn="prod @2 1 2"/>
-                  <v:f eqn="prod @3 21600 pixelWidth"/>
-                  <v:f eqn="prod @3 21600 pixelHeight"/>
-                  <v:f eqn="sum @0 0 1"/>
-                  <v:f eqn="prod @6 1 2"/>
-                  <v:f eqn="prod @7 21600 pixelWidth"/>
-                  <v:f eqn="sum @8 21600 0"/>
-                  <v:f eqn="prod @7 21600 pixelHeight"/>
-                  <v:f eqn="sum @10 21600 0"/>
-                </v:formulas>
-                <v:path gradientshapeok="t" o:connecttype="rect" o:extrusionok="f"/>
-                <o:lock v:ext="edit" aspectratio="t"/>
-              </v:shapetype>
-              <v:shape id="Obiekt1" style="position:absolute;left:0;text-align:left;margin-left:15.3pt;margin-top:2pt;width:50.25pt;height:43.1pt;z-index:251660288;visibility:visible;mso-position-horizontal-relative:margin;mso-position-vertical-relative:margin" o:spid="_x0000_s1025" type="#_x0000_t75">
-                <v:imagedata o:title="" r:id="rId1"/>
-                <w10:wrap type="square" anchorx="margin" anchory="margin"/>
-              </v:shape>
-              <o:OLEObject Type="Embed" ProgID="PBrush" ShapeID="Obiekt1" DrawAspect="Content" ObjectID="_1834304553" r:id="rId2"/>
-            </w:object>
+            <w:drawing>
+              <wp:inline xmlns:a="http://schemas.openxmlformats.org/drawingml/2006/main" xmlns:pic="http://schemas.openxmlformats.org/drawingml/2006/picture">
+                <wp:extent cx="864000" cy="843428"/>
+                <wp:docPr id="1" name="Picture 1"/>
+                <wp:cNvGraphicFramePr>
+                  <a:graphicFrameLocks noChangeAspect="1"/>
+                </wp:cNvGraphicFramePr>
+                <a:graphic>
+                  <a:graphicData uri="http://schemas.openxmlformats.org/drawingml/2006/picture">
+                    <pic:pic>
+                      <pic:nvPicPr>
+                        <pic:cNvPr id="0" name="chemco_logo_new.png"/>
+                        <pic:cNvPicPr/>
+                      </pic:nvPicPr>
+                      <pic:blipFill>
+                        <a:blip r:embed="rId3"/>
+                        <a:stretch>
+                          <a:fillRect/>
+                        </a:stretch>
+                      </pic:blipFill>
+                      <pic:spPr>
+                        <a:xfrm>
+                          <a:off x="0" y="0"/>
+                          <a:ext cx="864000" cy="843428"/>
+                        </a:xfrm>
+                        <a:prstGeom prst="rect"/>
+                      </pic:spPr>
+                    </pic:pic>
+                  </a:graphicData>
+                </a:graphic>
+              </wp:inline>
+            </w:drawing>
           </w:r>
         </w:p>
       </w:tc>

</xml_diff>

<commit_message>
fix: center logo in header cell + widen logo column
Logo cell widened 1560→2400 dxa, centered horizontally and vertically.

Co-Authored-By: Claude Opus 4.6 (1M context) <noreply@anthropic.com>
</commit_message>
<xml_diff>
--- a/mbr/templates/cert_master_template.docx
+++ b/mbr/templates/cert_master_template.docx
@@ -2232,8 +2232,8 @@
       <w:tblLook w:val="0000" w:firstRow="0" w:lastRow="0" w:firstColumn="0" w:lastColumn="0" w:noHBand="0" w:noVBand="0"/>
     </w:tblPr>
     <w:tblGrid>
-      <w:gridCol w:w="1560"/>
-      <w:gridCol w:w="8124"/>
+      <w:gridCol w:w="2400"/>
+      <w:gridCol w:w="7284"/>
     </w:tblGrid>
     <w:tr>
       <w:trPr>
@@ -2241,7 +2241,7 @@
       </w:trPr>
       <w:tc>
         <w:tcPr>
-          <w:tcW w:w="1560" w:type="dxa"/>
+          <w:tcW w:w="2400" w:type="dxa"/>
           <w:tcBorders>
             <w:top w:val="single" w:color="0000FF" w:sz="4" w:space="0"/>
             <w:left w:val="single" w:color="0000FF" w:sz="4" w:space="0"/>
@@ -2256,6 +2256,9 @@
           <w:vAlign w:val="center"/>
         </w:tcPr>
         <w:p>
+          <w:pPr>
+            <w:jc w:val="center"/>
+          </w:pPr>
           <w:r>
             <w:drawing>
               <wp:inline xmlns:a="http://schemas.openxmlformats.org/drawingml/2006/main" xmlns:pic="http://schemas.openxmlformats.org/drawingml/2006/picture">
@@ -2294,7 +2297,7 @@
       </w:tc>
       <w:tc>
         <w:tcPr>
-          <w:tcW w:w="8124" w:type="dxa"/>
+          <w:tcW w:w="7284" w:type="dxa"/>
           <w:tcBorders>
             <w:top w:val="single" w:color="0000FF" w:sz="4" w:space="0"/>
             <w:left w:val="single" w:color="0000FF" w:sz="4" w:space="0"/>

</xml_diff>

<commit_message>
fix: remove extra empty paragraphs from cert DOCX template table rows
Cells requirement, method, result had 2 paragraphs each (1 with content,
1 empty) causing extra blank lines in generated certificates.

Co-Authored-By: Claude Opus 4.6 (1M context) <noreply@anthropic.com>
</commit_message>
<xml_diff>
--- a/mbr/templates/cert_master_template.docx
+++ b/mbr/templates/cert_master_template.docx
@@ -1170,19 +1170,6 @@
               <w:t>}}</w:t>
             </w:r>
           </w:p>
-          <w:p>
-            <w:pPr>
-              <w:pStyle w:val="Standard"/>
-              <w:snapToGrid w:val="0"/>
-              <w:jc w:val="center"/>
-              <w:rPr>
-                <w:rFonts w:ascii="Bookman Old Style" w:hAnsi="Bookman Old Style"/>
-                <w:sz w:val="22"/>
-                <w:szCs w:val="22"/>
-                <w:lang w:val="en-GB"/>
-              </w:rPr>
-            </w:pPr>
-          </w:p>
         </w:tc>
         <w:tc>
           <w:tcPr>
@@ -1235,19 +1222,6 @@
               </w:rPr>
               <w:t>}}</w:t>
             </w:r>
-          </w:p>
-          <w:p>
-            <w:pPr>
-              <w:pStyle w:val="Standard"/>
-              <w:snapToGrid w:val="0"/>
-              <w:jc w:val="center"/>
-              <w:rPr>
-                <w:rFonts w:ascii="Bookman Old Style" w:hAnsi="Bookman Old Style"/>
-                <w:sz w:val="22"/>
-                <w:szCs w:val="22"/>
-                <w:lang w:val="en-GB"/>
-              </w:rPr>
-            </w:pPr>
           </w:p>
         </w:tc>
         <w:tc>
@@ -1303,19 +1277,6 @@
               </w:rPr>
               <w:t>}}</w:t>
             </w:r>
-          </w:p>
-          <w:p>
-            <w:pPr>
-              <w:pStyle w:val="Standard"/>
-              <w:snapToGrid w:val="0"/>
-              <w:jc w:val="center"/>
-              <w:rPr>
-                <w:rFonts w:ascii="Bookman Old Style" w:hAnsi="Bookman Old Style"/>
-                <w:sz w:val="22"/>
-                <w:szCs w:val="22"/>
-                <w:lang w:val="en-GB"/>
-              </w:rPr>
-            </w:pPr>
           </w:p>
         </w:tc>
       </w:tr>

</xml_diff>

<commit_message>
fix: remove empty paragraph from name_pl/name_en cell in cert template
All 4 table cells now have exactly 1 paragraph — no extra blank lines.

Co-Authored-By: Claude Opus 4.6 (1M context) <noreply@anthropic.com>
</commit_message>
<xml_diff>
--- a/mbr/templates/cert_master_template.docx
+++ b/mbr/templates/cert_master_template.docx
@@ -1102,19 +1102,6 @@
               </w:rPr>
               <w:t>}}</w:t>
             </w:r>
-          </w:p>
-          <w:p>
-            <w:pPr>
-              <w:pStyle w:val="Standard"/>
-              <w:snapToGrid w:val="0"/>
-              <w:jc w:val="center"/>
-              <w:rPr>
-                <w:rFonts w:ascii="Bookman Old Style" w:hAnsi="Bookman Old Style"/>
-                <w:sz w:val="22"/>
-                <w:szCs w:val="22"/>
-                <w:lang w:val="en-GB"/>
-              </w:rPr>
-            </w:pPr>
           </w:p>
         </w:tc>
         <w:tc>

</xml_diff>

<commit_message>
fix: cert table cell padding + date format dd.mm.YYYY
- Added 30 twip top/bottom padding to table row cells for spacing
- Changed date format from YYYY-MM-DD to dd.mm.YYYY (both server + COA)

Co-Authored-By: Claude Opus 4.6 (1M context) <noreply@anthropic.com>
</commit_message>
<xml_diff>
--- a/mbr/templates/cert_master_template.docx
+++ b/mbr/templates/cert_master_template.docx
@@ -1032,9 +1032,9 @@
               <w:bottom w:val="single" w:color="000000" w:themeColor="text1" w:sz="4" w:space="0"/>
             </w:tcBorders>
             <w:tcMar>
-              <w:top w:w="0" w:type="dxa"/>
+              <w:top w:w="30" w:type="dxa"/>
               <w:left w:w="70" w:type="dxa"/>
-              <w:bottom w:w="0" w:type="dxa"/>
+              <w:bottom w:w="30" w:type="dxa"/>
               <w:right w:w="70" w:type="dxa"/>
             </w:tcMar>
             <w:vAlign w:val="center"/>
@@ -1113,9 +1113,9 @@
               <w:bottom w:val="single" w:color="000000" w:themeColor="text1" w:sz="4" w:space="0"/>
             </w:tcBorders>
             <w:tcMar>
-              <w:top w:w="0" w:type="dxa"/>
+              <w:top w:w="30" w:type="dxa"/>
               <w:left w:w="70" w:type="dxa"/>
-              <w:bottom w:w="0" w:type="dxa"/>
+              <w:bottom w:w="30" w:type="dxa"/>
               <w:right w:w="70" w:type="dxa"/>
             </w:tcMar>
             <w:vAlign w:val="center"/>
@@ -1167,9 +1167,9 @@
               <w:bottom w:val="single" w:color="000000" w:themeColor="text1" w:sz="4" w:space="0"/>
             </w:tcBorders>
             <w:tcMar>
-              <w:top w:w="0" w:type="dxa"/>
+              <w:top w:w="30" w:type="dxa"/>
               <w:left w:w="70" w:type="dxa"/>
-              <w:bottom w:w="0" w:type="dxa"/>
+              <w:bottom w:w="30" w:type="dxa"/>
               <w:right w:w="70" w:type="dxa"/>
             </w:tcMar>
             <w:vAlign w:val="center"/>
@@ -1221,9 +1221,9 @@
               <w:right w:val="single" w:color="000000" w:themeColor="text1" w:sz="4" w:space="0"/>
             </w:tcBorders>
             <w:tcMar>
-              <w:top w:w="0" w:type="dxa"/>
+              <w:top w:w="30" w:type="dxa"/>
               <w:left w:w="70" w:type="dxa"/>
-              <w:bottom w:w="0" w:type="dxa"/>
+              <w:bottom w:w="30" w:type="dxa"/>
               <w:right w:w="70" w:type="dxa"/>
             </w:tcMar>
             <w:vAlign w:val="center"/>

</xml_diff>

<commit_message>
fix: center single-line param name in cert when no English name
Split name_pl/name_en into two paragraphs. Second paragraph is
conditionally removed via {%p if row.name_en %} so single-line
content is vertically centered in the cell.

Co-Authored-By: Claude Sonnet 4.6 <noreply@anthropic.com>
</commit_message>
<xml_diff>
--- a/mbr/templates/cert_master_template.docx
+++ b/mbr/templates/cert_master_template.docx
@@ -1056,51 +1056,31 @@
                 <w:rFonts w:ascii="Bookman Old Style" w:hAnsi="Bookman Old Style"/>
                 <w:sz w:val="22"/>
                 <w:szCs w:val="22"/>
-              </w:rPr>
-              <w:t>{{</w:t>
-            </w:r>
-            <w:r>
-              <w:rPr>
-                <w:rFonts w:ascii="Bookman Old Style" w:hAnsi="Bookman Old Style"/>
-                <w:sz w:val="22"/>
-                <w:szCs w:val="22"/>
-              </w:rPr>
-              <w:t>row.name_pl</w:t>
-            </w:r>
-            <w:r>
-              <w:rPr>
-                <w:rFonts w:ascii="Bookman Old Style" w:hAnsi="Bookman Old Style"/>
-                <w:sz w:val="22"/>
-                <w:szCs w:val="22"/>
-              </w:rPr>
-              <w:t>}}</w:t>
-            </w:r>
-            <w:r>
-              <w:br/>
-            </w:r>
-            <w:r>
-              <w:rPr>
-                <w:rFonts w:ascii="Bookman Old Style" w:hAnsi="Bookman Old Style"/>
-                <w:sz w:val="22"/>
-                <w:szCs w:val="22"/>
-              </w:rPr>
-              <w:t>{{</w:t>
-            </w:r>
-            <w:r>
-              <w:rPr>
-                <w:rFonts w:ascii="Bookman Old Style" w:hAnsi="Bookman Old Style"/>
-                <w:sz w:val="22"/>
-                <w:szCs w:val="22"/>
-              </w:rPr>
-              <w:t>row.name_en</w:t>
-            </w:r>
-            <w:r>
-              <w:rPr>
-                <w:rFonts w:ascii="Bookman Old Style" w:hAnsi="Bookman Old Style"/>
-                <w:sz w:val="22"/>
-                <w:szCs w:val="22"/>
-              </w:rPr>
-              <w:t>}}</w:t>
+                <w:lang w:val="en-GB"/>
+              </w:rPr>
+              <w:t>{{ row.name_pl }}</w:t>
+            </w:r>
+          </w:p>
+          <w:p>
+            <w:pPr>
+              <w:pStyle w:val="Standard"/>
+              <w:snapToGrid w:val="0"/>
+              <w:jc w:val="center"/>
+              <w:rPr>
+                <w:rFonts w:ascii="Bookman Old Style" w:hAnsi="Bookman Old Style"/>
+                <w:sz w:val="22"/>
+                <w:szCs w:val="22"/>
+                <w:lang w:val="en-GB"/>
+              </w:rPr>
+            </w:pPr>
+            <w:r>
+              <w:rPr>
+                <w:rFonts w:ascii="Bookman Old Style" w:hAnsi="Bookman Old Style"/>
+                <w:sz w:val="22"/>
+                <w:szCs w:val="22"/>
+                <w:lang w:val="en-GB"/>
+              </w:rPr>
+              <w:t>{%p if row.name_en %}{{ row.name_en }}{%p endif %}</w:t>
             </w:r>
           </w:p>
         </w:tc>

</xml_diff>

<commit_message>
fix: correct {%p if %} paragraph structure for conditional name_en
Use 4-paragraph structure: name_pl / {%p if %} marker / name_en / {%p endif %}
marker. Removes name_en paragraph entirely when empty, allowing
vertical centering of single-line Polish-only names.

Co-Authored-By: Claude Sonnet 4.6 <noreply@anthropic.com>
</commit_message>
<xml_diff>
--- a/mbr/templates/cert_master_template.docx
+++ b/mbr/templates/cert_master_template.docx
@@ -1058,7 +1058,7 @@
                 <w:szCs w:val="22"/>
                 <w:lang w:val="en-GB"/>
               </w:rPr>
-              <w:t>{{ row.name_pl }}</w:t>
+              <w:t xml:space="preserve">{{ row.name_pl }}</w:t>
             </w:r>
           </w:p>
           <w:p>
@@ -1080,7 +1080,51 @@
                 <w:szCs w:val="22"/>
                 <w:lang w:val="en-GB"/>
               </w:rPr>
-              <w:t>{%p if row.name_en %}{{ row.name_en }}{%p endif %}</w:t>
+              <w:t xml:space="preserve">{%p if row.name_en %}</w:t>
+            </w:r>
+          </w:p>
+          <w:p>
+            <w:pPr>
+              <w:pStyle w:val="Standard"/>
+              <w:snapToGrid w:val="0"/>
+              <w:jc w:val="center"/>
+              <w:rPr>
+                <w:rFonts w:ascii="Bookman Old Style" w:hAnsi="Bookman Old Style"/>
+                <w:sz w:val="22"/>
+                <w:szCs w:val="22"/>
+                <w:lang w:val="en-GB"/>
+              </w:rPr>
+            </w:pPr>
+            <w:r>
+              <w:rPr>
+                <w:rFonts w:ascii="Bookman Old Style" w:hAnsi="Bookman Old Style"/>
+                <w:sz w:val="22"/>
+                <w:szCs w:val="22"/>
+                <w:lang w:val="en-GB"/>
+              </w:rPr>
+              <w:t xml:space="preserve">{{ row.name_en }}</w:t>
+            </w:r>
+          </w:p>
+          <w:p>
+            <w:pPr>
+              <w:pStyle w:val="Standard"/>
+              <w:snapToGrid w:val="0"/>
+              <w:jc w:val="center"/>
+              <w:rPr>
+                <w:rFonts w:ascii="Bookman Old Style" w:hAnsi="Bookman Old Style"/>
+                <w:sz w:val="22"/>
+                <w:szCs w:val="22"/>
+                <w:lang w:val="en-GB"/>
+              </w:rPr>
+            </w:pPr>
+            <w:r>
+              <w:rPr>
+                <w:rFonts w:ascii="Bookman Old Style" w:hAnsi="Bookman Old Style"/>
+                <w:sz w:val="22"/>
+                <w:szCs w:val="22"/>
+                <w:lang w:val="en-GB"/>
+              </w:rPr>
+              <w:t xml:space="preserve">{%p endif %}</w:t>
             </w:r>
           </w:p>
         </w:tc>

</xml_diff>

<commit_message>
feat: super/subscript in cert parameter names (n_{D}^{20})
LaTeX-style markup in name_pl/name_en fields: ^{...} renders as
superscript, _{...} as subscript. Generator wraps names in docxtpl
RichText with vertAlign runs; DOCX template tags switched to {{r }}.
Admin editor shows live HTML preview under each name input with a
syntax hint above the params table.

Co-Authored-By: Claude Opus 4.6 (1M context) <noreply@anthropic.com>
</commit_message>
<xml_diff>
--- a/mbr/templates/cert_master_template.docx
+++ b/mbr/templates/cert_master_template.docx
@@ -1058,7 +1058,7 @@
                 <w:szCs w:val="22"/>
                 <w:lang w:val="en-GB"/>
               </w:rPr>
-              <w:t xml:space="preserve">{{ row.name_pl }}</w:t>
+              <w:t xml:space="preserve">{{r row.name_pl }}</w:t>
             </w:r>
           </w:p>
           <w:p>
@@ -1102,7 +1102,7 @@
                 <w:szCs w:val="22"/>
                 <w:lang w:val="en-GB"/>
               </w:rPr>
-              <w:t xml:space="preserve">{{ row.name_en }}</w:t>
+              <w:t xml:space="preserve">{{r row.name_en }}</w:t>
             </w:r>
           </w:p>
           <w:p>

</xml_diff>

<commit_message>
fix: cert template — TeX Gyre Bonum font, fix RichText size (half-points not EMU)
- Replace Bookman Old Style with TeX Gyre Bonum in cert_master_template.docx
- Fix _md_to_richtext: size=22 (11pt in half-points), was 139700 (EMU)
- name_en=None instead of empty RichText for proper vertical centering

Co-Authored-By: Claude Opus 4.6 (1M context) <noreply@anthropic.com>
</commit_message>
<xml_diff>
--- a/mbr/templates/cert_master_template.docx
+++ b/mbr/templates/cert_master_template.docx
@@ -5,7 +5,7 @@
     <w:p xmlns:wp14="http://schemas.microsoft.com/office/word/2010/wordml" wp14:textId="77777777">
       <w:r>
         <w:rPr>
-          <w:rFonts w:ascii="Bookman Old Style" w:hAnsi="Bookman Old Style"/>
+          <w:rFonts w:ascii="TeX Gyre Bonum" w:hAnsi="TeX Gyre Bonum"/>
           <w:sz w:val="2"/>
         </w:rPr>
         <w:t xml:space="preserve">{%p if avon_code %}</w:t>
@@ -14,7 +14,7 @@
     <w:p xmlns:wp14="http://schemas.microsoft.com/office/word/2010/wordml" wp14:textId="77777777">
       <w:r>
         <w:rPr>
-          <w:rFonts w:ascii="Bookman Old Style" w:hAnsi="Bookman Old Style"/>
+          <w:rFonts w:ascii="TeX Gyre Bonum" w:hAnsi="TeX Gyre Bonum"/>
           <w:sz w:val="22"/>
         </w:rPr>
         <w:t xml:space="preserve">Kod AVON/AVON code: {{avon_code}}</w:t>
@@ -23,7 +23,7 @@
     <w:p xmlns:wp14="http://schemas.microsoft.com/office/word/2010/wordml" wp14:textId="77777777">
       <w:r>
         <w:rPr>
-          <w:rFonts w:ascii="Bookman Old Style" w:hAnsi="Bookman Old Style"/>
+          <w:rFonts w:ascii="TeX Gyre Bonum" w:hAnsi="TeX Gyre Bonum"/>
           <w:sz w:val="22"/>
         </w:rPr>
         <w:t xml:space="preserve">Nazwa AVON/AVON name: {{avon_name}}</w:t>
@@ -32,7 +32,7 @@
     <w:p xmlns:wp14="http://schemas.microsoft.com/office/word/2010/wordml" wp14:textId="77777777">
       <w:r>
         <w:rPr>
-          <w:rFonts w:ascii="Bookman Old Style" w:hAnsi="Bookman Old Style"/>
+          <w:rFonts w:ascii="TeX Gyre Bonum" w:hAnsi="TeX Gyre Bonum"/>
           <w:sz w:val="2"/>
         </w:rPr>
         <w:t xml:space="preserve">{%p endif %}</w:t>
@@ -46,14 +46,14 @@
         </w:tabs>
         <w:spacing w:line="360" w:lineRule="auto"/>
         <w:rPr>
-          <w:rFonts w:ascii="Bookman Old Style" w:hAnsi="Bookman Old Style"/>
+          <w:rFonts w:ascii="TeX Gyre Bonum" w:hAnsi="TeX Gyre Bonum"/>
           <w:sz w:val="22"/>
           <w:szCs w:val="22"/>
         </w:rPr>
       </w:pPr>
       <w:r>
         <w:rPr>
-          <w:rFonts w:ascii="Bookman Old Style" w:hAnsi="Bookman Old Style"/>
+          <w:rFonts w:ascii="TeX Gyre Bonum" w:hAnsi="TeX Gyre Bonum"/>
           <w:sz w:val="22"/>
           <w:szCs w:val="22"/>
         </w:rPr>
@@ -61,63 +61,63 @@
       </w:r>
       <w:r>
         <w:rPr>
-          <w:rFonts w:ascii="Bookman Old Style" w:hAnsi="Bookman Old Style"/>
-          <w:sz w:val="22"/>
-          <w:szCs w:val="22"/>
-        </w:rPr>
-      </w:r>
-      <w:r>
-        <w:rPr>
-          <w:rFonts w:ascii="Bookman Old Style" w:hAnsi="Bookman Old Style"/>
-          <w:sz w:val="22"/>
-          <w:szCs w:val="22"/>
-        </w:rPr>
-      </w:r>
-      <w:r>
-        <w:rPr>
-          <w:rFonts w:ascii="Bookman Old Style" w:hAnsi="Bookman Old Style"/>
-          <w:sz w:val="22"/>
-          <w:szCs w:val="22"/>
-        </w:rPr>
-      </w:r>
-      <w:r>
-        <w:rPr>
-          <w:rFonts w:ascii="Bookman Old Style" w:hAnsi="Bookman Old Style"/>
-          <w:sz w:val="22"/>
-          <w:szCs w:val="22"/>
-        </w:rPr>
-      </w:r>
-      <w:r>
-        <w:rPr>
-          <w:rFonts w:ascii="Bookman Old Style" w:hAnsi="Bookman Old Style"/>
-          <w:sz w:val="22"/>
-          <w:szCs w:val="22"/>
-        </w:rPr>
-      </w:r>
-      <w:r>
-        <w:rPr>
-          <w:rFonts w:ascii="Bookman Old Style" w:hAnsi="Bookman Old Style"/>
-          <w:sz w:val="22"/>
-          <w:szCs w:val="22"/>
-        </w:rPr>
-      </w:r>
-      <w:r>
-        <w:rPr>
-          <w:rFonts w:ascii="Bookman Old Style" w:hAnsi="Bookman Old Style"/>
-          <w:sz w:val="22"/>
-          <w:szCs w:val="22"/>
-        </w:rPr>
-      </w:r>
-      <w:r>
-        <w:rPr>
-          <w:rFonts w:ascii="Bookman Old Style" w:hAnsi="Bookman Old Style"/>
-          <w:sz w:val="22"/>
-          <w:szCs w:val="22"/>
-        </w:rPr>
-      </w:r>
-      <w:r>
-        <w:rPr>
-          <w:rFonts w:ascii="Bookman Old Style" w:hAnsi="Bookman Old Style"/>
+          <w:rFonts w:ascii="TeX Gyre Bonum" w:hAnsi="TeX Gyre Bonum"/>
+          <w:sz w:val="22"/>
+          <w:szCs w:val="22"/>
+        </w:rPr>
+      </w:r>
+      <w:r>
+        <w:rPr>
+          <w:rFonts w:ascii="TeX Gyre Bonum" w:hAnsi="TeX Gyre Bonum"/>
+          <w:sz w:val="22"/>
+          <w:szCs w:val="22"/>
+        </w:rPr>
+      </w:r>
+      <w:r>
+        <w:rPr>
+          <w:rFonts w:ascii="TeX Gyre Bonum" w:hAnsi="TeX Gyre Bonum"/>
+          <w:sz w:val="22"/>
+          <w:szCs w:val="22"/>
+        </w:rPr>
+      </w:r>
+      <w:r>
+        <w:rPr>
+          <w:rFonts w:ascii="TeX Gyre Bonum" w:hAnsi="TeX Gyre Bonum"/>
+          <w:sz w:val="22"/>
+          <w:szCs w:val="22"/>
+        </w:rPr>
+      </w:r>
+      <w:r>
+        <w:rPr>
+          <w:rFonts w:ascii="TeX Gyre Bonum" w:hAnsi="TeX Gyre Bonum"/>
+          <w:sz w:val="22"/>
+          <w:szCs w:val="22"/>
+        </w:rPr>
+      </w:r>
+      <w:r>
+        <w:rPr>
+          <w:rFonts w:ascii="TeX Gyre Bonum" w:hAnsi="TeX Gyre Bonum"/>
+          <w:sz w:val="22"/>
+          <w:szCs w:val="22"/>
+        </w:rPr>
+      </w:r>
+      <w:r>
+        <w:rPr>
+          <w:rFonts w:ascii="TeX Gyre Bonum" w:hAnsi="TeX Gyre Bonum"/>
+          <w:sz w:val="22"/>
+          <w:szCs w:val="22"/>
+        </w:rPr>
+      </w:r>
+      <w:r>
+        <w:rPr>
+          <w:rFonts w:ascii="TeX Gyre Bonum" w:hAnsi="TeX Gyre Bonum"/>
+          <w:sz w:val="22"/>
+          <w:szCs w:val="22"/>
+        </w:rPr>
+      </w:r>
+      <w:r>
+        <w:rPr>
+          <w:rFonts w:ascii="TeX Gyre Bonum" w:hAnsi="TeX Gyre Bonum"/>
           <w:sz w:val="22"/>
           <w:szCs w:val="22"/>
         </w:rPr>
@@ -131,46 +131,46 @@
         </w:tabs>
         <w:spacing w:line="360" w:lineRule="auto"/>
         <w:rPr>
-          <w:rFonts w:ascii="Bookman Old Style" w:hAnsi="Bookman Old Style"/>
+          <w:rFonts w:ascii="TeX Gyre Bonum" w:hAnsi="TeX Gyre Bonum"/>
           <w:sz w:val="22"/>
         </w:rPr>
       </w:pPr>
       <w:r>
         <w:rPr>
-          <w:rFonts w:ascii="Bookman Old Style" w:hAnsi="Bookman Old Style"/>
+          <w:rFonts w:ascii="TeX Gyre Bonum" w:hAnsi="TeX Gyre Bonum"/>
           <w:sz w:val="22"/>
         </w:rPr>
         <w:t>Partia/Batch:</w:t>
       </w:r>
       <w:r>
         <w:rPr>
-          <w:rFonts w:ascii="Bookman Old Style" w:hAnsi="Bookman Old Style"/>
+          <w:rFonts w:ascii="TeX Gyre Bonum" w:hAnsi="TeX Gyre Bonum"/>
           <w:sz w:val="22"/>
         </w:rPr>
         <w:tab/>
       </w:r>
       <w:r>
         <w:rPr>
-          <w:rFonts w:ascii="Bookman Old Style" w:hAnsi="Bookman Old Style"/>
+          <w:rFonts w:ascii="TeX Gyre Bonum" w:hAnsi="TeX Gyre Bonum"/>
           <w:sz w:val="22"/>
         </w:rPr>
         <w:t>{{nr_partii}}</w:t>
       </w:r>
       <w:r>
         <w:rPr>
-          <w:rFonts w:ascii="Bookman Old Style" w:hAnsi="Bookman Old Style"/>
-          <w:sz w:val="22"/>
-        </w:rPr>
-      </w:r>
-      <w:r>
-        <w:rPr>
-          <w:rFonts w:ascii="Bookman Old Style" w:hAnsi="Bookman Old Style"/>
-          <w:sz w:val="22"/>
-        </w:rPr>
-      </w:r>
-      <w:r>
-        <w:rPr>
-          <w:rFonts w:ascii="Bookman Old Style" w:hAnsi="Bookman Old Style"/>
+          <w:rFonts w:ascii="TeX Gyre Bonum" w:hAnsi="TeX Gyre Bonum"/>
+          <w:sz w:val="22"/>
+        </w:rPr>
+      </w:r>
+      <w:r>
+        <w:rPr>
+          <w:rFonts w:ascii="TeX Gyre Bonum" w:hAnsi="TeX Gyre Bonum"/>
+          <w:sz w:val="22"/>
+        </w:rPr>
+      </w:r>
+      <w:r>
+        <w:rPr>
+          <w:rFonts w:ascii="TeX Gyre Bonum" w:hAnsi="TeX Gyre Bonum"/>
           <w:sz w:val="22"/>
         </w:rPr>
       </w:r>
@@ -185,40 +185,40 @@
       </w:pPr>
       <w:r>
         <w:rPr>
-          <w:rFonts w:ascii="Bookman Old Style" w:hAnsi="Bookman Old Style"/>
+          <w:rFonts w:ascii="TeX Gyre Bonum" w:hAnsi="TeX Gyre Bonum"/>
           <w:sz w:val="22"/>
         </w:rPr>
         <w:t>Data produkcji/Production date:</w:t>
       </w:r>
       <w:r>
         <w:rPr>
-          <w:rFonts w:ascii="Bookman Old Style" w:hAnsi="Bookman Old Style"/>
+          <w:rFonts w:ascii="TeX Gyre Bonum" w:hAnsi="TeX Gyre Bonum"/>
           <w:sz w:val="22"/>
         </w:rPr>
         <w:tab/>
       </w:r>
       <w:r>
         <w:rPr>
-          <w:rFonts w:ascii="Bookman Old Style" w:hAnsi="Bookman Old Style"/>
+          <w:rFonts w:ascii="TeX Gyre Bonum" w:hAnsi="TeX Gyre Bonum"/>
           <w:sz w:val="22"/>
         </w:rPr>
         <w:t>{{dt_produkcji}}</w:t>
       </w:r>
       <w:r>
         <w:rPr>
-          <w:rFonts w:ascii="Bookman Old Style" w:hAnsi="Bookman Old Style"/>
-          <w:sz w:val="22"/>
-        </w:rPr>
-      </w:r>
-      <w:r>
-        <w:rPr>
-          <w:rFonts w:ascii="Bookman Old Style" w:hAnsi="Bookman Old Style"/>
-          <w:sz w:val="22"/>
-        </w:rPr>
-      </w:r>
-      <w:r>
-        <w:rPr>
-          <w:rFonts w:ascii="Bookman Old Style" w:hAnsi="Bookman Old Style"/>
+          <w:rFonts w:ascii="TeX Gyre Bonum" w:hAnsi="TeX Gyre Bonum"/>
+          <w:sz w:val="22"/>
+        </w:rPr>
+      </w:r>
+      <w:r>
+        <w:rPr>
+          <w:rFonts w:ascii="TeX Gyre Bonum" w:hAnsi="TeX Gyre Bonum"/>
+          <w:sz w:val="22"/>
+        </w:rPr>
+      </w:r>
+      <w:r>
+        <w:rPr>
+          <w:rFonts w:ascii="TeX Gyre Bonum" w:hAnsi="TeX Gyre Bonum"/>
           <w:sz w:val="22"/>
         </w:rPr>
       </w:r>
@@ -231,46 +231,46 @@
         </w:tabs>
         <w:spacing w:line="360" w:lineRule="auto"/>
         <w:rPr>
-          <w:rFonts w:ascii="Bookman Old Style" w:hAnsi="Bookman Old Style"/>
+          <w:rFonts w:ascii="TeX Gyre Bonum" w:hAnsi="TeX Gyre Bonum"/>
           <w:sz w:val="22"/>
         </w:rPr>
       </w:pPr>
       <w:r>
         <w:rPr>
-          <w:rFonts w:ascii="Bookman Old Style" w:hAnsi="Bookman Old Style"/>
+          <w:rFonts w:ascii="TeX Gyre Bonum" w:hAnsi="TeX Gyre Bonum"/>
           <w:sz w:val="22"/>
         </w:rPr>
         <w:t>Data ważności/Expiry date:</w:t>
       </w:r>
       <w:r>
         <w:rPr>
-          <w:rFonts w:ascii="Bookman Old Style" w:hAnsi="Bookman Old Style"/>
+          <w:rFonts w:ascii="TeX Gyre Bonum" w:hAnsi="TeX Gyre Bonum"/>
           <w:sz w:val="22"/>
         </w:rPr>
         <w:tab/>
       </w:r>
       <w:r>
         <w:rPr>
-          <w:rFonts w:ascii="Bookman Old Style" w:hAnsi="Bookman Old Style"/>
+          <w:rFonts w:ascii="TeX Gyre Bonum" w:hAnsi="TeX Gyre Bonum"/>
           <w:sz w:val="22"/>
         </w:rPr>
         <w:t>{{dt_waznosci}}</w:t>
       </w:r>
       <w:r>
         <w:rPr>
-          <w:rFonts w:ascii="Bookman Old Style" w:hAnsi="Bookman Old Style"/>
-          <w:sz w:val="22"/>
-        </w:rPr>
-      </w:r>
-      <w:r>
-        <w:rPr>
-          <w:rFonts w:ascii="Bookman Old Style" w:hAnsi="Bookman Old Style"/>
-          <w:sz w:val="22"/>
-        </w:rPr>
-      </w:r>
-      <w:r>
-        <w:rPr>
-          <w:rFonts w:ascii="Bookman Old Style" w:hAnsi="Bookman Old Style"/>
+          <w:rFonts w:ascii="TeX Gyre Bonum" w:hAnsi="TeX Gyre Bonum"/>
+          <w:sz w:val="22"/>
+        </w:rPr>
+      </w:r>
+      <w:r>
+        <w:rPr>
+          <w:rFonts w:ascii="TeX Gyre Bonum" w:hAnsi="TeX Gyre Bonum"/>
+          <w:sz w:val="22"/>
+        </w:rPr>
+      </w:r>
+      <w:r>
+        <w:rPr>
+          <w:rFonts w:ascii="TeX Gyre Bonum" w:hAnsi="TeX Gyre Bonum"/>
           <w:sz w:val="22"/>
         </w:rPr>
       </w:r>
@@ -291,34 +291,34 @@
         </w:tabs>
         <w:spacing w:line="360" w:lineRule="auto"/>
         <w:rPr>
-          <w:rFonts w:ascii="Bookman Old Style" w:hAnsi="Bookman Old Style"/>
+          <w:rFonts w:ascii="TeX Gyre Bonum" w:hAnsi="TeX Gyre Bonum"/>
           <w:sz w:val="22"/>
         </w:rPr>
       </w:pPr>
       <w:r>
         <w:rPr>
-          <w:rFonts w:ascii="Bookman Old Style" w:hAnsi="Bookman Old Style"/>
+          <w:rFonts w:ascii="TeX Gyre Bonum" w:hAnsi="TeX Gyre Bonum"/>
           <w:sz w:val="22"/>
         </w:rPr>
         <w:t>Numer zamówienia/Order No.:</w:t>
       </w:r>
       <w:r>
         <w:rPr>
-          <w:rFonts w:ascii="Bookman Old Style" w:hAnsi="Bookman Old Style"/>
+          <w:rFonts w:ascii="TeX Gyre Bonum" w:hAnsi="TeX Gyre Bonum"/>
           <w:sz w:val="22"/>
         </w:rPr>
         <w:tab/>
       </w:r>
       <w:r>
         <w:rPr>
-          <w:rFonts w:ascii="Bookman Old Style" w:hAnsi="Bookman Old Style"/>
+          <w:rFonts w:ascii="TeX Gyre Bonum" w:hAnsi="TeX Gyre Bonum"/>
           <w:sz w:val="22"/>
         </w:rPr>
         <w:t>{{order_number}}</w:t>
       </w:r>
       <w:r>
         <w:rPr>
-          <w:rFonts w:ascii="Bookman Old Style" w:hAnsi="Bookman Old Style"/>
+          <w:rFonts w:ascii="TeX Gyre Bonum" w:hAnsi="TeX Gyre Bonum"/>
           <w:sz w:val="22"/>
         </w:rPr>
       </w:r>
@@ -347,40 +347,40 @@
         </w:tabs>
         <w:spacing w:line="360" w:lineRule="auto"/>
         <w:rPr>
-          <w:rFonts w:ascii="Bookman Old Style" w:hAnsi="Bookman Old Style"/>
+          <w:rFonts w:ascii="TeX Gyre Bonum" w:hAnsi="TeX Gyre Bonum"/>
           <w:sz w:val="22"/>
         </w:rPr>
       </w:pPr>
       <w:r>
         <w:rPr>
-          <w:rFonts w:ascii="Bookman Old Style" w:hAnsi="Bookman Old Style"/>
+          <w:rFonts w:ascii="TeX Gyre Bonum" w:hAnsi="TeX Gyre Bonum"/>
           <w:sz w:val="22"/>
         </w:rPr>
         <w:t>Numer certyfikatu/Certificate No.:</w:t>
       </w:r>
       <w:r>
         <w:rPr>
-          <w:rFonts w:ascii="Bookman Old Style" w:hAnsi="Bookman Old Style"/>
+          <w:rFonts w:ascii="TeX Gyre Bonum" w:hAnsi="TeX Gyre Bonum"/>
           <w:sz w:val="22"/>
         </w:rPr>
         <w:tab/>
       </w:r>
       <w:r>
         <w:rPr>
-          <w:rFonts w:ascii="Bookman Old Style" w:hAnsi="Bookman Old Style"/>
+          <w:rFonts w:ascii="TeX Gyre Bonum" w:hAnsi="TeX Gyre Bonum"/>
           <w:sz w:val="22"/>
         </w:rPr>
         <w:t>{{certificate_number}} {{rspo_text}}</w:t>
       </w:r>
       <w:r>
         <w:rPr>
-          <w:rFonts w:ascii="Bookman Old Style" w:hAnsi="Bookman Old Style"/>
-          <w:sz w:val="22"/>
-        </w:rPr>
-      </w:r>
-      <w:r>
-        <w:rPr>
-          <w:rFonts w:ascii="Bookman Old Style" w:hAnsi="Bookman Old Style"/>
+          <w:rFonts w:ascii="TeX Gyre Bonum" w:hAnsi="TeX Gyre Bonum"/>
+          <w:sz w:val="22"/>
+        </w:rPr>
+      </w:r>
+      <w:r>
+        <w:rPr>
+          <w:rFonts w:ascii="TeX Gyre Bonum" w:hAnsi="TeX Gyre Bonum"/>
           <w:sz w:val="22"/>
         </w:rPr>
       </w:r>
@@ -397,7 +397,7 @@
       <w:pPr>
         <w:pStyle w:val="Footnote"/>
         <w:rPr>
-          <w:rFonts w:ascii="Bookman Old Style" w:hAnsi="Bookman Old Style"/>
+          <w:rFonts w:ascii="TeX Gyre Bonum" w:hAnsi="TeX Gyre Bonum"/>
           <w:sz w:val="22"/>
         </w:rPr>
       </w:pPr>
@@ -446,7 +446,7 @@
               <w:snapToGrid w:val="0"/>
               <w:jc w:val="center"/>
               <w:rPr>
-                <w:rFonts w:ascii="Bookman Old Style" w:hAnsi="Bookman Old Style"/>
+                <w:rFonts w:ascii="TeX Gyre Bonum" w:hAnsi="TeX Gyre Bonum"/>
                 <w:b w:val="1"/>
                 <w:bCs w:val="1"/>
                 <w:sz w:val="22"/>
@@ -456,7 +456,7 @@
             </w:pPr>
             <w:r>
               <w:rPr>
-                <w:rFonts w:ascii="Bookman Old Style" w:hAnsi="Bookman Old Style"/>
+                <w:rFonts w:ascii="TeX Gyre Bonum" w:hAnsi="TeX Gyre Bonum"/>
                 <w:b w:val="1"/>
                 <w:bCs w:val="1"/>
                 <w:sz w:val="22"/>
@@ -467,7 +467,7 @@
             </w:r>
             <w:r>
               <w:rPr>
-                <w:rFonts w:ascii="Bookman Old Style" w:hAnsi="Bookman Old Style"/>
+                <w:rFonts w:ascii="TeX Gyre Bonum" w:hAnsi="TeX Gyre Bonum"/>
                 <w:b w:val="1"/>
                 <w:bCs w:val="1"/>
                 <w:sz w:val="22"/>
@@ -478,7 +478,7 @@
             </w:r>
             <w:r>
               <w:rPr>
-                <w:rFonts w:ascii="Bookman Old Style" w:hAnsi="Bookman Old Style"/>
+                <w:rFonts w:ascii="TeX Gyre Bonum" w:hAnsi="TeX Gyre Bonum"/>
                 <w:b w:val="1"/>
                 <w:bCs w:val="1"/>
                 <w:sz w:val="22"/>
@@ -494,7 +494,7 @@
               <w:snapToGrid w:val="0"/>
               <w:jc w:val="center"/>
               <w:rPr>
-                <w:rFonts w:ascii="Bookman Old Style" w:hAnsi="Bookman Old Style"/>
+                <w:rFonts w:ascii="TeX Gyre Bonum" w:hAnsi="TeX Gyre Bonum"/>
                 <w:b w:val="1"/>
                 <w:bCs w:val="1"/>
                 <w:sz w:val="22"/>
@@ -504,7 +504,7 @@
             </w:pPr>
             <w:r>
               <w:rPr>
-                <w:rFonts w:ascii="Bookman Old Style" w:hAnsi="Bookman Old Style"/>
+                <w:rFonts w:ascii="TeX Gyre Bonum" w:hAnsi="TeX Gyre Bonum"/>
                 <w:b w:val="1"/>
                 <w:bCs w:val="1"/>
                 <w:sz w:val="22"/>
@@ -515,7 +515,7 @@
             </w:r>
             <w:r>
               <w:rPr>
-                <w:rFonts w:ascii="Bookman Old Style" w:hAnsi="Bookman Old Style"/>
+                <w:rFonts w:ascii="TeX Gyre Bonum" w:hAnsi="TeX Gyre Bonum"/>
                 <w:b w:val="1"/>
                 <w:bCs w:val="1"/>
                 <w:sz w:val="22"/>
@@ -549,7 +549,7 @@
               <w:ind w:right="72"/>
               <w:jc w:val="center"/>
               <w:rPr>
-                <w:rFonts w:ascii="Bookman Old Style" w:hAnsi="Bookman Old Style"/>
+                <w:rFonts w:ascii="TeX Gyre Bonum" w:hAnsi="TeX Gyre Bonum"/>
                 <w:b w:val="1"/>
                 <w:bCs w:val="1"/>
                 <w:sz w:val="22"/>
@@ -559,7 +559,7 @@
             </w:pPr>
             <w:r>
               <w:rPr>
-                <w:rFonts w:ascii="Bookman Old Style" w:hAnsi="Bookman Old Style"/>
+                <w:rFonts w:ascii="TeX Gyre Bonum" w:hAnsi="TeX Gyre Bonum"/>
                 <w:b w:val="1"/>
                 <w:bCs w:val="1"/>
                 <w:sz w:val="22"/>
@@ -576,7 +576,7 @@
               <w:ind w:right="72"/>
               <w:jc w:val="center"/>
               <w:rPr>
-                <w:rFonts w:ascii="Bookman Old Style" w:hAnsi="Bookman Old Style"/>
+                <w:rFonts w:ascii="TeX Gyre Bonum" w:hAnsi="TeX Gyre Bonum"/>
                 <w:b w:val="1"/>
                 <w:bCs w:val="1"/>
                 <w:sz w:val="22"/>
@@ -586,7 +586,7 @@
             </w:pPr>
             <w:r>
               <w:rPr>
-                <w:rFonts w:ascii="Bookman Old Style" w:hAnsi="Bookman Old Style"/>
+                <w:rFonts w:ascii="TeX Gyre Bonum" w:hAnsi="TeX Gyre Bonum"/>
                 <w:b w:val="1"/>
                 <w:bCs w:val="1"/>
                 <w:sz w:val="22"/>
@@ -597,7 +597,7 @@
             </w:r>
             <w:r>
               <w:rPr>
-                <w:rFonts w:ascii="Bookman Old Style" w:hAnsi="Bookman Old Style"/>
+                <w:rFonts w:ascii="TeX Gyre Bonum" w:hAnsi="TeX Gyre Bonum"/>
                 <w:b w:val="1"/>
                 <w:bCs w:val="1"/>
                 <w:sz w:val="22"/>
@@ -630,7 +630,7 @@
               <w:snapToGrid w:val="0"/>
               <w:jc w:val="center"/>
               <w:rPr>
-                <w:rFonts w:ascii="Bookman Old Style" w:hAnsi="Bookman Old Style"/>
+                <w:rFonts w:ascii="TeX Gyre Bonum" w:hAnsi="TeX Gyre Bonum"/>
                 <w:b w:val="1"/>
                 <w:bCs w:val="1"/>
                 <w:sz w:val="22"/>
@@ -640,7 +640,7 @@
             </w:pPr>
             <w:r>
               <w:rPr>
-                <w:rFonts w:ascii="Bookman Old Style" w:hAnsi="Bookman Old Style"/>
+                <w:rFonts w:ascii="TeX Gyre Bonum" w:hAnsi="TeX Gyre Bonum"/>
                 <w:b w:val="1"/>
                 <w:bCs w:val="1"/>
                 <w:sz w:val="22"/>
@@ -651,7 +651,7 @@
             </w:r>
             <w:r>
               <w:rPr>
-                <w:rFonts w:ascii="Bookman Old Style" w:hAnsi="Bookman Old Style"/>
+                <w:rFonts w:ascii="TeX Gyre Bonum" w:hAnsi="TeX Gyre Bonum"/>
                 <w:b w:val="1"/>
                 <w:bCs w:val="1"/>
                 <w:sz w:val="22"/>
@@ -662,7 +662,7 @@
             </w:r>
             <w:r>
               <w:rPr>
-                <w:rFonts w:ascii="Bookman Old Style" w:hAnsi="Bookman Old Style"/>
+                <w:rFonts w:ascii="TeX Gyre Bonum" w:hAnsi="TeX Gyre Bonum"/>
                 <w:b w:val="1"/>
                 <w:bCs w:val="1"/>
                 <w:sz w:val="22"/>
@@ -673,7 +673,7 @@
             </w:r>
             <w:r>
               <w:rPr>
-                <w:rFonts w:ascii="Bookman Old Style" w:hAnsi="Bookman Old Style"/>
+                <w:rFonts w:ascii="TeX Gyre Bonum" w:hAnsi="TeX Gyre Bonum"/>
                 <w:b w:val="1"/>
                 <w:bCs w:val="1"/>
                 <w:sz w:val="22"/>
@@ -689,7 +689,7 @@
               <w:snapToGrid w:val="0"/>
               <w:jc w:val="center"/>
               <w:rPr>
-                <w:rFonts w:ascii="Bookman Old Style" w:hAnsi="Bookman Old Style"/>
+                <w:rFonts w:ascii="TeX Gyre Bonum" w:hAnsi="TeX Gyre Bonum"/>
                 <w:b w:val="1"/>
                 <w:bCs w:val="1"/>
                 <w:sz w:val="22"/>
@@ -699,7 +699,7 @@
             </w:pPr>
             <w:r>
               <w:rPr>
-                <w:rFonts w:ascii="Bookman Old Style" w:hAnsi="Bookman Old Style"/>
+                <w:rFonts w:ascii="TeX Gyre Bonum" w:hAnsi="TeX Gyre Bonum"/>
                 <w:b w:val="1"/>
                 <w:bCs w:val="1"/>
                 <w:sz w:val="22"/>
@@ -710,7 +710,7 @@
             </w:r>
             <w:r>
               <w:rPr>
-                <w:rFonts w:ascii="Bookman Old Style" w:hAnsi="Bookman Old Style"/>
+                <w:rFonts w:ascii="TeX Gyre Bonum" w:hAnsi="TeX Gyre Bonum"/>
                 <w:b w:val="1"/>
                 <w:bCs w:val="1"/>
                 <w:sz w:val="22"/>
@@ -744,7 +744,7 @@
               <w:snapToGrid w:val="0"/>
               <w:jc w:val="center"/>
               <w:rPr>
-                <w:rFonts w:ascii="Bookman Old Style" w:hAnsi="Bookman Old Style"/>
+                <w:rFonts w:ascii="TeX Gyre Bonum" w:hAnsi="TeX Gyre Bonum"/>
                 <w:b w:val="1"/>
                 <w:bCs w:val="1"/>
                 <w:sz w:val="22"/>
@@ -754,7 +754,7 @@
             </w:pPr>
             <w:r>
               <w:rPr>
-                <w:rFonts w:ascii="Bookman Old Style" w:hAnsi="Bookman Old Style"/>
+                <w:rFonts w:ascii="TeX Gyre Bonum" w:hAnsi="TeX Gyre Bonum"/>
                 <w:b w:val="1"/>
                 <w:bCs w:val="1"/>
                 <w:sz w:val="22"/>
@@ -770,7 +770,7 @@
               <w:snapToGrid w:val="0"/>
               <w:jc w:val="center"/>
               <w:rPr>
-                <w:rFonts w:ascii="Bookman Old Style" w:hAnsi="Bookman Old Style"/>
+                <w:rFonts w:ascii="TeX Gyre Bonum" w:hAnsi="TeX Gyre Bonum"/>
                 <w:b w:val="1"/>
                 <w:bCs w:val="1"/>
                 <w:sz w:val="22"/>
@@ -780,7 +780,7 @@
             </w:pPr>
             <w:r>
               <w:rPr>
-                <w:rFonts w:ascii="Bookman Old Style" w:hAnsi="Bookman Old Style"/>
+                <w:rFonts w:ascii="TeX Gyre Bonum" w:hAnsi="TeX Gyre Bonum"/>
                 <w:b w:val="1"/>
                 <w:bCs w:val="1"/>
                 <w:sz w:val="22"/>
@@ -818,7 +818,7 @@
               <w:snapToGrid w:val="0"/>
               <w:jc w:val="center"/>
               <w:rPr>
-                <w:rFonts w:ascii="Bookman Old Style" w:hAnsi="Bookman Old Style"/>
+                <w:rFonts w:ascii="TeX Gyre Bonum" w:hAnsi="TeX Gyre Bonum"/>
                 <w:sz w:val="22"/>
                 <w:szCs w:val="22"/>
                 <w:lang w:val="en-GB"/>
@@ -880,7 +880,7 @@
               <w:snapToGrid w:val="0"/>
               <w:jc w:val="center"/>
               <w:rPr>
-                <w:rFonts w:ascii="Bookman Old Style" w:hAnsi="Bookman Old Style"/>
+                <w:rFonts w:ascii="TeX Gyre Bonum" w:hAnsi="TeX Gyre Bonum"/>
                 <w:sz w:val="22"/>
                 <w:szCs w:val="22"/>
                 <w:lang w:val="en-GB"/>
@@ -910,7 +910,7 @@
               <w:snapToGrid w:val="0"/>
               <w:jc w:val="center"/>
               <w:rPr>
-                <w:rFonts w:ascii="Bookman Old Style" w:hAnsi="Bookman Old Style"/>
+                <w:rFonts w:ascii="TeX Gyre Bonum" w:hAnsi="TeX Gyre Bonum"/>
                 <w:sz w:val="22"/>
                 <w:szCs w:val="22"/>
                 <w:lang w:val="en-GB"/>
@@ -923,7 +923,7 @@
               <w:snapToGrid w:val="0"/>
               <w:jc w:val="center"/>
               <w:rPr>
-                <w:rFonts w:ascii="Bookman Old Style" w:hAnsi="Bookman Old Style"/>
+                <w:rFonts w:ascii="TeX Gyre Bonum" w:hAnsi="TeX Gyre Bonum"/>
                 <w:sz w:val="22"/>
                 <w:szCs w:val="22"/>
                 <w:lang w:val="en-GB"/>
@@ -953,7 +953,7 @@
               <w:snapToGrid w:val="0"/>
               <w:jc w:val="center"/>
               <w:rPr>
-                <w:rFonts w:ascii="Bookman Old Style" w:hAnsi="Bookman Old Style"/>
+                <w:rFonts w:ascii="TeX Gyre Bonum" w:hAnsi="TeX Gyre Bonum"/>
                 <w:sz w:val="22"/>
                 <w:szCs w:val="22"/>
               </w:rPr>
@@ -965,7 +965,7 @@
               <w:snapToGrid w:val="0"/>
               <w:jc w:val="center"/>
               <w:rPr>
-                <w:rFonts w:ascii="Bookman Old Style" w:hAnsi="Bookman Old Style"/>
+                <w:rFonts w:ascii="TeX Gyre Bonum" w:hAnsi="TeX Gyre Bonum"/>
                 <w:sz w:val="22"/>
                 <w:szCs w:val="22"/>
                 <w:lang w:val="en-GB"/>
@@ -996,7 +996,7 @@
               <w:snapToGrid w:val="0"/>
               <w:jc w:val="center"/>
               <w:rPr>
-                <w:rFonts w:ascii="Bookman Old Style" w:hAnsi="Bookman Old Style"/>
+                <w:rFonts w:ascii="TeX Gyre Bonum" w:hAnsi="TeX Gyre Bonum"/>
                 <w:sz w:val="22"/>
                 <w:szCs w:val="22"/>
                 <w:lang w:val="en-GB"/>
@@ -1009,7 +1009,7 @@
               <w:snapToGrid w:val="0"/>
               <w:jc w:val="center"/>
               <w:rPr>
-                <w:rFonts w:ascii="Bookman Old Style" w:hAnsi="Bookman Old Style"/>
+                <w:rFonts w:ascii="TeX Gyre Bonum" w:hAnsi="TeX Gyre Bonum"/>
                 <w:sz w:val="22"/>
                 <w:szCs w:val="22"/>
                 <w:lang w:val="en-GB"/>
@@ -1045,7 +1045,7 @@
               <w:snapToGrid w:val="0"/>
               <w:jc w:val="center"/>
               <w:rPr>
-                <w:rFonts w:ascii="Bookman Old Style" w:hAnsi="Bookman Old Style"/>
+                <w:rFonts w:ascii="TeX Gyre Bonum" w:hAnsi="TeX Gyre Bonum"/>
                 <w:sz w:val="22"/>
                 <w:szCs w:val="22"/>
                 <w:lang w:val="en-GB"/>
@@ -1053,7 +1053,7 @@
             </w:pPr>
             <w:r>
               <w:rPr>
-                <w:rFonts w:ascii="Bookman Old Style" w:hAnsi="Bookman Old Style"/>
+                <w:rFonts w:ascii="TeX Gyre Bonum" w:hAnsi="TeX Gyre Bonum"/>
                 <w:sz w:val="22"/>
                 <w:szCs w:val="22"/>
                 <w:lang w:val="en-GB"/>
@@ -1067,7 +1067,7 @@
               <w:snapToGrid w:val="0"/>
               <w:jc w:val="center"/>
               <w:rPr>
-                <w:rFonts w:ascii="Bookman Old Style" w:hAnsi="Bookman Old Style"/>
+                <w:rFonts w:ascii="TeX Gyre Bonum" w:hAnsi="TeX Gyre Bonum"/>
                 <w:sz w:val="22"/>
                 <w:szCs w:val="22"/>
                 <w:lang w:val="en-GB"/>
@@ -1075,7 +1075,7 @@
             </w:pPr>
             <w:r>
               <w:rPr>
-                <w:rFonts w:ascii="Bookman Old Style" w:hAnsi="Bookman Old Style"/>
+                <w:rFonts w:ascii="TeX Gyre Bonum" w:hAnsi="TeX Gyre Bonum"/>
                 <w:sz w:val="22"/>
                 <w:szCs w:val="22"/>
                 <w:lang w:val="en-GB"/>
@@ -1089,7 +1089,7 @@
               <w:snapToGrid w:val="0"/>
               <w:jc w:val="center"/>
               <w:rPr>
-                <w:rFonts w:ascii="Bookman Old Style" w:hAnsi="Bookman Old Style"/>
+                <w:rFonts w:ascii="TeX Gyre Bonum" w:hAnsi="TeX Gyre Bonum"/>
                 <w:sz w:val="22"/>
                 <w:szCs w:val="22"/>
                 <w:lang w:val="en-GB"/>
@@ -1097,7 +1097,7 @@
             </w:pPr>
             <w:r>
               <w:rPr>
-                <w:rFonts w:ascii="Bookman Old Style" w:hAnsi="Bookman Old Style"/>
+                <w:rFonts w:ascii="TeX Gyre Bonum" w:hAnsi="TeX Gyre Bonum"/>
                 <w:sz w:val="22"/>
                 <w:szCs w:val="22"/>
                 <w:lang w:val="en-GB"/>
@@ -1111,7 +1111,7 @@
               <w:snapToGrid w:val="0"/>
               <w:jc w:val="center"/>
               <w:rPr>
-                <w:rFonts w:ascii="Bookman Old Style" w:hAnsi="Bookman Old Style"/>
+                <w:rFonts w:ascii="TeX Gyre Bonum" w:hAnsi="TeX Gyre Bonum"/>
                 <w:sz w:val="22"/>
                 <w:szCs w:val="22"/>
                 <w:lang w:val="en-GB"/>
@@ -1119,7 +1119,7 @@
             </w:pPr>
             <w:r>
               <w:rPr>
-                <w:rFonts w:ascii="Bookman Old Style" w:hAnsi="Bookman Old Style"/>
+                <w:rFonts w:ascii="TeX Gyre Bonum" w:hAnsi="TeX Gyre Bonum"/>
                 <w:sz w:val="22"/>
                 <w:szCs w:val="22"/>
                 <w:lang w:val="en-GB"/>
@@ -1150,7 +1150,7 @@
               <w:snapToGrid w:val="0"/>
               <w:jc w:val="center"/>
               <w:rPr>
-                <w:rFonts w:ascii="Bookman Old Style" w:hAnsi="Bookman Old Style"/>
+                <w:rFonts w:ascii="TeX Gyre Bonum" w:hAnsi="TeX Gyre Bonum"/>
                 <w:sz w:val="22"/>
                 <w:szCs w:val="22"/>
                 <w:lang w:val="en-GB"/>
@@ -1158,7 +1158,7 @@
             </w:pPr>
             <w:r>
               <w:rPr>
-                <w:rFonts w:ascii="Bookman Old Style" w:hAnsi="Bookman Old Style"/>
+                <w:rFonts w:ascii="TeX Gyre Bonum" w:hAnsi="TeX Gyre Bonum"/>
                 <w:sz w:val="22"/>
                 <w:szCs w:val="22"/>
               </w:rPr>
@@ -1166,7 +1166,7 @@
             </w:r>
             <w:r>
               <w:rPr>
-                <w:rFonts w:ascii="Bookman Old Style" w:hAnsi="Bookman Old Style"/>
+                <w:rFonts w:ascii="TeX Gyre Bonum" w:hAnsi="TeX Gyre Bonum"/>
                 <w:sz w:val="22"/>
                 <w:szCs w:val="22"/>
               </w:rPr>
@@ -1174,7 +1174,7 @@
             </w:r>
             <w:r>
               <w:rPr>
-                <w:rFonts w:ascii="Bookman Old Style" w:hAnsi="Bookman Old Style"/>
+                <w:rFonts w:ascii="TeX Gyre Bonum" w:hAnsi="TeX Gyre Bonum"/>
                 <w:sz w:val="22"/>
                 <w:szCs w:val="22"/>
               </w:rPr>
@@ -1204,14 +1204,14 @@
               <w:snapToGrid w:val="0"/>
               <w:jc w:val="center"/>
               <w:rPr>
-                <w:rFonts w:ascii="Bookman Old Style" w:hAnsi="Bookman Old Style"/>
+                <w:rFonts w:ascii="TeX Gyre Bonum" w:hAnsi="TeX Gyre Bonum"/>
                 <w:sz w:val="22"/>
                 <w:szCs w:val="22"/>
               </w:rPr>
             </w:pPr>
             <w:r>
               <w:rPr>
-                <w:rFonts w:ascii="Bookman Old Style" w:hAnsi="Bookman Old Style"/>
+                <w:rFonts w:ascii="TeX Gyre Bonum" w:hAnsi="TeX Gyre Bonum"/>
                 <w:sz w:val="22"/>
                 <w:szCs w:val="22"/>
               </w:rPr>
@@ -1219,7 +1219,7 @@
             </w:r>
             <w:r>
               <w:rPr>
-                <w:rFonts w:ascii="Bookman Old Style" w:hAnsi="Bookman Old Style"/>
+                <w:rFonts w:ascii="TeX Gyre Bonum" w:hAnsi="TeX Gyre Bonum"/>
                 <w:sz w:val="22"/>
                 <w:szCs w:val="22"/>
               </w:rPr>
@@ -1227,7 +1227,7 @@
             </w:r>
             <w:r>
               <w:rPr>
-                <w:rFonts w:ascii="Bookman Old Style" w:hAnsi="Bookman Old Style"/>
+                <w:rFonts w:ascii="TeX Gyre Bonum" w:hAnsi="TeX Gyre Bonum"/>
                 <w:sz w:val="22"/>
                 <w:szCs w:val="22"/>
               </w:rPr>
@@ -1258,7 +1258,7 @@
               <w:snapToGrid w:val="0"/>
               <w:jc w:val="center"/>
               <w:rPr>
-                <w:rFonts w:ascii="Bookman Old Style" w:hAnsi="Bookman Old Style"/>
+                <w:rFonts w:ascii="TeX Gyre Bonum" w:hAnsi="TeX Gyre Bonum"/>
                 <w:sz w:val="22"/>
                 <w:szCs w:val="22"/>
                 <w:lang w:val="en-GB"/>
@@ -1266,7 +1266,7 @@
             </w:pPr>
             <w:r>
               <w:rPr>
-                <w:rFonts w:ascii="Bookman Old Style" w:hAnsi="Bookman Old Style"/>
+                <w:rFonts w:ascii="TeX Gyre Bonum" w:hAnsi="TeX Gyre Bonum"/>
                 <w:sz w:val="22"/>
                 <w:szCs w:val="22"/>
               </w:rPr>
@@ -1274,7 +1274,7 @@
             </w:r>
             <w:r>
               <w:rPr>
-                <w:rFonts w:ascii="Bookman Old Style" w:hAnsi="Bookman Old Style"/>
+                <w:rFonts w:ascii="TeX Gyre Bonum" w:hAnsi="TeX Gyre Bonum"/>
                 <w:sz w:val="22"/>
                 <w:szCs w:val="22"/>
               </w:rPr>
@@ -1282,7 +1282,7 @@
             </w:r>
             <w:r>
               <w:rPr>
-                <w:rFonts w:ascii="Bookman Old Style" w:hAnsi="Bookman Old Style"/>
+                <w:rFonts w:ascii="TeX Gyre Bonum" w:hAnsi="TeX Gyre Bonum"/>
                 <w:sz w:val="22"/>
                 <w:szCs w:val="22"/>
               </w:rPr>
@@ -1317,7 +1317,7 @@
               <w:snapToGrid w:val="0"/>
               <w:jc w:val="center"/>
               <w:rPr>
-                <w:rFonts w:ascii="Bookman Old Style" w:hAnsi="Bookman Old Style"/>
+                <w:rFonts w:ascii="TeX Gyre Bonum" w:hAnsi="TeX Gyre Bonum"/>
                 <w:sz w:val="22"/>
                 <w:szCs w:val="22"/>
                 <w:lang w:val="en-GB"/>
@@ -1365,7 +1365,7 @@
               <w:snapToGrid w:val="0"/>
               <w:jc w:val="center"/>
               <w:rPr>
-                <w:rFonts w:ascii="Bookman Old Style" w:hAnsi="Bookman Old Style"/>
+                <w:rFonts w:ascii="TeX Gyre Bonum" w:hAnsi="TeX Gyre Bonum"/>
                 <w:sz w:val="22"/>
                 <w:szCs w:val="22"/>
                 <w:lang w:val="en-GB"/>
@@ -1395,7 +1395,7 @@
               <w:snapToGrid w:val="0"/>
               <w:jc w:val="center"/>
               <w:rPr>
-                <w:rFonts w:ascii="Bookman Old Style" w:hAnsi="Bookman Old Style"/>
+                <w:rFonts w:ascii="TeX Gyre Bonum" w:hAnsi="TeX Gyre Bonum"/>
                 <w:sz w:val="22"/>
                 <w:szCs w:val="22"/>
                 <w:lang w:val="en-GB"/>
@@ -1408,7 +1408,7 @@
               <w:snapToGrid w:val="0"/>
               <w:jc w:val="center"/>
               <w:rPr>
-                <w:rFonts w:ascii="Bookman Old Style" w:hAnsi="Bookman Old Style"/>
+                <w:rFonts w:ascii="TeX Gyre Bonum" w:hAnsi="TeX Gyre Bonum"/>
                 <w:sz w:val="22"/>
                 <w:szCs w:val="22"/>
                 <w:lang w:val="en-GB"/>
@@ -1438,7 +1438,7 @@
               <w:snapToGrid w:val="0"/>
               <w:jc w:val="center"/>
               <w:rPr>
-                <w:rFonts w:ascii="Bookman Old Style" w:hAnsi="Bookman Old Style"/>
+                <w:rFonts w:ascii="TeX Gyre Bonum" w:hAnsi="TeX Gyre Bonum"/>
                 <w:sz w:val="22"/>
                 <w:szCs w:val="22"/>
               </w:rPr>
@@ -1450,7 +1450,7 @@
               <w:snapToGrid w:val="0"/>
               <w:jc w:val="center"/>
               <w:rPr>
-                <w:rFonts w:ascii="Bookman Old Style" w:hAnsi="Bookman Old Style"/>
+                <w:rFonts w:ascii="TeX Gyre Bonum" w:hAnsi="TeX Gyre Bonum"/>
                 <w:sz w:val="22"/>
                 <w:szCs w:val="22"/>
                 <w:lang w:val="en-GB"/>
@@ -1481,7 +1481,7 @@
               <w:snapToGrid w:val="0"/>
               <w:jc w:val="center"/>
               <w:rPr>
-                <w:rFonts w:ascii="Bookman Old Style" w:hAnsi="Bookman Old Style"/>
+                <w:rFonts w:ascii="TeX Gyre Bonum" w:hAnsi="TeX Gyre Bonum"/>
                 <w:sz w:val="22"/>
                 <w:szCs w:val="22"/>
                 <w:lang w:val="en-GB"/>
@@ -1494,7 +1494,7 @@
               <w:snapToGrid w:val="0"/>
               <w:jc w:val="center"/>
               <w:rPr>
-                <w:rFonts w:ascii="Bookman Old Style" w:hAnsi="Bookman Old Style"/>
+                <w:rFonts w:ascii="TeX Gyre Bonum" w:hAnsi="TeX Gyre Bonum"/>
                 <w:sz w:val="22"/>
                 <w:szCs w:val="22"/>
                 <w:lang w:val="en-GB"/>
@@ -1508,7 +1508,7 @@
       <w:pPr>
         <w:pStyle w:val="Standard"/>
         <w:rPr>
-          <w:rFonts w:ascii="Bookman Old Style" w:hAnsi="Bookman Old Style"/>
+          <w:rFonts w:ascii="TeX Gyre Bonum" w:hAnsi="TeX Gyre Bonum"/>
           <w:bCs/>
           <w:sz w:val="22"/>
           <w:szCs w:val="22"/>
@@ -1516,7 +1516,7 @@
       </w:pPr>
       <w:r>
         <w:rPr>
-          <w:rFonts w:ascii="Bookman Old Style" w:hAnsi="Bookman Old Style"/>
+          <w:rFonts w:ascii="TeX Gyre Bonum" w:hAnsi="TeX Gyre Bonum"/>
           <w:b/>
           <w:sz w:val="22"/>
           <w:szCs w:val="22"/>
@@ -1525,7 +1525,7 @@
       </w:r>
       <w:r>
         <w:rPr>
-          <w:rFonts w:ascii="Bookman Old Style" w:hAnsi="Bookman Old Style"/>
+          <w:rFonts w:ascii="TeX Gyre Bonum" w:hAnsi="TeX Gyre Bonum"/>
           <w:b/>
           <w:sz w:val="22"/>
           <w:szCs w:val="22"/>
@@ -1534,7 +1534,7 @@
       </w:r>
       <w:r>
         <w:rPr>
-          <w:rFonts w:ascii="Bookman Old Style" w:hAnsi="Bookman Old Style"/>
+          <w:rFonts w:ascii="TeX Gyre Bonum" w:hAnsi="TeX Gyre Bonum"/>
           <w:bCs/>
           <w:sz w:val="22"/>
           <w:szCs w:val="22"/>
@@ -1543,7 +1543,7 @@
       </w:r>
       <w:r>
         <w:rPr>
-          <w:rFonts w:ascii="Bookman Old Style" w:hAnsi="Bookman Old Style"/>
+          <w:rFonts w:ascii="TeX Gyre Bonum" w:hAnsi="TeX Gyre Bonum"/>
           <w:bCs/>
           <w:sz w:val="22"/>
           <w:szCs w:val="22"/>
@@ -1555,7 +1555,7 @@
       <w:pPr>
         <w:pStyle w:val="Standard"/>
         <w:rPr>
-          <w:rFonts w:ascii="Bookman Old Style" w:hAnsi="Bookman Old Style"/>
+          <w:rFonts w:ascii="TeX Gyre Bonum" w:hAnsi="TeX Gyre Bonum"/>
           <w:bCs/>
           <w:sz w:val="22"/>
           <w:szCs w:val="22"/>
@@ -1566,7 +1566,7 @@
       <w:pPr>
         <w:pStyle w:val="Standard"/>
         <w:rPr>
-          <w:rFonts w:ascii="Bookman Old Style" w:hAnsi="Bookman Old Style"/>
+          <w:rFonts w:ascii="TeX Gyre Bonum" w:hAnsi="TeX Gyre Bonum"/>
           <w:sz w:val="22"/>
           <w:szCs w:val="22"/>
           <w:lang w:val="en-GB"/>
@@ -1574,7 +1574,7 @@
       </w:pPr>
       <w:r>
         <w:rPr>
-          <w:rFonts w:ascii="Bookman Old Style" w:hAnsi="Bookman Old Style"/>
+          <w:rFonts w:ascii="TeX Gyre Bonum" w:hAnsi="TeX Gyre Bonum"/>
           <w:b/>
           <w:sz w:val="22"/>
           <w:szCs w:val="22"/>
@@ -1584,7 +1584,7 @@
       </w:r>
       <w:r>
         <w:rPr>
-          <w:rFonts w:ascii="Bookman Old Style" w:hAnsi="Bookman Old Style"/>
+          <w:rFonts w:ascii="TeX Gyre Bonum" w:hAnsi="TeX Gyre Bonum"/>
           <w:b/>
           <w:sz w:val="22"/>
           <w:szCs w:val="22"/>
@@ -1594,7 +1594,7 @@
       </w:r>
       <w:r>
         <w:rPr>
-          <w:rFonts w:ascii="Bookman Old Style" w:hAnsi="Bookman Old Style"/>
+          <w:rFonts w:ascii="TeX Gyre Bonum" w:hAnsi="TeX Gyre Bonum"/>
           <w:sz w:val="22"/>
           <w:szCs w:val="22"/>
           <w:lang w:val="en-GB"/>
@@ -1606,14 +1606,14 @@
       <w:pPr>
         <w:pStyle w:val="Standard"/>
         <w:rPr>
-          <w:rFonts w:ascii="Bookman Old Style" w:hAnsi="Bookman Old Style"/>
+          <w:rFonts w:ascii="TeX Gyre Bonum" w:hAnsi="TeX Gyre Bonum"/>
           <w:sz w:val="22"/>
           <w:szCs w:val="22"/>
         </w:rPr>
       </w:pPr>
       <w:r>
         <w:rPr>
-          <w:rFonts w:ascii="Bookman Old Style" w:hAnsi="Bookman Old Style"/>
+          <w:rFonts w:ascii="TeX Gyre Bonum" w:hAnsi="TeX Gyre Bonum"/>
           <w:sz w:val="22"/>
           <w:szCs w:val="22"/>
         </w:rPr>
@@ -1621,28 +1621,28 @@
       </w:r>
       <w:r>
         <w:rPr>
-          <w:rFonts w:ascii="Bookman Old Style" w:hAnsi="Bookman Old Style"/>
-          <w:sz w:val="22"/>
-          <w:szCs w:val="22"/>
-        </w:rPr>
-      </w:r>
-      <w:r>
-        <w:rPr>
-          <w:rFonts w:ascii="Bookman Old Style" w:hAnsi="Bookman Old Style"/>
-          <w:sz w:val="22"/>
-          <w:szCs w:val="22"/>
-        </w:rPr>
-      </w:r>
-      <w:r>
-        <w:rPr>
-          <w:rFonts w:ascii="Bookman Old Style" w:hAnsi="Bookman Old Style"/>
-          <w:sz w:val="22"/>
-          <w:szCs w:val="22"/>
-        </w:rPr>
-      </w:r>
-      <w:r>
-        <w:rPr>
-          <w:rFonts w:ascii="Bookman Old Style" w:hAnsi="Bookman Old Style"/>
+          <w:rFonts w:ascii="TeX Gyre Bonum" w:hAnsi="TeX Gyre Bonum"/>
+          <w:sz w:val="22"/>
+          <w:szCs w:val="22"/>
+        </w:rPr>
+      </w:r>
+      <w:r>
+        <w:rPr>
+          <w:rFonts w:ascii="TeX Gyre Bonum" w:hAnsi="TeX Gyre Bonum"/>
+          <w:sz w:val="22"/>
+          <w:szCs w:val="22"/>
+        </w:rPr>
+      </w:r>
+      <w:r>
+        <w:rPr>
+          <w:rFonts w:ascii="TeX Gyre Bonum" w:hAnsi="TeX Gyre Bonum"/>
+          <w:sz w:val="22"/>
+          <w:szCs w:val="22"/>
+        </w:rPr>
+      </w:r>
+      <w:r>
+        <w:rPr>
+          <w:rFonts w:ascii="TeX Gyre Bonum" w:hAnsi="TeX Gyre Bonum"/>
           <w:sz w:val="22"/>
           <w:szCs w:val="22"/>
         </w:rPr>
@@ -1652,7 +1652,7 @@
       <w:pPr>
         <w:pStyle w:val="Standard"/>
         <w:rPr>
-          <w:rFonts w:ascii="Bookman Old Style" w:hAnsi="Bookman Old Style"/>
+          <w:rFonts w:ascii="TeX Gyre Bonum" w:hAnsi="TeX Gyre Bonum"/>
           <w:sz w:val="22"/>
           <w:szCs w:val="22"/>
         </w:rPr>
@@ -1662,14 +1662,14 @@
       <w:pPr>
         <w:pStyle w:val="Standard"/>
         <w:rPr>
-          <w:rFonts w:ascii="Bookman Old Style" w:hAnsi="Bookman Old Style"/>
+          <w:rFonts w:ascii="TeX Gyre Bonum" w:hAnsi="TeX Gyre Bonum"/>
           <w:sz w:val="22"/>
           <w:szCs w:val="22"/>
         </w:rPr>
       </w:pPr>
       <w:r>
         <w:rPr>
-          <w:rFonts w:ascii="Bookman Old Style" w:hAnsi="Bookman Old Style"/>
+          <w:rFonts w:ascii="TeX Gyre Bonum" w:hAnsi="TeX Gyre Bonum"/>
           <w:sz w:val="22"/>
           <w:szCs w:val="22"/>
         </w:rPr>
@@ -1677,7 +1677,7 @@
       </w:r>
       <w:r>
         <w:rPr>
-          <w:rFonts w:ascii="Bookman Old Style" w:hAnsi="Bookman Old Style"/>
+          <w:rFonts w:ascii="TeX Gyre Bonum" w:hAnsi="TeX Gyre Bonum"/>
           <w:sz w:val="22"/>
           <w:szCs w:val="22"/>
           <w:lang w:val="en-GB"/>
@@ -1685,7 +1685,7 @@
       </w:r>
       <w:r>
         <w:rPr>
-          <w:rFonts w:ascii="Bookman Old Style" w:hAnsi="Bookman Old Style"/>
+          <w:rFonts w:ascii="TeX Gyre Bonum" w:hAnsi="TeX Gyre Bonum"/>
           <w:sz w:val="22"/>
           <w:szCs w:val="22"/>
           <w:lang w:val="en-GB"/>
@@ -1693,7 +1693,7 @@
       </w:r>
       <w:r>
         <w:rPr>
-          <w:rFonts w:ascii="Bookman Old Style" w:hAnsi="Bookman Old Style"/>
+          <w:rFonts w:ascii="TeX Gyre Bonum" w:hAnsi="TeX Gyre Bonum"/>
           <w:sz w:val="22"/>
           <w:szCs w:val="22"/>
           <w:lang w:val="en-GB"/>
@@ -1701,7 +1701,7 @@
       </w:r>
       <w:r>
         <w:rPr>
-          <w:rFonts w:ascii="Bookman Old Style" w:hAnsi="Bookman Old Style"/>
+          <w:rFonts w:ascii="TeX Gyre Bonum" w:hAnsi="TeX Gyre Bonum"/>
           <w:noProof/>
           <w:sz w:val="22"/>
           <w:szCs w:val="22"/>
@@ -1710,7 +1710,7 @@
       </w:r>
       <w:r>
         <w:rPr>
-          <w:rFonts w:ascii="Bookman Old Style" w:hAnsi="Bookman Old Style"/>
+          <w:rFonts w:ascii="TeX Gyre Bonum" w:hAnsi="TeX Gyre Bonum"/>
           <w:sz w:val="22"/>
           <w:szCs w:val="22"/>
           <w:lang w:val="en-GB"/>
@@ -1734,7 +1734,7 @@
           <w:tab w:val="right" w:leader="dot" w:pos="9072"/>
         </w:tabs>
         <w:rPr>
-          <w:rFonts w:ascii="Bookman Old Style" w:hAnsi="Bookman Old Style"/>
+          <w:rFonts w:ascii="TeX Gyre Bonum" w:hAnsi="TeX Gyre Bonum"/>
           <w:sz w:val="22"/>
           <w:szCs w:val="22"/>
           <w:lang w:val="en-GB"/>
@@ -1742,7 +1742,7 @@
       </w:pPr>
       <w:r>
         <w:rPr>
-          <w:rFonts w:ascii="Bookman Old Style" w:hAnsi="Bookman Old Style"/>
+          <w:rFonts w:ascii="TeX Gyre Bonum" w:hAnsi="TeX Gyre Bonum"/>
           <w:b/>
           <w:sz w:val="22"/>
           <w:szCs w:val="22"/>
@@ -1752,7 +1752,7 @@
       </w:r>
       <w:r>
         <w:rPr>
-          <w:rFonts w:ascii="Bookman Old Style" w:hAnsi="Bookman Old Style"/>
+          <w:rFonts w:ascii="TeX Gyre Bonum" w:hAnsi="TeX Gyre Bonum"/>
           <w:b/>
           <w:sz w:val="22"/>
           <w:szCs w:val="22"/>
@@ -1762,7 +1762,7 @@
       </w:r>
       <w:r>
         <w:rPr>
-          <w:rFonts w:ascii="Bookman Old Style" w:hAnsi="Bookman Old Style"/>
+          <w:rFonts w:ascii="TeX Gyre Bonum" w:hAnsi="TeX Gyre Bonum"/>
           <w:b/>
           <w:sz w:val="22"/>
           <w:szCs w:val="22"/>
@@ -1772,7 +1772,7 @@
       </w:r>
       <w:r>
         <w:rPr>
-          <w:rFonts w:ascii="Bookman Old Style" w:hAnsi="Bookman Old Style"/>
+          <w:rFonts w:ascii="TeX Gyre Bonum" w:hAnsi="TeX Gyre Bonum"/>
           <w:sz w:val="22"/>
           <w:szCs w:val="22"/>
           <w:lang w:val="en-GB"/>
@@ -1788,7 +1788,7 @@
           <w:tab w:val="right" w:leader="dot" w:pos="9072"/>
         </w:tabs>
         <w:rPr>
-          <w:rFonts w:ascii="Bookman Old Style" w:hAnsi="Bookman Old Style"/>
+          <w:rFonts w:ascii="TeX Gyre Bonum" w:hAnsi="TeX Gyre Bonum"/>
           <w:sz w:val="22"/>
           <w:szCs w:val="22"/>
           <w:lang w:val="en-GB"/>
@@ -1796,7 +1796,7 @@
       </w:pPr>
       <w:r>
         <w:rPr>
-          <w:rFonts w:ascii="Bookman Old Style" w:hAnsi="Bookman Old Style"/>
+          <w:rFonts w:ascii="TeX Gyre Bonum" w:hAnsi="TeX Gyre Bonum"/>
           <w:sz w:val="22"/>
           <w:szCs w:val="22"/>
           <w:lang w:val="en-GB"/>
@@ -1805,7 +1805,7 @@
       </w:r>
       <w:r>
         <w:rPr>
-          <w:rFonts w:ascii="Bookman Old Style" w:hAnsi="Bookman Old Style"/>
+          <w:rFonts w:ascii="TeX Gyre Bonum" w:hAnsi="TeX Gyre Bonum"/>
           <w:sz w:val="22"/>
           <w:szCs w:val="22"/>
           <w:lang w:val="en-GB"/>
@@ -1814,7 +1814,7 @@
       </w:r>
       <w:r>
         <w:rPr>
-          <w:rFonts w:ascii="Bookman Old Style" w:hAnsi="Bookman Old Style"/>
+          <w:rFonts w:ascii="TeX Gyre Bonum" w:hAnsi="TeX Gyre Bonum"/>
           <w:sz w:val="22"/>
           <w:szCs w:val="22"/>
           <w:lang w:val="en-GB"/>
@@ -1823,7 +1823,7 @@
       </w:r>
       <w:r>
         <w:rPr>
-          <w:rFonts w:ascii="Bookman Old Style" w:hAnsi="Bookman Old Style"/>
+          <w:rFonts w:ascii="TeX Gyre Bonum" w:hAnsi="TeX Gyre Bonum"/>
           <w:sz w:val="22"/>
           <w:szCs w:val="22"/>
           <w:lang w:val="en-GB"/>
@@ -1832,7 +1832,7 @@
       </w:r>
       <w:r>
         <w:rPr>
-          <w:rFonts w:ascii="Bookman Old Style" w:hAnsi="Bookman Old Style"/>
+          <w:rFonts w:ascii="TeX Gyre Bonum" w:hAnsi="TeX Gyre Bonum"/>
           <w:sz w:val="22"/>
           <w:szCs w:val="22"/>
           <w:lang w:val="en-GB"/>
@@ -1849,7 +1849,7 @@
         </w:tabs>
         <w:spacing w:line="360" w:lineRule="auto"/>
         <w:rPr>
-          <w:rFonts w:ascii="Bookman Old Style" w:hAnsi="Bookman Old Style"/>
+          <w:rFonts w:ascii="TeX Gyre Bonum" w:hAnsi="TeX Gyre Bonum"/>
           <w:sz w:val="22"/>
           <w:szCs w:val="22"/>
           <w:lang w:val="en-GB"/>
@@ -1870,7 +1870,7 @@
       </w:pPr>
       <w:r>
         <w:rPr>
-          <w:rFonts w:ascii="Bookman Old Style" w:hAnsi="Bookman Old Style"/>
+          <w:rFonts w:ascii="TeX Gyre Bonum" w:hAnsi="TeX Gyre Bonum"/>
           <w:b/>
           <w:sz w:val="22"/>
           <w:szCs w:val="22"/>
@@ -1898,7 +1898,7 @@
       </w:pPr>
       <w:r>
         <w:rPr>
-          <w:rFonts w:ascii="Bookman Old Style" w:hAnsi="Bookman Old Style"/>
+          <w:rFonts w:ascii="TeX Gyre Bonum" w:hAnsi="TeX Gyre Bonum"/>
           <w:b/>
           <w:sz w:val="22"/>
           <w:szCs w:val="22"/>
@@ -1908,7 +1908,7 @@
       </w:r>
       <w:r>
         <w:rPr>
-          <w:rFonts w:ascii="Bookman Old Style" w:hAnsi="Bookman Old Style"/>
+          <w:rFonts w:ascii="TeX Gyre Bonum" w:hAnsi="TeX Gyre Bonum"/>
           <w:b/>
           <w:sz w:val="22"/>
           <w:szCs w:val="22"/>
@@ -1918,7 +1918,7 @@
       </w:r>
       <w:r>
         <w:rPr>
-          <w:rFonts w:ascii="Bookman Old Style" w:hAnsi="Bookman Old Style"/>
+          <w:rFonts w:ascii="TeX Gyre Bonum" w:hAnsi="TeX Gyre Bonum"/>
           <w:b/>
           <w:sz w:val="22"/>
           <w:szCs w:val="22"/>
@@ -1928,7 +1928,7 @@
       </w:r>
       <w:r>
         <w:rPr>
-          <w:rFonts w:ascii="Bookman Old Style" w:hAnsi="Bookman Old Style"/>
+          <w:rFonts w:ascii="TeX Gyre Bonum" w:hAnsi="TeX Gyre Bonum"/>
           <w:b/>
           <w:sz w:val="22"/>
           <w:szCs w:val="22"/>
@@ -1938,7 +1938,7 @@
       </w:r>
       <w:r>
         <w:rPr>
-          <w:rFonts w:ascii="Bookman Old Style" w:hAnsi="Bookman Old Style"/>
+          <w:rFonts w:ascii="TeX Gyre Bonum" w:hAnsi="TeX Gyre Bonum"/>
           <w:b/>
           <w:lang w:val="en-GB"/>
         </w:rPr>

</xml_diff>

<commit_message>
fix: cert PDF — font consistency, name_en save/load, vertical centering
- TeX Gyre Bonum in template + RichText (11pt, half-points)
- name_en empty string saved as "" not NULL, no fallback override
- Fix name_en fallback in get_cert_params and build_preview_context
- Post-render fix: add mini-paragraph for single-line cells (LibreOffice vAlign workaround)

Co-Authored-By: Claude Opus 4.6 (1M context) <noreply@anthropic.com>
</commit_message>
<xml_diff>
--- a/mbr/templates/cert_master_template.docx
+++ b/mbr/templates/cert_master_template.docx
@@ -794,7 +794,7 @@
       </w:tr>
       <w:tr>
         <w:trPr>
-          <w:trHeight w:val="480"/>
+          <w:trHeight w:val="480" w:hRule="atLeast"/>
         </w:trPr>
         <w:tc>
           <w:tcPr>
@@ -1020,7 +1020,7 @@
       </w:tr>
       <w:tr>
         <w:trPr>
-          <w:trHeight w:val="480"/>
+          <w:trHeight w:val="480" w:hRule="atLeast"/>
           <w:cantSplit/>
         </w:trPr>
         <w:tc>
@@ -1293,7 +1293,7 @@
       </w:tr>
       <w:tr>
         <w:trPr>
-          <w:trHeight w:val="480"/>
+          <w:trHeight w:val="480" w:hRule="atLeast"/>
         </w:trPr>
         <w:tc>
           <w:tcPr>

</xml_diff>

<commit_message>
feat(certs): widen table geometry
Widened parameter table from 171mm to 184mm by narrowing page margins
(20mm → 13mm each side), expanding name column (79mm → 94mm), and
trimming method column (19mm → 17mm). Typography parameterization via
docxtpl attribute substitution is not viable (docxtpl only processes
text nodes, not XML attributes; 298 font occurrences are in w:ascii/
w:hAnsi attrs) — body_font_family is already threaded via T3's
_md_to_richtext; no template change needed for that path.

Co-Authored-By: Claude Sonnet 4.6 <noreply@anthropic.com>
</commit_message>
<xml_diff>
--- a/mbr/templates/cert_master_template.docx
+++ b/mbr/templates/cert_master_template.docx
@@ -404,7 +404,7 @@
     </w:p>
     <w:tbl>
       <w:tblPr>
-        <w:tblW w:w="9677" w:type="dxa"/>
+        <w:tblW w:w="10432" w:type="dxa"/>
         <w:tblInd w:w="60" w:type="dxa"/>
         <w:tblLayout w:type="fixed"/>
         <w:tblCellMar>
@@ -414,10 +414,10 @@
         <w:tblLook w:val="0000" w:firstRow="0" w:lastRow="0" w:firstColumn="0" w:lastColumn="0" w:noHBand="0" w:noVBand="0"/>
       </w:tblPr>
       <w:tblGrid>
-        <w:gridCol w:w="4471"/>
+        <w:gridCol w:w="5330"/>
         <w:gridCol w:w="2127"/>
         <w:gridCol w:w="1984"/>
-        <w:gridCol w:w="1095"/>
+        <w:gridCol w:w="991"/>
       </w:tblGrid>
       <w:tr>
         <w:trPr>
@@ -426,7 +426,7 @@
         </w:trPr>
         <w:tc>
           <w:tcPr>
-            <w:tcW w:w="4471" w:type="dxa"/>
+            <w:tcW w:w="5330" w:type="dxa"/>
             <w:tcBorders>
               <w:top w:val="single" w:color="000000" w:themeColor="text1" w:sz="4" w:space="0"/>
               <w:left w:val="single" w:color="000000" w:themeColor="text1" w:sz="4" w:space="0"/>
@@ -723,7 +723,7 @@
         </w:tc>
         <w:tc>
           <w:tcPr>
-            <w:tcW w:w="1095" w:type="dxa"/>
+            <w:tcW w:w="991" w:type="dxa"/>
             <w:tcBorders>
               <w:top w:val="single" w:color="000000" w:themeColor="text1" w:sz="4" w:space="0"/>
               <w:left w:val="single" w:color="000000" w:themeColor="text1" w:sz="4" w:space="0"/>
@@ -798,7 +798,7 @@
         </w:trPr>
         <w:tc>
           <w:tcPr>
-            <w:tcW w:w="4471" w:type="dxa"/>
+            <w:tcW w:w="5330" w:type="dxa"/>
             <w:tcBorders>
               <w:top w:val="single" w:color="000000" w:themeColor="text1" w:sz="4" w:space="0"/>
               <w:left w:val="single" w:color="000000" w:themeColor="text1" w:sz="4" w:space="0"/>
@@ -975,7 +975,7 @@
         </w:tc>
         <w:tc>
           <w:tcPr>
-            <w:tcW w:w="1095" w:type="dxa"/>
+            <w:tcW w:w="991" w:type="dxa"/>
             <w:tcBorders>
               <w:top w:val="single" w:color="000000" w:themeColor="text1" w:sz="4" w:space="0"/>
               <w:left w:val="single" w:color="000000" w:themeColor="text1" w:sz="4" w:space="0"/>
@@ -1025,7 +1025,7 @@
         </w:trPr>
         <w:tc>
           <w:tcPr>
-            <w:tcW w:w="4471" w:type="dxa"/>
+            <w:tcW w:w="5330" w:type="dxa"/>
             <w:tcBorders>
               <w:top w:val="single" w:color="000000" w:themeColor="text1" w:sz="4" w:space="0"/>
               <w:left w:val="single" w:color="000000" w:themeColor="text1" w:sz="4" w:space="0"/>
@@ -1237,7 +1237,7 @@
         </w:tc>
         <w:tc>
           <w:tcPr>
-            <w:tcW w:w="1095" w:type="dxa"/>
+            <w:tcW w:w="991" w:type="dxa"/>
             <w:tcBorders>
               <w:top w:val="single" w:color="000000" w:themeColor="text1" w:sz="4" w:space="0"/>
               <w:left w:val="single" w:color="000000" w:themeColor="text1" w:sz="4" w:space="0"/>
@@ -1297,7 +1297,7 @@
         </w:trPr>
         <w:tc>
           <w:tcPr>
-            <w:tcW w:w="4471" w:type="dxa"/>
+            <w:tcW w:w="5330" w:type="dxa"/>
             <w:tcBorders>
               <w:top w:val="single" w:color="000000" w:themeColor="text1" w:sz="4" w:space="0"/>
               <w:left w:val="single" w:color="000000" w:themeColor="text1" w:sz="4" w:space="0"/>
@@ -1460,7 +1460,7 @@
         </w:tc>
         <w:tc>
           <w:tcPr>
-            <w:tcW w:w="1095" w:type="dxa"/>
+            <w:tcW w:w="991" w:type="dxa"/>
             <w:tcBorders>
               <w:top w:val="single" w:color="000000" w:themeColor="text1" w:sz="4" w:space="0"/>
               <w:left w:val="single" w:color="000000" w:themeColor="text1" w:sz="4" w:space="0"/>
@@ -1949,7 +1949,7 @@
       <w:headerReference w:type="default" r:id="rId8"/>
       <w:footerReference w:type="default" r:id="rId9"/>
       <w:pgSz w:w="11906" w:h="16838" w:orient="portrait"/>
-      <w:pgMar w:top="964" w:right="1134" w:bottom="964" w:left="1134" w:header="624" w:footer="680" w:gutter="0"/>
+      <w:pgMar w:top="964" w:right="737" w:bottom="964" w:left="737" w:header="624" w:footer="680" w:gutter="0"/>
       <w:cols w:space="708"/>
       <w:docGrid w:linePitch="326"/>
     </w:sectPr>

</xml_diff>

<commit_message>
feat(certs): widen Result column + preview shows 1,0000 placeholder
Result column: 35mm → 42mm (+400 dxa). Offset by narrowing
Requirement column: 38mm → 30.5mm (-400 dxa). Table total unchanged.
Updates all gridCol + tcW occurrences to stay consistent.

Preview placeholder: fixed "1,0000" for all numeric params instead of
the format-dependent 12.34 render. Admins can eyeball Result-column
width against a realistic 6-character numeric value without knowing
what the live wyniki look like.
</commit_message>
<xml_diff>
--- a/mbr/templates/cert_master_template.docx
+++ b/mbr/templates/cert_master_template.docx
@@ -415,8 +415,8 @@
       </w:tblPr>
       <w:tblGrid>
         <w:gridCol w:w="5330"/>
-        <w:gridCol w:w="2127"/>
-        <w:gridCol w:w="1984"/>
+        <w:gridCol w:w="1727"/>
+        <w:gridCol w:w="2384"/>
         <w:gridCol w:w="991"/>
       </w:tblGrid>
       <w:tr>
@@ -528,7 +528,7 @@
         </w:tc>
         <w:tc>
           <w:tcPr>
-            <w:tcW w:w="2127" w:type="dxa"/>
+            <w:tcW w:w="1727" w:type="dxa"/>
             <w:tcBorders>
               <w:top w:val="single" w:color="000000" w:themeColor="text1" w:sz="4" w:space="0"/>
               <w:left w:val="single" w:color="000000" w:themeColor="text1" w:sz="4" w:space="0"/>
@@ -610,7 +610,7 @@
         </w:tc>
         <w:tc>
           <w:tcPr>
-            <w:tcW w:w="1984" w:type="dxa"/>
+            <w:tcW w:w="2384" w:type="dxa"/>
             <w:tcBorders>
               <w:top w:val="single" w:color="000000" w:themeColor="text1" w:sz="4" w:space="0"/>
               <w:left w:val="single" w:color="000000" w:themeColor="text1" w:sz="4" w:space="0"/>
@@ -890,7 +890,7 @@
         </w:tc>
         <w:tc>
           <w:tcPr>
-            <w:tcW w:w="2127" w:type="dxa"/>
+            <w:tcW w:w="1727" w:type="dxa"/>
             <w:tcBorders>
               <w:top w:val="single" w:color="000000" w:themeColor="text1" w:sz="4" w:space="0"/>
               <w:left w:val="single" w:color="000000" w:themeColor="text1" w:sz="4" w:space="0"/>
@@ -933,7 +933,7 @@
         </w:tc>
         <w:tc>
           <w:tcPr>
-            <w:tcW w:w="1984" w:type="dxa"/>
+            <w:tcW w:w="2384" w:type="dxa"/>
             <w:tcBorders>
               <w:top w:val="single" w:color="000000" w:themeColor="text1" w:sz="4" w:space="0"/>
               <w:left w:val="single" w:color="000000" w:themeColor="text1" w:sz="4" w:space="0"/>
@@ -1130,7 +1130,7 @@
         </w:tc>
         <w:tc>
           <w:tcPr>
-            <w:tcW w:w="2127" w:type="dxa"/>
+            <w:tcW w:w="1727" w:type="dxa"/>
             <w:tcBorders>
               <w:top w:val="single" w:color="000000" w:themeColor="text1" w:sz="4" w:space="0"/>
               <w:left w:val="single" w:color="000000" w:themeColor="text1" w:sz="4" w:space="0"/>
@@ -1184,7 +1184,7 @@
         </w:tc>
         <w:tc>
           <w:tcPr>
-            <w:tcW w:w="1984" w:type="dxa"/>
+            <w:tcW w:w="2384" w:type="dxa"/>
             <w:tcBorders>
               <w:top w:val="single" w:color="000000" w:themeColor="text1" w:sz="4" w:space="0"/>
               <w:left w:val="single" w:color="000000" w:themeColor="text1" w:sz="4" w:space="0"/>
@@ -1375,7 +1375,7 @@
         </w:tc>
         <w:tc>
           <w:tcPr>
-            <w:tcW w:w="2127" w:type="dxa"/>
+            <w:tcW w:w="1727" w:type="dxa"/>
             <w:tcBorders>
               <w:top w:val="single" w:color="000000" w:themeColor="text1" w:sz="4" w:space="0"/>
               <w:left w:val="single" w:color="000000" w:themeColor="text1" w:sz="4" w:space="0"/>
@@ -1418,7 +1418,7 @@
         </w:tc>
         <w:tc>
           <w:tcPr>
-            <w:tcW w:w="1984" w:type="dxa"/>
+            <w:tcW w:w="2384" w:type="dxa"/>
             <w:tcBorders>
               <w:top w:val="single" w:color="000000" w:themeColor="text1" w:sz="4" w:space="0"/>
               <w:left w:val="single" w:color="000000" w:themeColor="text1" w:sz="4" w:space="0"/>

</xml_diff>

<commit_message>
fix(certs): symmetric 42mm Requirement/Result to fit bilingual phrases
Previous layout narrowed Requirement to 30.5mm to give Result 42mm — but
qualitative bilingual values like "charakterystyczny\n/characteristic"
wrapped the Polish word in Requirement, producing 3-line cells instead
of the intended 2 (PL\n/EN).

New geometry: Requirement and Result both 42mm, Name 82mm (from 94mm —
still plenty for long chemical identifiers like kokamidoamidoamin),
Method 17mm unchanged. Total 184mm preserved.
</commit_message>
<xml_diff>
--- a/mbr/templates/cert_master_template.docx
+++ b/mbr/templates/cert_master_template.docx
@@ -414,8 +414,8 @@
         <w:tblLook w:val="0000" w:firstRow="0" w:lastRow="0" w:firstColumn="0" w:lastColumn="0" w:noHBand="0" w:noVBand="0"/>
       </w:tblPr>
       <w:tblGrid>
-        <w:gridCol w:w="5330"/>
-        <w:gridCol w:w="1727"/>
+        <w:gridCol w:w="4673"/>
+        <w:gridCol w:w="2384"/>
         <w:gridCol w:w="2384"/>
         <w:gridCol w:w="991"/>
       </w:tblGrid>
@@ -426,7 +426,7 @@
         </w:trPr>
         <w:tc>
           <w:tcPr>
-            <w:tcW w:w="5330" w:type="dxa"/>
+            <w:tcW w:w="4673" w:type="dxa"/>
             <w:tcBorders>
               <w:top w:val="single" w:color="000000" w:themeColor="text1" w:sz="4" w:space="0"/>
               <w:left w:val="single" w:color="000000" w:themeColor="text1" w:sz="4" w:space="0"/>
@@ -528,7 +528,7 @@
         </w:tc>
         <w:tc>
           <w:tcPr>
-            <w:tcW w:w="1727" w:type="dxa"/>
+            <w:tcW w:w="2384" w:type="dxa"/>
             <w:tcBorders>
               <w:top w:val="single" w:color="000000" w:themeColor="text1" w:sz="4" w:space="0"/>
               <w:left w:val="single" w:color="000000" w:themeColor="text1" w:sz="4" w:space="0"/>
@@ -798,7 +798,7 @@
         </w:trPr>
         <w:tc>
           <w:tcPr>
-            <w:tcW w:w="5330" w:type="dxa"/>
+            <w:tcW w:w="4673" w:type="dxa"/>
             <w:tcBorders>
               <w:top w:val="single" w:color="000000" w:themeColor="text1" w:sz="4" w:space="0"/>
               <w:left w:val="single" w:color="000000" w:themeColor="text1" w:sz="4" w:space="0"/>
@@ -890,7 +890,7 @@
         </w:tc>
         <w:tc>
           <w:tcPr>
-            <w:tcW w:w="1727" w:type="dxa"/>
+            <w:tcW w:w="2384" w:type="dxa"/>
             <w:tcBorders>
               <w:top w:val="single" w:color="000000" w:themeColor="text1" w:sz="4" w:space="0"/>
               <w:left w:val="single" w:color="000000" w:themeColor="text1" w:sz="4" w:space="0"/>
@@ -1025,7 +1025,7 @@
         </w:trPr>
         <w:tc>
           <w:tcPr>
-            <w:tcW w:w="5330" w:type="dxa"/>
+            <w:tcW w:w="4673" w:type="dxa"/>
             <w:tcBorders>
               <w:top w:val="single" w:color="000000" w:themeColor="text1" w:sz="4" w:space="0"/>
               <w:left w:val="single" w:color="000000" w:themeColor="text1" w:sz="4" w:space="0"/>
@@ -1130,7 +1130,7 @@
         </w:tc>
         <w:tc>
           <w:tcPr>
-            <w:tcW w:w="1727" w:type="dxa"/>
+            <w:tcW w:w="2384" w:type="dxa"/>
             <w:tcBorders>
               <w:top w:val="single" w:color="000000" w:themeColor="text1" w:sz="4" w:space="0"/>
               <w:left w:val="single" w:color="000000" w:themeColor="text1" w:sz="4" w:space="0"/>
@@ -1297,7 +1297,7 @@
         </w:trPr>
         <w:tc>
           <w:tcPr>
-            <w:tcW w:w="5330" w:type="dxa"/>
+            <w:tcW w:w="4673" w:type="dxa"/>
             <w:tcBorders>
               <w:top w:val="single" w:color="000000" w:themeColor="text1" w:sz="4" w:space="0"/>
               <w:left w:val="single" w:color="000000" w:themeColor="text1" w:sz="4" w:space="0"/>
@@ -1375,7 +1375,7 @@
         </w:tc>
         <w:tc>
           <w:tcPr>
-            <w:tcW w:w="1727" w:type="dxa"/>
+            <w:tcW w:w="2384" w:type="dxa"/>
             <w:tcBorders>
               <w:top w:val="single" w:color="000000" w:themeColor="text1" w:sz="4" w:space="0"/>
               <w:left w:val="single" w:color="000000" w:themeColor="text1" w:sz="4" w:space="0"/>

</xml_diff>

<commit_message>
fix(certs): tighter 10mm margins + wider columns all around
13mm margins + 82mm Name column weren't enough for long bilingual content
(kokamidopropylo..., charakterystyczny/characteristic) — cells wrapped
to 3 lines where 2 were expected.

New: margins 10mm (industry standard for certs), total table 190mm.
- Name      82 → 86mm  (+6mm for longer chem names)
- Wymaganie 42 → 43mm  (+1mm buffer for PL word length)
- Wynik     42 → 43mm  (+1mm buffer)
- Metoda    17.5 → 17.6mm (nudged)
</commit_message>
<xml_diff>
--- a/mbr/templates/cert_master_template.docx
+++ b/mbr/templates/cert_master_template.docx
@@ -404,7 +404,7 @@
     </w:p>
     <w:tbl>
       <w:tblPr>
-        <w:tblW w:w="10432" w:type="dxa"/>
+        <w:tblW w:w="10772" w:type="dxa"/>
         <w:tblInd w:w="60" w:type="dxa"/>
         <w:tblLayout w:type="fixed"/>
         <w:tblCellMar>
@@ -414,10 +414,10 @@
         <w:tblLook w:val="0000" w:firstRow="0" w:lastRow="0" w:firstColumn="0" w:lastColumn="0" w:noHBand="0" w:noVBand="0"/>
       </w:tblPr>
       <w:tblGrid>
-        <w:gridCol w:w="4673"/>
-        <w:gridCol w:w="2384"/>
-        <w:gridCol w:w="2384"/>
-        <w:gridCol w:w="991"/>
+        <w:gridCol w:w="4873"/>
+        <w:gridCol w:w="2450"/>
+        <w:gridCol w:w="2450"/>
+        <w:gridCol w:w="999"/>
       </w:tblGrid>
       <w:tr>
         <w:trPr>
@@ -426,7 +426,7 @@
         </w:trPr>
         <w:tc>
           <w:tcPr>
-            <w:tcW w:w="4673" w:type="dxa"/>
+            <w:tcW w:w="4873" w:type="dxa"/>
             <w:tcBorders>
               <w:top w:val="single" w:color="000000" w:themeColor="text1" w:sz="4" w:space="0"/>
               <w:left w:val="single" w:color="000000" w:themeColor="text1" w:sz="4" w:space="0"/>
@@ -528,7 +528,7 @@
         </w:tc>
         <w:tc>
           <w:tcPr>
-            <w:tcW w:w="2384" w:type="dxa"/>
+            <w:tcW w:w="2450" w:type="dxa"/>
             <w:tcBorders>
               <w:top w:val="single" w:color="000000" w:themeColor="text1" w:sz="4" w:space="0"/>
               <w:left w:val="single" w:color="000000" w:themeColor="text1" w:sz="4" w:space="0"/>
@@ -610,7 +610,7 @@
         </w:tc>
         <w:tc>
           <w:tcPr>
-            <w:tcW w:w="2384" w:type="dxa"/>
+            <w:tcW w:w="2450" w:type="dxa"/>
             <w:tcBorders>
               <w:top w:val="single" w:color="000000" w:themeColor="text1" w:sz="4" w:space="0"/>
               <w:left w:val="single" w:color="000000" w:themeColor="text1" w:sz="4" w:space="0"/>
@@ -723,7 +723,7 @@
         </w:tc>
         <w:tc>
           <w:tcPr>
-            <w:tcW w:w="991" w:type="dxa"/>
+            <w:tcW w:w="999" w:type="dxa"/>
             <w:tcBorders>
               <w:top w:val="single" w:color="000000" w:themeColor="text1" w:sz="4" w:space="0"/>
               <w:left w:val="single" w:color="000000" w:themeColor="text1" w:sz="4" w:space="0"/>
@@ -798,7 +798,7 @@
         </w:trPr>
         <w:tc>
           <w:tcPr>
-            <w:tcW w:w="4673" w:type="dxa"/>
+            <w:tcW w:w="4873" w:type="dxa"/>
             <w:tcBorders>
               <w:top w:val="single" w:color="000000" w:themeColor="text1" w:sz="4" w:space="0"/>
               <w:left w:val="single" w:color="000000" w:themeColor="text1" w:sz="4" w:space="0"/>
@@ -890,7 +890,7 @@
         </w:tc>
         <w:tc>
           <w:tcPr>
-            <w:tcW w:w="2384" w:type="dxa"/>
+            <w:tcW w:w="2450" w:type="dxa"/>
             <w:tcBorders>
               <w:top w:val="single" w:color="000000" w:themeColor="text1" w:sz="4" w:space="0"/>
               <w:left w:val="single" w:color="000000" w:themeColor="text1" w:sz="4" w:space="0"/>
@@ -933,7 +933,7 @@
         </w:tc>
         <w:tc>
           <w:tcPr>
-            <w:tcW w:w="2384" w:type="dxa"/>
+            <w:tcW w:w="2450" w:type="dxa"/>
             <w:tcBorders>
               <w:top w:val="single" w:color="000000" w:themeColor="text1" w:sz="4" w:space="0"/>
               <w:left w:val="single" w:color="000000" w:themeColor="text1" w:sz="4" w:space="0"/>
@@ -975,7 +975,7 @@
         </w:tc>
         <w:tc>
           <w:tcPr>
-            <w:tcW w:w="991" w:type="dxa"/>
+            <w:tcW w:w="999" w:type="dxa"/>
             <w:tcBorders>
               <w:top w:val="single" w:color="000000" w:themeColor="text1" w:sz="4" w:space="0"/>
               <w:left w:val="single" w:color="000000" w:themeColor="text1" w:sz="4" w:space="0"/>
@@ -1025,7 +1025,7 @@
         </w:trPr>
         <w:tc>
           <w:tcPr>
-            <w:tcW w:w="4673" w:type="dxa"/>
+            <w:tcW w:w="4873" w:type="dxa"/>
             <w:tcBorders>
               <w:top w:val="single" w:color="000000" w:themeColor="text1" w:sz="4" w:space="0"/>
               <w:left w:val="single" w:color="000000" w:themeColor="text1" w:sz="4" w:space="0"/>
@@ -1130,7 +1130,7 @@
         </w:tc>
         <w:tc>
           <w:tcPr>
-            <w:tcW w:w="2384" w:type="dxa"/>
+            <w:tcW w:w="2450" w:type="dxa"/>
             <w:tcBorders>
               <w:top w:val="single" w:color="000000" w:themeColor="text1" w:sz="4" w:space="0"/>
               <w:left w:val="single" w:color="000000" w:themeColor="text1" w:sz="4" w:space="0"/>
@@ -1184,7 +1184,7 @@
         </w:tc>
         <w:tc>
           <w:tcPr>
-            <w:tcW w:w="2384" w:type="dxa"/>
+            <w:tcW w:w="2450" w:type="dxa"/>
             <w:tcBorders>
               <w:top w:val="single" w:color="000000" w:themeColor="text1" w:sz="4" w:space="0"/>
               <w:left w:val="single" w:color="000000" w:themeColor="text1" w:sz="4" w:space="0"/>
@@ -1237,7 +1237,7 @@
         </w:tc>
         <w:tc>
           <w:tcPr>
-            <w:tcW w:w="991" w:type="dxa"/>
+            <w:tcW w:w="999" w:type="dxa"/>
             <w:tcBorders>
               <w:top w:val="single" w:color="000000" w:themeColor="text1" w:sz="4" w:space="0"/>
               <w:left w:val="single" w:color="000000" w:themeColor="text1" w:sz="4" w:space="0"/>
@@ -1297,7 +1297,7 @@
         </w:trPr>
         <w:tc>
           <w:tcPr>
-            <w:tcW w:w="4673" w:type="dxa"/>
+            <w:tcW w:w="4873" w:type="dxa"/>
             <w:tcBorders>
               <w:top w:val="single" w:color="000000" w:themeColor="text1" w:sz="4" w:space="0"/>
               <w:left w:val="single" w:color="000000" w:themeColor="text1" w:sz="4" w:space="0"/>
@@ -1375,7 +1375,7 @@
         </w:tc>
         <w:tc>
           <w:tcPr>
-            <w:tcW w:w="2384" w:type="dxa"/>
+            <w:tcW w:w="2450" w:type="dxa"/>
             <w:tcBorders>
               <w:top w:val="single" w:color="000000" w:themeColor="text1" w:sz="4" w:space="0"/>
               <w:left w:val="single" w:color="000000" w:themeColor="text1" w:sz="4" w:space="0"/>
@@ -1418,7 +1418,7 @@
         </w:tc>
         <w:tc>
           <w:tcPr>
-            <w:tcW w:w="2384" w:type="dxa"/>
+            <w:tcW w:w="2450" w:type="dxa"/>
             <w:tcBorders>
               <w:top w:val="single" w:color="000000" w:themeColor="text1" w:sz="4" w:space="0"/>
               <w:left w:val="single" w:color="000000" w:themeColor="text1" w:sz="4" w:space="0"/>
@@ -1460,7 +1460,7 @@
         </w:tc>
         <w:tc>
           <w:tcPr>
-            <w:tcW w:w="991" w:type="dxa"/>
+            <w:tcW w:w="999" w:type="dxa"/>
             <w:tcBorders>
               <w:top w:val="single" w:color="000000" w:themeColor="text1" w:sz="4" w:space="0"/>
               <w:left w:val="single" w:color="000000" w:themeColor="text1" w:sz="4" w:space="0"/>
@@ -1949,7 +1949,7 @@
       <w:headerReference w:type="default" r:id="rId8"/>
       <w:footerReference w:type="default" r:id="rId9"/>
       <w:pgSz w:w="11906" w:h="16838" w:orient="portrait"/>
-      <w:pgMar w:top="964" w:right="737" w:bottom="964" w:left="737" w:header="624" w:footer="680" w:gutter="0"/>
+      <w:pgMar w:top="964" w:right="567" w:bottom="964" w:left="567" w:header="624" w:footer="680" w:gutter="0"/>
       <w:cols w:space="708"/>
       <w:docGrid w:linePitch="326"/>
     </w:sectPr>

</xml_diff>

<commit_message>
fix(certs): +2mm Method column from Requirement/Result (-1mm each)
</commit_message>
<xml_diff>
--- a/mbr/templates/cert_master_template.docx
+++ b/mbr/templates/cert_master_template.docx
@@ -415,9 +415,9 @@
       </w:tblPr>
       <w:tblGrid>
         <w:gridCol w:w="4873"/>
-        <w:gridCol w:w="2450"/>
-        <w:gridCol w:w="2450"/>
-        <w:gridCol w:w="999"/>
+        <w:gridCol w:w="2393"/>
+        <w:gridCol w:w="2393"/>
+        <w:gridCol w:w="1113"/>
       </w:tblGrid>
       <w:tr>
         <w:trPr>
@@ -528,7 +528,7 @@
         </w:tc>
         <w:tc>
           <w:tcPr>
-            <w:tcW w:w="2450" w:type="dxa"/>
+            <w:tcW w:w="2393" w:type="dxa"/>
             <w:tcBorders>
               <w:top w:val="single" w:color="000000" w:themeColor="text1" w:sz="4" w:space="0"/>
               <w:left w:val="single" w:color="000000" w:themeColor="text1" w:sz="4" w:space="0"/>
@@ -610,7 +610,7 @@
         </w:tc>
         <w:tc>
           <w:tcPr>
-            <w:tcW w:w="2450" w:type="dxa"/>
+            <w:tcW w:w="2393" w:type="dxa"/>
             <w:tcBorders>
               <w:top w:val="single" w:color="000000" w:themeColor="text1" w:sz="4" w:space="0"/>
               <w:left w:val="single" w:color="000000" w:themeColor="text1" w:sz="4" w:space="0"/>
@@ -723,7 +723,7 @@
         </w:tc>
         <w:tc>
           <w:tcPr>
-            <w:tcW w:w="999" w:type="dxa"/>
+            <w:tcW w:w="1113" w:type="dxa"/>
             <w:tcBorders>
               <w:top w:val="single" w:color="000000" w:themeColor="text1" w:sz="4" w:space="0"/>
               <w:left w:val="single" w:color="000000" w:themeColor="text1" w:sz="4" w:space="0"/>
@@ -890,7 +890,7 @@
         </w:tc>
         <w:tc>
           <w:tcPr>
-            <w:tcW w:w="2450" w:type="dxa"/>
+            <w:tcW w:w="2393" w:type="dxa"/>
             <w:tcBorders>
               <w:top w:val="single" w:color="000000" w:themeColor="text1" w:sz="4" w:space="0"/>
               <w:left w:val="single" w:color="000000" w:themeColor="text1" w:sz="4" w:space="0"/>
@@ -933,7 +933,7 @@
         </w:tc>
         <w:tc>
           <w:tcPr>
-            <w:tcW w:w="2450" w:type="dxa"/>
+            <w:tcW w:w="2393" w:type="dxa"/>
             <w:tcBorders>
               <w:top w:val="single" w:color="000000" w:themeColor="text1" w:sz="4" w:space="0"/>
               <w:left w:val="single" w:color="000000" w:themeColor="text1" w:sz="4" w:space="0"/>
@@ -975,7 +975,7 @@
         </w:tc>
         <w:tc>
           <w:tcPr>
-            <w:tcW w:w="999" w:type="dxa"/>
+            <w:tcW w:w="1113" w:type="dxa"/>
             <w:tcBorders>
               <w:top w:val="single" w:color="000000" w:themeColor="text1" w:sz="4" w:space="0"/>
               <w:left w:val="single" w:color="000000" w:themeColor="text1" w:sz="4" w:space="0"/>
@@ -1130,7 +1130,7 @@
         </w:tc>
         <w:tc>
           <w:tcPr>
-            <w:tcW w:w="2450" w:type="dxa"/>
+            <w:tcW w:w="2393" w:type="dxa"/>
             <w:tcBorders>
               <w:top w:val="single" w:color="000000" w:themeColor="text1" w:sz="4" w:space="0"/>
               <w:left w:val="single" w:color="000000" w:themeColor="text1" w:sz="4" w:space="0"/>
@@ -1184,7 +1184,7 @@
         </w:tc>
         <w:tc>
           <w:tcPr>
-            <w:tcW w:w="2450" w:type="dxa"/>
+            <w:tcW w:w="2393" w:type="dxa"/>
             <w:tcBorders>
               <w:top w:val="single" w:color="000000" w:themeColor="text1" w:sz="4" w:space="0"/>
               <w:left w:val="single" w:color="000000" w:themeColor="text1" w:sz="4" w:space="0"/>
@@ -1237,7 +1237,7 @@
         </w:tc>
         <w:tc>
           <w:tcPr>
-            <w:tcW w:w="999" w:type="dxa"/>
+            <w:tcW w:w="1113" w:type="dxa"/>
             <w:tcBorders>
               <w:top w:val="single" w:color="000000" w:themeColor="text1" w:sz="4" w:space="0"/>
               <w:left w:val="single" w:color="000000" w:themeColor="text1" w:sz="4" w:space="0"/>
@@ -1375,7 +1375,7 @@
         </w:tc>
         <w:tc>
           <w:tcPr>
-            <w:tcW w:w="2450" w:type="dxa"/>
+            <w:tcW w:w="2393" w:type="dxa"/>
             <w:tcBorders>
               <w:top w:val="single" w:color="000000" w:themeColor="text1" w:sz="4" w:space="0"/>
               <w:left w:val="single" w:color="000000" w:themeColor="text1" w:sz="4" w:space="0"/>
@@ -1418,7 +1418,7 @@
         </w:tc>
         <w:tc>
           <w:tcPr>
-            <w:tcW w:w="2450" w:type="dxa"/>
+            <w:tcW w:w="2393" w:type="dxa"/>
             <w:tcBorders>
               <w:top w:val="single" w:color="000000" w:themeColor="text1" w:sz="4" w:space="0"/>
               <w:left w:val="single" w:color="000000" w:themeColor="text1" w:sz="4" w:space="0"/>
@@ -1460,7 +1460,7 @@
         </w:tc>
         <w:tc>
           <w:tcPr>
-            <w:tcW w:w="999" w:type="dxa"/>
+            <w:tcW w:w="1113" w:type="dxa"/>
             <w:tcBorders>
               <w:top w:val="single" w:color="000000" w:themeColor="text1" w:sz="4" w:space="0"/>
               <w:left w:val="single" w:color="000000" w:themeColor="text1" w:sz="4" w:space="0"/>

</xml_diff>

<commit_message>
fix(certs): -1mm from Result (col 3) to widen Method (col 4) to 20.6mm
</commit_message>
<xml_diff>
--- a/mbr/templates/cert_master_template.docx
+++ b/mbr/templates/cert_master_template.docx
@@ -416,8 +416,8 @@
       <w:tblGrid>
         <w:gridCol w:w="4873"/>
         <w:gridCol w:w="2393"/>
-        <w:gridCol w:w="2393"/>
-        <w:gridCol w:w="1113"/>
+        <w:gridCol w:w="2336"/>
+        <w:gridCol w:w="1170"/>
       </w:tblGrid>
       <w:tr>
         <w:trPr>
@@ -610,7 +610,7 @@
         </w:tc>
         <w:tc>
           <w:tcPr>
-            <w:tcW w:w="2393" w:type="dxa"/>
+            <w:tcW w:w="2336" w:type="dxa"/>
             <w:tcBorders>
               <w:top w:val="single" w:color="000000" w:themeColor="text1" w:sz="4" w:space="0"/>
               <w:left w:val="single" w:color="000000" w:themeColor="text1" w:sz="4" w:space="0"/>
@@ -723,7 +723,7 @@
         </w:tc>
         <w:tc>
           <w:tcPr>
-            <w:tcW w:w="1113" w:type="dxa"/>
+            <w:tcW w:w="1170" w:type="dxa"/>
             <w:tcBorders>
               <w:top w:val="single" w:color="000000" w:themeColor="text1" w:sz="4" w:space="0"/>
               <w:left w:val="single" w:color="000000" w:themeColor="text1" w:sz="4" w:space="0"/>
@@ -933,7 +933,7 @@
         </w:tc>
         <w:tc>
           <w:tcPr>
-            <w:tcW w:w="2393" w:type="dxa"/>
+            <w:tcW w:w="2336" w:type="dxa"/>
             <w:tcBorders>
               <w:top w:val="single" w:color="000000" w:themeColor="text1" w:sz="4" w:space="0"/>
               <w:left w:val="single" w:color="000000" w:themeColor="text1" w:sz="4" w:space="0"/>
@@ -975,7 +975,7 @@
         </w:tc>
         <w:tc>
           <w:tcPr>
-            <w:tcW w:w="1113" w:type="dxa"/>
+            <w:tcW w:w="1170" w:type="dxa"/>
             <w:tcBorders>
               <w:top w:val="single" w:color="000000" w:themeColor="text1" w:sz="4" w:space="0"/>
               <w:left w:val="single" w:color="000000" w:themeColor="text1" w:sz="4" w:space="0"/>
@@ -1184,7 +1184,7 @@
         </w:tc>
         <w:tc>
           <w:tcPr>
-            <w:tcW w:w="2393" w:type="dxa"/>
+            <w:tcW w:w="2336" w:type="dxa"/>
             <w:tcBorders>
               <w:top w:val="single" w:color="000000" w:themeColor="text1" w:sz="4" w:space="0"/>
               <w:left w:val="single" w:color="000000" w:themeColor="text1" w:sz="4" w:space="0"/>
@@ -1237,7 +1237,7 @@
         </w:tc>
         <w:tc>
           <w:tcPr>
-            <w:tcW w:w="1113" w:type="dxa"/>
+            <w:tcW w:w="1170" w:type="dxa"/>
             <w:tcBorders>
               <w:top w:val="single" w:color="000000" w:themeColor="text1" w:sz="4" w:space="0"/>
               <w:left w:val="single" w:color="000000" w:themeColor="text1" w:sz="4" w:space="0"/>
@@ -1418,7 +1418,7 @@
         </w:tc>
         <w:tc>
           <w:tcPr>
-            <w:tcW w:w="2393" w:type="dxa"/>
+            <w:tcW w:w="2336" w:type="dxa"/>
             <w:tcBorders>
               <w:top w:val="single" w:color="000000" w:themeColor="text1" w:sz="4" w:space="0"/>
               <w:left w:val="single" w:color="000000" w:themeColor="text1" w:sz="4" w:space="0"/>
@@ -1460,7 +1460,7 @@
         </w:tc>
         <w:tc>
           <w:tcPr>
-            <w:tcW w:w="1113" w:type="dxa"/>
+            <w:tcW w:w="1170" w:type="dxa"/>
             <w:tcBorders>
               <w:top w:val="single" w:color="000000" w:themeColor="text1" w:sz="4" w:space="0"/>
               <w:left w:val="single" w:color="000000" w:themeColor="text1" w:sz="4" w:space="0"/>

</xml_diff>

<commit_message>
chore(certs): align param table with text margins; left-align all columns
Set tblInd=0 so the parameter table's left/right edges match the body
text margins. Replace all w:jc=center with w:jc=left inside the table
(header + data rows) so every column content aligns left.

Co-Authored-By: Claude Opus 4.7 (1M context) <noreply@anthropic.com>
</commit_message>
<xml_diff>
--- a/mbr/templates/cert_master_template.docx
+++ b/mbr/templates/cert_master_template.docx
@@ -405,7 +405,7 @@
     <w:tbl>
       <w:tblPr>
         <w:tblW w:w="10772" w:type="dxa"/>
-        <w:tblInd w:w="60" w:type="dxa"/>
+        <w:tblInd w:w="0" w:type="dxa"/>
         <w:tblLayout w:type="fixed"/>
         <w:tblCellMar>
           <w:left w:w="10" w:type="dxa"/>
@@ -444,7 +444,7 @@
             <w:pPr>
               <w:pStyle w:val="Standard"/>
               <w:snapToGrid w:val="0"/>
-              <w:jc w:val="center"/>
+              <w:jc w:val="left"/>
               <w:rPr>
                 <w:rFonts w:ascii="TeX Gyre Bonum" w:hAnsi="TeX Gyre Bonum"/>
                 <w:b w:val="1"/>
@@ -492,7 +492,7 @@
             <w:pPr>
               <w:pStyle w:val="Standard"/>
               <w:snapToGrid w:val="0"/>
-              <w:jc w:val="center"/>
+              <w:jc w:val="left"/>
               <w:rPr>
                 <w:rFonts w:ascii="TeX Gyre Bonum" w:hAnsi="TeX Gyre Bonum"/>
                 <w:b w:val="1"/>
@@ -547,7 +547,7 @@
               <w:pStyle w:val="Standard"/>
               <w:snapToGrid w:val="0"/>
               <w:ind w:right="72"/>
-              <w:jc w:val="center"/>
+              <w:jc w:val="left"/>
               <w:rPr>
                 <w:rFonts w:ascii="TeX Gyre Bonum" w:hAnsi="TeX Gyre Bonum"/>
                 <w:b w:val="1"/>
@@ -574,7 +574,7 @@
               <w:pStyle w:val="Standard"/>
               <w:snapToGrid w:val="0"/>
               <w:ind w:right="72"/>
-              <w:jc w:val="center"/>
+              <w:jc w:val="left"/>
               <w:rPr>
                 <w:rFonts w:ascii="TeX Gyre Bonum" w:hAnsi="TeX Gyre Bonum"/>
                 <w:b w:val="1"/>
@@ -628,7 +628,7 @@
             <w:pPr>
               <w:pStyle w:val="Standard"/>
               <w:snapToGrid w:val="0"/>
-              <w:jc w:val="center"/>
+              <w:jc w:val="left"/>
               <w:rPr>
                 <w:rFonts w:ascii="TeX Gyre Bonum" w:hAnsi="TeX Gyre Bonum"/>
                 <w:b w:val="1"/>
@@ -687,7 +687,7 @@
             <w:pPr>
               <w:pStyle w:val="Standard"/>
               <w:snapToGrid w:val="0"/>
-              <w:jc w:val="center"/>
+              <w:jc w:val="left"/>
               <w:rPr>
                 <w:rFonts w:ascii="TeX Gyre Bonum" w:hAnsi="TeX Gyre Bonum"/>
                 <w:b w:val="1"/>
@@ -742,7 +742,7 @@
             <w:pPr>
               <w:pStyle w:val="Standard"/>
               <w:snapToGrid w:val="0"/>
-              <w:jc w:val="center"/>
+              <w:jc w:val="left"/>
               <w:rPr>
                 <w:rFonts w:ascii="TeX Gyre Bonum" w:hAnsi="TeX Gyre Bonum"/>
                 <w:b w:val="1"/>
@@ -768,7 +768,7 @@
             <w:pPr>
               <w:pStyle w:val="Standard"/>
               <w:snapToGrid w:val="0"/>
-              <w:jc w:val="center"/>
+              <w:jc w:val="left"/>
               <w:rPr>
                 <w:rFonts w:ascii="TeX Gyre Bonum" w:hAnsi="TeX Gyre Bonum"/>
                 <w:b w:val="1"/>
@@ -816,7 +816,7 @@
             <w:pPr>
               <w:pStyle w:val="Standard"/>
               <w:snapToGrid w:val="0"/>
-              <w:jc w:val="center"/>
+              <w:jc w:val="left"/>
               <w:rPr>
                 <w:rFonts w:ascii="TeX Gyre Bonum" w:hAnsi="TeX Gyre Bonum"/>
                 <w:sz w:val="22"/>
@@ -878,7 +878,7 @@
             <w:pPr>
               <w:pStyle w:val="Standard"/>
               <w:snapToGrid w:val="0"/>
-              <w:jc w:val="center"/>
+              <w:jc w:val="left"/>
               <w:rPr>
                 <w:rFonts w:ascii="TeX Gyre Bonum" w:hAnsi="TeX Gyre Bonum"/>
                 <w:sz w:val="22"/>
@@ -908,7 +908,7 @@
             <w:pPr>
               <w:pStyle w:val="Standard"/>
               <w:snapToGrid w:val="0"/>
-              <w:jc w:val="center"/>
+              <w:jc w:val="left"/>
               <w:rPr>
                 <w:rFonts w:ascii="TeX Gyre Bonum" w:hAnsi="TeX Gyre Bonum"/>
                 <w:sz w:val="22"/>
@@ -921,7 +921,7 @@
             <w:pPr>
               <w:pStyle w:val="Standard"/>
               <w:snapToGrid w:val="0"/>
-              <w:jc w:val="center"/>
+              <w:jc w:val="left"/>
               <w:rPr>
                 <w:rFonts w:ascii="TeX Gyre Bonum" w:hAnsi="TeX Gyre Bonum"/>
                 <w:sz w:val="22"/>
@@ -951,7 +951,7 @@
             <w:pPr>
               <w:pStyle w:val="Standard"/>
               <w:snapToGrid w:val="0"/>
-              <w:jc w:val="center"/>
+              <w:jc w:val="left"/>
               <w:rPr>
                 <w:rFonts w:ascii="TeX Gyre Bonum" w:hAnsi="TeX Gyre Bonum"/>
                 <w:sz w:val="22"/>
@@ -963,7 +963,7 @@
             <w:pPr>
               <w:pStyle w:val="Standard"/>
               <w:snapToGrid w:val="0"/>
-              <w:jc w:val="center"/>
+              <w:jc w:val="left"/>
               <w:rPr>
                 <w:rFonts w:ascii="TeX Gyre Bonum" w:hAnsi="TeX Gyre Bonum"/>
                 <w:sz w:val="22"/>
@@ -994,7 +994,7 @@
             <w:pPr>
               <w:pStyle w:val="Standard"/>
               <w:snapToGrid w:val="0"/>
-              <w:jc w:val="center"/>
+              <w:jc w:val="left"/>
               <w:rPr>
                 <w:rFonts w:ascii="TeX Gyre Bonum" w:hAnsi="TeX Gyre Bonum"/>
                 <w:sz w:val="22"/>
@@ -1007,7 +1007,7 @@
             <w:pPr>
               <w:pStyle w:val="Standard"/>
               <w:snapToGrid w:val="0"/>
-              <w:jc w:val="center"/>
+              <w:jc w:val="left"/>
               <w:rPr>
                 <w:rFonts w:ascii="TeX Gyre Bonum" w:hAnsi="TeX Gyre Bonum"/>
                 <w:sz w:val="22"/>
@@ -1043,7 +1043,7 @@
             <w:pPr>
               <w:pStyle w:val="Standard"/>
               <w:snapToGrid w:val="0"/>
-              <w:jc w:val="center"/>
+              <w:jc w:val="left"/>
               <w:rPr>
                 <w:rFonts w:ascii="TeX Gyre Bonum" w:hAnsi="TeX Gyre Bonum"/>
                 <w:sz w:val="22"/>
@@ -1065,7 +1065,7 @@
             <w:pPr>
               <w:pStyle w:val="Standard"/>
               <w:snapToGrid w:val="0"/>
-              <w:jc w:val="center"/>
+              <w:jc w:val="left"/>
               <w:rPr>
                 <w:rFonts w:ascii="TeX Gyre Bonum" w:hAnsi="TeX Gyre Bonum"/>
                 <w:sz w:val="22"/>
@@ -1087,7 +1087,7 @@
             <w:pPr>
               <w:pStyle w:val="Standard"/>
               <w:snapToGrid w:val="0"/>
-              <w:jc w:val="center"/>
+              <w:jc w:val="left"/>
               <w:rPr>
                 <w:rFonts w:ascii="TeX Gyre Bonum" w:hAnsi="TeX Gyre Bonum"/>
                 <w:sz w:val="22"/>
@@ -1109,7 +1109,7 @@
             <w:pPr>
               <w:pStyle w:val="Standard"/>
               <w:snapToGrid w:val="0"/>
-              <w:jc w:val="center"/>
+              <w:jc w:val="left"/>
               <w:rPr>
                 <w:rFonts w:ascii="TeX Gyre Bonum" w:hAnsi="TeX Gyre Bonum"/>
                 <w:sz w:val="22"/>
@@ -1148,7 +1148,7 @@
             <w:pPr>
               <w:pStyle w:val="Standard"/>
               <w:snapToGrid w:val="0"/>
-              <w:jc w:val="center"/>
+              <w:jc w:val="left"/>
               <w:rPr>
                 <w:rFonts w:ascii="TeX Gyre Bonum" w:hAnsi="TeX Gyre Bonum"/>
                 <w:sz w:val="22"/>
@@ -1202,7 +1202,7 @@
             <w:pPr>
               <w:pStyle w:val="Standard"/>
               <w:snapToGrid w:val="0"/>
-              <w:jc w:val="center"/>
+              <w:jc w:val="left"/>
               <w:rPr>
                 <w:rFonts w:ascii="TeX Gyre Bonum" w:hAnsi="TeX Gyre Bonum"/>
                 <w:sz w:val="22"/>
@@ -1256,7 +1256,7 @@
             <w:pPr>
               <w:pStyle w:val="Standard"/>
               <w:snapToGrid w:val="0"/>
-              <w:jc w:val="center"/>
+              <w:jc w:val="left"/>
               <w:rPr>
                 <w:rFonts w:ascii="TeX Gyre Bonum" w:hAnsi="TeX Gyre Bonum"/>
                 <w:sz w:val="22"/>
@@ -1315,7 +1315,7 @@
             <w:pPr>
               <w:pStyle w:val="Standard"/>
               <w:snapToGrid w:val="0"/>
-              <w:jc w:val="center"/>
+              <w:jc w:val="left"/>
               <w:rPr>
                 <w:rFonts w:ascii="TeX Gyre Bonum" w:hAnsi="TeX Gyre Bonum"/>
                 <w:sz w:val="22"/>
@@ -1363,7 +1363,7 @@
             <w:pPr>
               <w:pStyle w:val="Standard"/>
               <w:snapToGrid w:val="0"/>
-              <w:jc w:val="center"/>
+              <w:jc w:val="left"/>
               <w:rPr>
                 <w:rFonts w:ascii="TeX Gyre Bonum" w:hAnsi="TeX Gyre Bonum"/>
                 <w:sz w:val="22"/>
@@ -1393,7 +1393,7 @@
             <w:pPr>
               <w:pStyle w:val="Standard"/>
               <w:snapToGrid w:val="0"/>
-              <w:jc w:val="center"/>
+              <w:jc w:val="left"/>
               <w:rPr>
                 <w:rFonts w:ascii="TeX Gyre Bonum" w:hAnsi="TeX Gyre Bonum"/>
                 <w:sz w:val="22"/>
@@ -1406,7 +1406,7 @@
             <w:pPr>
               <w:pStyle w:val="Standard"/>
               <w:snapToGrid w:val="0"/>
-              <w:jc w:val="center"/>
+              <w:jc w:val="left"/>
               <w:rPr>
                 <w:rFonts w:ascii="TeX Gyre Bonum" w:hAnsi="TeX Gyre Bonum"/>
                 <w:sz w:val="22"/>
@@ -1436,7 +1436,7 @@
             <w:pPr>
               <w:pStyle w:val="Standard"/>
               <w:snapToGrid w:val="0"/>
-              <w:jc w:val="center"/>
+              <w:jc w:val="left"/>
               <w:rPr>
                 <w:rFonts w:ascii="TeX Gyre Bonum" w:hAnsi="TeX Gyre Bonum"/>
                 <w:sz w:val="22"/>
@@ -1448,7 +1448,7 @@
             <w:pPr>
               <w:pStyle w:val="Standard"/>
               <w:snapToGrid w:val="0"/>
-              <w:jc w:val="center"/>
+              <w:jc w:val="left"/>
               <w:rPr>
                 <w:rFonts w:ascii="TeX Gyre Bonum" w:hAnsi="TeX Gyre Bonum"/>
                 <w:sz w:val="22"/>
@@ -1479,7 +1479,7 @@
             <w:pPr>
               <w:pStyle w:val="Standard"/>
               <w:snapToGrid w:val="0"/>
-              <w:jc w:val="center"/>
+              <w:jc w:val="left"/>
               <w:rPr>
                 <w:rFonts w:ascii="TeX Gyre Bonum" w:hAnsi="TeX Gyre Bonum"/>
                 <w:sz w:val="22"/>
@@ -1492,7 +1492,7 @@
             <w:pPr>
               <w:pStyle w:val="Standard"/>
               <w:snapToGrid w:val="0"/>
-              <w:jc w:val="center"/>
+              <w:jc w:val="left"/>
               <w:rPr>
                 <w:rFonts w:ascii="TeX Gyre Bonum" w:hAnsi="TeX Gyre Bonum"/>
                 <w:sz w:val="22"/>

</xml_diff>

<commit_message>
chore(certs): match header/footer table widths to body width
Header and footer tables were 9684/9639 twips wide with tblInd=60,
while the body params table spans 10772 at tblInd=0. The visible blue
frame around the logo/product name and the blue footer rule ended up
~2 cm narrower than the body. Stretch both header and footer tables
to 10772 at tblInd=0: header's second column absorbs the extra width;
footer columns become equal halves (5386+5386).

Co-Authored-By: Claude Opus 4.7 (1M context) <noreply@anthropic.com>
</commit_message>
<xml_diff>
--- a/mbr/templates/cert_master_template.docx
+++ b/mbr/templates/cert_master_template.docx
@@ -1997,8 +1997,8 @@
   </w:p>
   <w:tbl>
     <w:tblPr>
-      <w:tblW w:w="9639" w:type="dxa"/>
-      <w:tblInd w:w="60" w:type="dxa"/>
+      <w:tblW w:w="10772" w:type="dxa"/>
+      <w:tblInd w:w="0" w:type="dxa"/>
       <w:tblLayout w:type="fixed"/>
       <w:tblCellMar>
         <w:left w:w="10" w:type="dxa"/>
@@ -2007,13 +2007,13 @@
       <w:tblLook w:val="0000" w:firstRow="0" w:lastRow="0" w:firstColumn="0" w:lastColumn="0" w:noHBand="0" w:noVBand="0"/>
     </w:tblPr>
     <w:tblGrid>
-      <w:gridCol w:w="4819"/>
-      <w:gridCol w:w="4820"/>
+      <w:gridCol w:w="5386"/>
+      <w:gridCol w:w="5386"/>
     </w:tblGrid>
     <w:tr>
       <w:tc>
         <w:tcPr>
-          <w:tcW w:w="4819" w:type="dxa"/>
+          <w:tcW w:w="5386" w:type="dxa"/>
           <w:tcBorders>
             <w:top w:val="single" w:color="0000FF" w:sz="4" w:space="0"/>
           </w:tcBorders>
@@ -2085,7 +2085,7 @@
       </w:tc>
       <w:tc>
         <w:tcPr>
-          <w:tcW w:w="4820" w:type="dxa"/>
+          <w:tcW w:w="5386" w:type="dxa"/>
           <w:tcBorders>
             <w:top w:val="single" w:color="0000FF" w:sz="4" w:space="0"/>
           </w:tcBorders>
@@ -2194,8 +2194,8 @@
 <w:hdr xmlns:wpc="http://schemas.microsoft.com/office/word/2010/wordprocessingCanvas" xmlns:cx="http://schemas.microsoft.com/office/drawing/2014/chartex" xmlns:cx1="http://schemas.microsoft.com/office/drawing/2015/9/8/chartex" xmlns:cx2="http://schemas.microsoft.com/office/drawing/2015/10/21/chartex" xmlns:cx3="http://schemas.microsoft.com/office/drawing/2016/5/9/chartex" xmlns:cx4="http://schemas.microsoft.com/office/drawing/2016/5/10/chartex" xmlns:cx5="http://schemas.microsoft.com/office/drawing/2016/5/11/chartex" xmlns:cx6="http://schemas.microsoft.com/office/drawing/2016/5/12/chartex" xmlns:cx7="http://schemas.microsoft.com/office/drawing/2016/5/13/chartex" xmlns:cx8="http://schemas.microsoft.com/office/drawing/2016/5/14/chartex" xmlns:mc="http://schemas.openxmlformats.org/markup-compatibility/2006" xmlns:aink="http://schemas.microsoft.com/office/drawing/2016/ink" xmlns:am3d="http://schemas.microsoft.com/office/drawing/2017/model3d" xmlns:o="urn:schemas-microsoft-com:office:office" xmlns:oel="http://schemas.microsoft.com/office/2019/extlst" xmlns:r="http://schemas.openxmlformats.org/officeDocument/2006/relationships" xmlns:m="http://schemas.openxmlformats.org/officeDocument/2006/math" xmlns:v="urn:schemas-microsoft-com:vml" xmlns:wp14="http://schemas.microsoft.com/office/word/2010/wordprocessingDrawing" xmlns:wp="http://schemas.openxmlformats.org/drawingml/2006/wordprocessingDrawing" xmlns:w10="urn:schemas-microsoft-com:office:word" xmlns:w="http://schemas.openxmlformats.org/wordprocessingml/2006/main" xmlns:w14="http://schemas.microsoft.com/office/word/2010/wordml" xmlns:w15="http://schemas.microsoft.com/office/word/2012/wordml" xmlns:w16cex="http://schemas.microsoft.com/office/word/2018/wordml/cex" xmlns:w16cid="http://schemas.microsoft.com/office/word/2016/wordml/cid" xmlns:w16="http://schemas.microsoft.com/office/word/2018/wordml" xmlns:w16du="http://schemas.microsoft.com/office/word/2023/wordml/word16du" xmlns:w16sdtdh="http://schemas.microsoft.com/office/word/2020/wordml/sdtdatahash" xmlns:w16sdtfl="http://schemas.microsoft.com/office/word/2024/wordml/sdtformatlock" xmlns:w16se="http://schemas.microsoft.com/office/word/2015/wordml/symex" xmlns:wpg="http://schemas.microsoft.com/office/word/2010/wordprocessingGroup" xmlns:wpi="http://schemas.microsoft.com/office/word/2010/wordprocessingInk" xmlns:wne="http://schemas.microsoft.com/office/word/2006/wordml" xmlns:wps="http://schemas.microsoft.com/office/word/2010/wordprocessingShape" mc:Ignorable="w14 w15 w16se w16cid w16 w16cex w16sdtdh w16sdtfl w16du wp14">
   <w:tbl>
     <w:tblPr>
-      <w:tblW w:w="9684" w:type="dxa"/>
-      <w:tblInd w:w="60" w:type="dxa"/>
+      <w:tblW w:w="10772" w:type="dxa"/>
+      <w:tblInd w:w="0" w:type="dxa"/>
       <w:tblLayout w:type="fixed"/>
       <w:tblCellMar>
         <w:left w:w="10" w:type="dxa"/>
@@ -2205,7 +2205,7 @@
     </w:tblPr>
     <w:tblGrid>
       <w:gridCol w:w="2400"/>
-      <w:gridCol w:w="7284"/>
+      <w:gridCol w:w="8372"/>
     </w:tblGrid>
     <w:tr>
       <w:trPr>
@@ -2269,7 +2269,7 @@
       </w:tc>
       <w:tc>
         <w:tcPr>
-          <w:tcW w:w="7284" w:type="dxa"/>
+          <w:tcW w:w="8372" w:type="dxa"/>
           <w:tcBorders>
             <w:top w:val="single" w:color="0000FF" w:sz="4" w:space="0"/>
             <w:left w:val="single" w:color="0000FF" w:sz="4" w:space="0"/>

</xml_diff>

<commit_message>
chore(certs): widen result column at the expense of requirement/method
Result column was only 1170 twips (~2cm) which was tight for descriptive
values like "bezbarwna ciecz / colorless liquid". Shift 600 twips into
Wynik (1170 -> 1770), taking 300 each from Wymagania (2393 -> 2093) and
Metoda (2336 -> 2036). Total table width unchanged (10772).

Co-Authored-By: Claude Opus 4.7 (1M context) <noreply@anthropic.com>
</commit_message>
<xml_diff>
--- a/mbr/templates/cert_master_template.docx
+++ b/mbr/templates/cert_master_template.docx
@@ -415,9 +415,9 @@
       </w:tblPr>
       <w:tblGrid>
         <w:gridCol w:w="4873"/>
-        <w:gridCol w:w="2393"/>
-        <w:gridCol w:w="2336"/>
-        <w:gridCol w:w="1170"/>
+        <w:gridCol w:w="2093"/>
+        <w:gridCol w:w="2036"/>
+        <w:gridCol w:w="1770"/>
       </w:tblGrid>
       <w:tr>
         <w:trPr>
@@ -528,7 +528,7 @@
         </w:tc>
         <w:tc>
           <w:tcPr>
-            <w:tcW w:w="2393" w:type="dxa"/>
+            <w:tcW w:w="2093" w:type="dxa"/>
             <w:tcBorders>
               <w:top w:val="single" w:color="000000" w:themeColor="text1" w:sz="4" w:space="0"/>
               <w:left w:val="single" w:color="000000" w:themeColor="text1" w:sz="4" w:space="0"/>
@@ -610,7 +610,7 @@
         </w:tc>
         <w:tc>
           <w:tcPr>
-            <w:tcW w:w="2336" w:type="dxa"/>
+            <w:tcW w:w="2036" w:type="dxa"/>
             <w:tcBorders>
               <w:top w:val="single" w:color="000000" w:themeColor="text1" w:sz="4" w:space="0"/>
               <w:left w:val="single" w:color="000000" w:themeColor="text1" w:sz="4" w:space="0"/>
@@ -723,7 +723,7 @@
         </w:tc>
         <w:tc>
           <w:tcPr>
-            <w:tcW w:w="1170" w:type="dxa"/>
+            <w:tcW w:w="1770" w:type="dxa"/>
             <w:tcBorders>
               <w:top w:val="single" w:color="000000" w:themeColor="text1" w:sz="4" w:space="0"/>
               <w:left w:val="single" w:color="000000" w:themeColor="text1" w:sz="4" w:space="0"/>
@@ -890,7 +890,7 @@
         </w:tc>
         <w:tc>
           <w:tcPr>
-            <w:tcW w:w="2393" w:type="dxa"/>
+            <w:tcW w:w="2093" w:type="dxa"/>
             <w:tcBorders>
               <w:top w:val="single" w:color="000000" w:themeColor="text1" w:sz="4" w:space="0"/>
               <w:left w:val="single" w:color="000000" w:themeColor="text1" w:sz="4" w:space="0"/>
@@ -933,7 +933,7 @@
         </w:tc>
         <w:tc>
           <w:tcPr>
-            <w:tcW w:w="2336" w:type="dxa"/>
+            <w:tcW w:w="2036" w:type="dxa"/>
             <w:tcBorders>
               <w:top w:val="single" w:color="000000" w:themeColor="text1" w:sz="4" w:space="0"/>
               <w:left w:val="single" w:color="000000" w:themeColor="text1" w:sz="4" w:space="0"/>
@@ -975,7 +975,7 @@
         </w:tc>
         <w:tc>
           <w:tcPr>
-            <w:tcW w:w="1170" w:type="dxa"/>
+            <w:tcW w:w="1770" w:type="dxa"/>
             <w:tcBorders>
               <w:top w:val="single" w:color="000000" w:themeColor="text1" w:sz="4" w:space="0"/>
               <w:left w:val="single" w:color="000000" w:themeColor="text1" w:sz="4" w:space="0"/>
@@ -1130,7 +1130,7 @@
         </w:tc>
         <w:tc>
           <w:tcPr>
-            <w:tcW w:w="2393" w:type="dxa"/>
+            <w:tcW w:w="2093" w:type="dxa"/>
             <w:tcBorders>
               <w:top w:val="single" w:color="000000" w:themeColor="text1" w:sz="4" w:space="0"/>
               <w:left w:val="single" w:color="000000" w:themeColor="text1" w:sz="4" w:space="0"/>
@@ -1184,7 +1184,7 @@
         </w:tc>
         <w:tc>
           <w:tcPr>
-            <w:tcW w:w="2336" w:type="dxa"/>
+            <w:tcW w:w="2036" w:type="dxa"/>
             <w:tcBorders>
               <w:top w:val="single" w:color="000000" w:themeColor="text1" w:sz="4" w:space="0"/>
               <w:left w:val="single" w:color="000000" w:themeColor="text1" w:sz="4" w:space="0"/>
@@ -1237,7 +1237,7 @@
         </w:tc>
         <w:tc>
           <w:tcPr>
-            <w:tcW w:w="1170" w:type="dxa"/>
+            <w:tcW w:w="1770" w:type="dxa"/>
             <w:tcBorders>
               <w:top w:val="single" w:color="000000" w:themeColor="text1" w:sz="4" w:space="0"/>
               <w:left w:val="single" w:color="000000" w:themeColor="text1" w:sz="4" w:space="0"/>
@@ -1375,7 +1375,7 @@
         </w:tc>
         <w:tc>
           <w:tcPr>
-            <w:tcW w:w="2393" w:type="dxa"/>
+            <w:tcW w:w="2093" w:type="dxa"/>
             <w:tcBorders>
               <w:top w:val="single" w:color="000000" w:themeColor="text1" w:sz="4" w:space="0"/>
               <w:left w:val="single" w:color="000000" w:themeColor="text1" w:sz="4" w:space="0"/>
@@ -1418,7 +1418,7 @@
         </w:tc>
         <w:tc>
           <w:tcPr>
-            <w:tcW w:w="2336" w:type="dxa"/>
+            <w:tcW w:w="2036" w:type="dxa"/>
             <w:tcBorders>
               <w:top w:val="single" w:color="000000" w:themeColor="text1" w:sz="4" w:space="0"/>
               <w:left w:val="single" w:color="000000" w:themeColor="text1" w:sz="4" w:space="0"/>
@@ -1460,7 +1460,7 @@
         </w:tc>
         <w:tc>
           <w:tcPr>
-            <w:tcW w:w="1170" w:type="dxa"/>
+            <w:tcW w:w="1770" w:type="dxa"/>
             <w:tcBorders>
               <w:top w:val="single" w:color="000000" w:themeColor="text1" w:sz="4" w:space="0"/>
               <w:left w:val="single" w:color="000000" w:themeColor="text1" w:sz="4" w:space="0"/>

</xml_diff>

<commit_message>
chore(certs): tune result column width to +0.75cm (vs original)
Previous +1cm (1770 twips) was a bit wide. Reclaim 175 twips, split
proportionally back to requirement (+85) and method (+90). Final:
Parametr 4873 / Wymagania 2178 / Metoda 2126 / Wynik 1595 (~2.81 cm).

Co-Authored-By: Claude Opus 4.7 (1M context) <noreply@anthropic.com>
</commit_message>
<xml_diff>
--- a/mbr/templates/cert_master_template.docx
+++ b/mbr/templates/cert_master_template.docx
@@ -415,9 +415,9 @@
       </w:tblPr>
       <w:tblGrid>
         <w:gridCol w:w="4873"/>
-        <w:gridCol w:w="2093"/>
-        <w:gridCol w:w="2036"/>
-        <w:gridCol w:w="1770"/>
+        <w:gridCol w:w="2178"/>
+        <w:gridCol w:w="2126"/>
+        <w:gridCol w:w="1595"/>
       </w:tblGrid>
       <w:tr>
         <w:trPr>
@@ -528,7 +528,7 @@
         </w:tc>
         <w:tc>
           <w:tcPr>
-            <w:tcW w:w="2093" w:type="dxa"/>
+            <w:tcW w:w="2178" w:type="dxa"/>
             <w:tcBorders>
               <w:top w:val="single" w:color="000000" w:themeColor="text1" w:sz="4" w:space="0"/>
               <w:left w:val="single" w:color="000000" w:themeColor="text1" w:sz="4" w:space="0"/>
@@ -610,7 +610,7 @@
         </w:tc>
         <w:tc>
           <w:tcPr>
-            <w:tcW w:w="2036" w:type="dxa"/>
+            <w:tcW w:w="2126" w:type="dxa"/>
             <w:tcBorders>
               <w:top w:val="single" w:color="000000" w:themeColor="text1" w:sz="4" w:space="0"/>
               <w:left w:val="single" w:color="000000" w:themeColor="text1" w:sz="4" w:space="0"/>
@@ -723,7 +723,7 @@
         </w:tc>
         <w:tc>
           <w:tcPr>
-            <w:tcW w:w="1770" w:type="dxa"/>
+            <w:tcW w:w="1595" w:type="dxa"/>
             <w:tcBorders>
               <w:top w:val="single" w:color="000000" w:themeColor="text1" w:sz="4" w:space="0"/>
               <w:left w:val="single" w:color="000000" w:themeColor="text1" w:sz="4" w:space="0"/>
@@ -890,7 +890,7 @@
         </w:tc>
         <w:tc>
           <w:tcPr>
-            <w:tcW w:w="2093" w:type="dxa"/>
+            <w:tcW w:w="2178" w:type="dxa"/>
             <w:tcBorders>
               <w:top w:val="single" w:color="000000" w:themeColor="text1" w:sz="4" w:space="0"/>
               <w:left w:val="single" w:color="000000" w:themeColor="text1" w:sz="4" w:space="0"/>
@@ -933,7 +933,7 @@
         </w:tc>
         <w:tc>
           <w:tcPr>
-            <w:tcW w:w="2036" w:type="dxa"/>
+            <w:tcW w:w="2126" w:type="dxa"/>
             <w:tcBorders>
               <w:top w:val="single" w:color="000000" w:themeColor="text1" w:sz="4" w:space="0"/>
               <w:left w:val="single" w:color="000000" w:themeColor="text1" w:sz="4" w:space="0"/>
@@ -975,7 +975,7 @@
         </w:tc>
         <w:tc>
           <w:tcPr>
-            <w:tcW w:w="1770" w:type="dxa"/>
+            <w:tcW w:w="1595" w:type="dxa"/>
             <w:tcBorders>
               <w:top w:val="single" w:color="000000" w:themeColor="text1" w:sz="4" w:space="0"/>
               <w:left w:val="single" w:color="000000" w:themeColor="text1" w:sz="4" w:space="0"/>
@@ -1130,7 +1130,7 @@
         </w:tc>
         <w:tc>
           <w:tcPr>
-            <w:tcW w:w="2093" w:type="dxa"/>
+            <w:tcW w:w="2178" w:type="dxa"/>
             <w:tcBorders>
               <w:top w:val="single" w:color="000000" w:themeColor="text1" w:sz="4" w:space="0"/>
               <w:left w:val="single" w:color="000000" w:themeColor="text1" w:sz="4" w:space="0"/>
@@ -1184,7 +1184,7 @@
         </w:tc>
         <w:tc>
           <w:tcPr>
-            <w:tcW w:w="2036" w:type="dxa"/>
+            <w:tcW w:w="2126" w:type="dxa"/>
             <w:tcBorders>
               <w:top w:val="single" w:color="000000" w:themeColor="text1" w:sz="4" w:space="0"/>
               <w:left w:val="single" w:color="000000" w:themeColor="text1" w:sz="4" w:space="0"/>
@@ -1237,7 +1237,7 @@
         </w:tc>
         <w:tc>
           <w:tcPr>
-            <w:tcW w:w="1770" w:type="dxa"/>
+            <w:tcW w:w="1595" w:type="dxa"/>
             <w:tcBorders>
               <w:top w:val="single" w:color="000000" w:themeColor="text1" w:sz="4" w:space="0"/>
               <w:left w:val="single" w:color="000000" w:themeColor="text1" w:sz="4" w:space="0"/>
@@ -1375,7 +1375,7 @@
         </w:tc>
         <w:tc>
           <w:tcPr>
-            <w:tcW w:w="2093" w:type="dxa"/>
+            <w:tcW w:w="2178" w:type="dxa"/>
             <w:tcBorders>
               <w:top w:val="single" w:color="000000" w:themeColor="text1" w:sz="4" w:space="0"/>
               <w:left w:val="single" w:color="000000" w:themeColor="text1" w:sz="4" w:space="0"/>
@@ -1418,7 +1418,7 @@
         </w:tc>
         <w:tc>
           <w:tcPr>
-            <w:tcW w:w="2036" w:type="dxa"/>
+            <w:tcW w:w="2126" w:type="dxa"/>
             <w:tcBorders>
               <w:top w:val="single" w:color="000000" w:themeColor="text1" w:sz="4" w:space="0"/>
               <w:left w:val="single" w:color="000000" w:themeColor="text1" w:sz="4" w:space="0"/>
@@ -1460,7 +1460,7 @@
         </w:tc>
         <w:tc>
           <w:tcPr>
-            <w:tcW w:w="1770" w:type="dxa"/>
+            <w:tcW w:w="1595" w:type="dxa"/>
             <w:tcBorders>
               <w:top w:val="single" w:color="000000" w:themeColor="text1" w:sz="4" w:space="0"/>
               <w:left w:val="single" w:color="000000" w:themeColor="text1" w:sz="4" w:space="0"/>

</xml_diff>

<commit_message>
feat(cert): rebuild template with 3 sentinels (996/997) + sharp SVG-rendered logo
Co-Authored-By: Claude Sonnet 4.6 <noreply@anthropic.com>
</commit_message>
<xml_diff>
--- a/mbr/templates/cert_master_template.docx
+++ b/mbr/templates/cert_master_template.docx
@@ -2301,13 +2301,13 @@
             <w:spacing w:line="360" w:lineRule="auto"/>
             <w:jc w:val="center"/>
             <w:rPr>
-              <w:szCs w:val="999"/>
+              <w:szCs w:val="996"/>
               <w:lang w:val="en-GB"/>
             </w:rPr>
           </w:pPr>
           <w:r>
             <w:rPr>
-              <w:szCs w:val="999"/>
+              <w:szCs w:val="996"/>
               <w:lang w:val="en-GB"/>
             </w:rPr>
             <w:t>ŚWIADECTWO JAKOŚCI</w:t>
@@ -2320,20 +2320,20 @@
             <w:spacing w:line="360" w:lineRule="auto"/>
             <w:jc w:val="center"/>
             <w:rPr>
-              <w:szCs w:val="999"/>
+              <w:szCs w:val="996"/>
               <w:lang w:val="en-GB"/>
             </w:rPr>
           </w:pPr>
           <w:r>
             <w:rPr>
-              <w:szCs w:val="999"/>
+              <w:szCs w:val="996"/>
               <w:lang w:val="en-GB"/>
             </w:rPr>
             <w:t>/</w:t>
           </w:r>
           <w:r>
             <w:rPr>
-              <w:szCs w:val="999"/>
+              <w:szCs w:val="996"/>
               <w:lang w:val="en-GB"/>
             </w:rPr>
             <w:t>CERTIFICATE OF ANALYSIS</w:t>
@@ -2345,7 +2345,7 @@
             <w:rPr>
               <w:rFonts w:ascii="Bookman Old Style" w:hAnsi="Bookman Old Style"/>
               <w:b/>
-              <w:szCs w:val="999"/>
+              <w:szCs w:val="997"/>
               <w:lang w:val="en-GB"/>
             </w:rPr>
           </w:pPr>
@@ -2353,8 +2353,8 @@
             <w:rPr>
               <w:rFonts w:ascii="Bookman Old Style" w:hAnsi="Bookman Old Style"/>
               <w:b/>
-              <w:sz w:val="999"/>
-              <w:szCs w:val="999"/>
+              <w:sz w:val="997"/>
+              <w:szCs w:val="997"/>
               <w:lang w:val="en-GB"/>
             </w:rPr>
             <w:t>{{display_name}}</w:t>
@@ -2363,7 +2363,7 @@
             <w:rPr>
               <w:rFonts w:ascii="Bookman Old Style" w:hAnsi="Bookman Old Style"/>
               <w:b/>
-              <w:szCs w:val="999"/>
+              <w:szCs w:val="997"/>
               <w:lang w:val="en-GB"/>
             </w:rPr>
           </w:r>
@@ -2371,7 +2371,7 @@
             <w:rPr>
               <w:rFonts w:ascii="Bookman Old Style" w:hAnsi="Bookman Old Style"/>
               <w:b/>
-              <w:szCs w:val="999"/>
+              <w:szCs w:val="997"/>
               <w:lang w:val="en-GB"/>
             </w:rPr>
           </w:r>
@@ -2379,7 +2379,7 @@
             <w:rPr>
               <w:rFonts w:ascii="Bookman Old Style" w:hAnsi="Bookman Old Style"/>
               <w:b/>
-              <w:szCs w:val="999"/>
+              <w:szCs w:val="997"/>
               <w:lang w:val="en-GB"/>
             </w:rPr>
           </w:r>
@@ -2387,7 +2387,7 @@
             <w:rPr>
               <w:rFonts w:ascii="Bookman Old Style" w:hAnsi="Bookman Old Style"/>
               <w:b/>
-              <w:szCs w:val="999"/>
+              <w:szCs w:val="997"/>
               <w:lang w:val="en-GB"/>
             </w:rPr>
           </w:r>
@@ -2937,7 +2937,7 @@
     </w:pPr>
     <w:rPr>
       <w:b/>
-      <w:sz w:val="999"/>
+      <w:sz w:val="996"/>
     </w:rPr>
   </w:style>
   <w:style w:type="paragraph" w:styleId="Nagwek8">
@@ -2952,7 +2952,7 @@
       <w:outlineLvl w:val="7"/>
     </w:pPr>
     <w:rPr>
-      <w:sz w:val="999"/>
+      <w:sz w:val="997"/>
     </w:rPr>
   </w:style>
   <w:style w:type="character" w:styleId="Domylnaczcionkaakapitu" w:default="1">

</xml_diff>

<commit_message>
fix(cert): tighten cert header spacing — line-height + page margins
Header paragraphs used line-height 360 (1.5×) — collapsed to 240
(single). Page pgMar.top 964 (17 mm) → 567 (10 mm, matches left/right
for symmetry); pgMar.header 624 (11 mm from page edge) → 284 (5 mm).
Effect: ~12 mm of vertical space reclaimed before/inside the cert header
block, leaving more room for the parameter table without changing font
sizes.

Bottom margin kept at 964 (17 mm) — still reserves room for the
signature/footer block.

Co-Authored-By: Claude Opus 4.7 (1M context) <noreply@anthropic.com>
</commit_message>
<xml_diff>
--- a/mbr/templates/cert_master_template.docx
+++ b/mbr/templates/cert_master_template.docx
@@ -1949,7 +1949,7 @@
       <w:headerReference w:type="default" r:id="rId8"/>
       <w:footerReference w:type="default" r:id="rId9"/>
       <w:pgSz w:w="11906" w:h="16838" w:orient="portrait"/>
-      <w:pgMar w:top="964" w:right="567" w:bottom="964" w:left="567" w:header="624" w:footer="680" w:gutter="0"/>
+      <w:pgMar w:top="567" w:right="567" w:bottom="964" w:left="567" w:header="284" w:footer="680" w:gutter="0"/>
       <w:cols w:space="708"/>
       <w:docGrid w:linePitch="326"/>
     </w:sectPr>
@@ -2287,7 +2287,7 @@
         <w:p>
           <w:pPr>
             <w:pStyle w:val="Nagwek4"/>
-            <w:spacing w:line="360" w:lineRule="auto"/>
+            <w:spacing w:line="240" w:lineRule="auto"/>
             <w:jc w:val="center"/>
             <w:rPr>
               <w:lang w:val="en-GB"/>
@@ -2298,7 +2298,7 @@
           <w:pPr>
             <w:pStyle w:val="Nagwek4"/>
             <w:snapToGrid w:val="0"/>
-            <w:spacing w:line="360" w:lineRule="auto"/>
+            <w:spacing w:line="240" w:lineRule="auto"/>
             <w:jc w:val="center"/>
             <w:rPr>
               <w:szCs w:val="996"/>
@@ -2317,7 +2317,7 @@
           <w:pPr>
             <w:pStyle w:val="Nagwek4"/>
             <w:snapToGrid w:val="0"/>
-            <w:spacing w:line="360" w:lineRule="auto"/>
+            <w:spacing w:line="240" w:lineRule="auto"/>
             <w:jc w:val="center"/>
             <w:rPr>
               <w:szCs w:val="996"/>

</xml_diff>

<commit_message>
fix(cert-template): center-align columns 2-4 in params table (Wymagania, Metoda, Wynik)
Column 1 (Parametr) stays left-aligned; columns 2-4 wyrównane do środka
per user request po cert editor redesign deploy. Patch zmienił 9
<w:jc> elementów z 'left' na 'center' (header row + data row template,
cells 1-3). Backup: cert_master_template.docx.bak-pre-align.
</commit_message>
<xml_diff>
--- a/mbr/templates/cert_master_template.docx
+++ b/mbr/templates/cert_master_template.docx
@@ -547,7 +547,7 @@
               <w:pStyle w:val="Standard"/>
               <w:snapToGrid w:val="0"/>
               <w:ind w:right="72"/>
-              <w:jc w:val="left"/>
+              <w:jc w:val="center"/>
               <w:rPr>
                 <w:rFonts w:ascii="TeX Gyre Bonum" w:hAnsi="TeX Gyre Bonum"/>
                 <w:b w:val="1"/>
@@ -574,7 +574,7 @@
               <w:pStyle w:val="Standard"/>
               <w:snapToGrid w:val="0"/>
               <w:ind w:right="72"/>
-              <w:jc w:val="left"/>
+              <w:jc w:val="center"/>
               <w:rPr>
                 <w:rFonts w:ascii="TeX Gyre Bonum" w:hAnsi="TeX Gyre Bonum"/>
                 <w:b w:val="1"/>
@@ -628,7 +628,7 @@
             <w:pPr>
               <w:pStyle w:val="Standard"/>
               <w:snapToGrid w:val="0"/>
-              <w:jc w:val="left"/>
+              <w:jc w:val="center"/>
               <w:rPr>
                 <w:rFonts w:ascii="TeX Gyre Bonum" w:hAnsi="TeX Gyre Bonum"/>
                 <w:b w:val="1"/>
@@ -687,7 +687,7 @@
             <w:pPr>
               <w:pStyle w:val="Standard"/>
               <w:snapToGrid w:val="0"/>
-              <w:jc w:val="left"/>
+              <w:jc w:val="center"/>
               <w:rPr>
                 <w:rFonts w:ascii="TeX Gyre Bonum" w:hAnsi="TeX Gyre Bonum"/>
                 <w:b w:val="1"/>
@@ -742,7 +742,7 @@
             <w:pPr>
               <w:pStyle w:val="Standard"/>
               <w:snapToGrid w:val="0"/>
-              <w:jc w:val="left"/>
+              <w:jc w:val="center"/>
               <w:rPr>
                 <w:rFonts w:ascii="TeX Gyre Bonum" w:hAnsi="TeX Gyre Bonum"/>
                 <w:b w:val="1"/>
@@ -768,7 +768,7 @@
             <w:pPr>
               <w:pStyle w:val="Standard"/>
               <w:snapToGrid w:val="0"/>
-              <w:jc w:val="left"/>
+              <w:jc w:val="center"/>
               <w:rPr>
                 <w:rFonts w:ascii="TeX Gyre Bonum" w:hAnsi="TeX Gyre Bonum"/>
                 <w:b w:val="1"/>
@@ -1148,7 +1148,7 @@
             <w:pPr>
               <w:pStyle w:val="Standard"/>
               <w:snapToGrid w:val="0"/>
-              <w:jc w:val="left"/>
+              <w:jc w:val="center"/>
               <w:rPr>
                 <w:rFonts w:ascii="TeX Gyre Bonum" w:hAnsi="TeX Gyre Bonum"/>
                 <w:sz w:val="22"/>
@@ -1202,7 +1202,7 @@
             <w:pPr>
               <w:pStyle w:val="Standard"/>
               <w:snapToGrid w:val="0"/>
-              <w:jc w:val="left"/>
+              <w:jc w:val="center"/>
               <w:rPr>
                 <w:rFonts w:ascii="TeX Gyre Bonum" w:hAnsi="TeX Gyre Bonum"/>
                 <w:sz w:val="22"/>
@@ -1256,7 +1256,7 @@
             <w:pPr>
               <w:pStyle w:val="Standard"/>
               <w:snapToGrid w:val="0"/>
-              <w:jc w:val="left"/>
+              <w:jc w:val="center"/>
               <w:rPr>
                 <w:rFonts w:ascii="TeX Gyre Bonum" w:hAnsi="TeX Gyre Bonum"/>
                 <w:sz w:val="22"/>

</xml_diff>

<commit_message>
fix(cert): AVON labels — English-only, bolded
Cert template showed "Kod AVON/AVON code: ..." and "Nazwa AVON/AVON name: ...".
For Avon shipments only the English label is wanted, and the whole line bold
(label + value).

Co-Authored-By: Claude Opus 4.7 (1M context) <noreply@anthropic.com>
</commit_message>
<xml_diff>
--- a/mbr/templates/cert_master_template.docx
+++ b/mbr/templates/cert_master_template.docx
@@ -16,8 +16,10 @@
         <w:rPr>
           <w:rFonts w:ascii="TeX Gyre Bonum" w:hAnsi="TeX Gyre Bonum"/>
           <w:sz w:val="22"/>
-        </w:rPr>
-        <w:t xml:space="preserve">Kod AVON/AVON code: {{avon_code}}</w:t>
+          <w:b/>
+          <w:bCs/>
+        </w:rPr>
+        <w:t xml:space="preserve">AVON code: {{avon_code}}</w:t>
       </w:r>
     </w:p>
     <w:p xmlns:wp14="http://schemas.microsoft.com/office/word/2010/wordml" wp14:textId="77777777">
@@ -25,8 +27,10 @@
         <w:rPr>
           <w:rFonts w:ascii="TeX Gyre Bonum" w:hAnsi="TeX Gyre Bonum"/>
           <w:sz w:val="22"/>
-        </w:rPr>
-        <w:t xml:space="preserve">Nazwa AVON/AVON name: {{avon_name}}</w:t>
+          <w:b/>
+          <w:bCs/>
+        </w:rPr>
+        <w:t xml:space="preserve">AVON name: {{avon_name}}</w:t>
       </w:r>
     </w:p>
     <w:p xmlns:wp14="http://schemas.microsoft.com/office/word/2010/wordml" wp14:textId="77777777">

</xml_diff>

<commit_message>
fix(cert): align result+requirement cells to bottom
For multi-line params (e.g. rozkład kwasów with 9 stacked values), the
result and requirement column contents now bottom-align so each line lines
up with its corresponding chain label in the name column. Single-line rows
are visually unchanged (single line at bottom of single-line row = same
position as centered).

Co-Authored-By: Claude Opus 4.7 (1M context) <noreply@anthropic.com>
</commit_message>
<xml_diff>
--- a/mbr/templates/cert_master_template.docx
+++ b/mbr/templates/cert_master_template.docx
@@ -1146,7 +1146,7 @@
               <w:bottom w:w="30" w:type="dxa"/>
               <w:right w:w="70" w:type="dxa"/>
             </w:tcMar>
-            <w:vAlign w:val="center"/>
+            <w:vAlign w:val="bottom"/>
           </w:tcPr>
           <w:p>
             <w:pPr>
@@ -1254,7 +1254,7 @@
               <w:bottom w:w="30" w:type="dxa"/>
               <w:right w:w="70" w:type="dxa"/>
             </w:tcMar>
-            <w:vAlign w:val="center"/>
+            <w:vAlign w:val="bottom"/>
           </w:tcPr>
           <w:p>
             <w:pPr>

</xml_diff>

<commit_message>
fix(cert): bottom-align only multi-line cells (rozkład etc.)
Previous fix bottom-aligned ALL result+requirement cells uniformly. Visible
in single-line rows where centered text was correct. Better: detect cells
that contain <w:br/> (= line break, RichText with '|' separators) and align
only those to the bottom. Single-line cells stay centered (template default).

- Revert template: result + requirement vAlign back to "center" baseline.
- Add _align_multiline_cells_to_bottom() post-render hook in generator.

Co-Authored-By: Claude Opus 4.7 (1M context) <noreply@anthropic.com>
</commit_message>
<xml_diff>
--- a/mbr/templates/cert_master_template.docx
+++ b/mbr/templates/cert_master_template.docx
@@ -1146,7 +1146,7 @@
               <w:bottom w:w="30" w:type="dxa"/>
               <w:right w:w="70" w:type="dxa"/>
             </w:tcMar>
-            <w:vAlign w:val="bottom"/>
+            <w:vAlign w:val="center"/>
           </w:tcPr>
           <w:p>
             <w:pPr>
@@ -1254,7 +1254,7 @@
               <w:bottom w:w="30" w:type="dxa"/>
               <w:right w:w="70" w:type="dxa"/>
             </w:tcMar>
-            <w:vAlign w:val="bottom"/>
+            <w:vAlign w:val="center"/>
           </w:tcPr>
           <w:p>
             <w:pPr>

</xml_diff>